<commit_message>
fix: resolve upload 500 on Vercel, fix market study table clipping, prevent footer nav wrapping, fix warranty certificate spaces, and remove financial offer buttons
</commit_message>
<xml_diff>
--- a/frontend/public/templates/warranty_certificate_template.docx
+++ b/frontend/public/templates/warranty_certificate_template.docx
@@ -2,2214 +2,6 @@
 <file path=word/document.xml><?xml version="1.0" encoding="utf-8"?>
 <w:document xmlns:wpc="http://schemas.microsoft.com/office/word/2010/wordprocessingCanvas" xmlns:cx="http://schemas.microsoft.com/office/drawing/2014/chartex" xmlns:cx1="http://schemas.microsoft.com/office/drawing/2015/9/8/chartex" xmlns:cx2="http://schemas.microsoft.com/office/drawing/2015/10/21/chartex" xmlns:cx3="http://schemas.microsoft.com/office/drawing/2016/5/9/chartex" xmlns:cx4="http://schemas.microsoft.com/office/drawing/2016/5/10/chartex" xmlns:cx5="http://schemas.microsoft.com/office/drawing/2016/5/11/chartex" xmlns:cx6="http://schemas.microsoft.com/office/drawing/2016/5/12/chartex" xmlns:cx7="http://schemas.microsoft.com/office/drawing/2016/5/13/chartex" xmlns:cx8="http://schemas.microsoft.com/office/drawing/2016/5/14/chartex" xmlns:mc="http://schemas.openxmlformats.org/markup-compatibility/2006" xmlns:aink="http://schemas.microsoft.com/office/drawing/2016/ink" xmlns:am3d="http://schemas.microsoft.com/office/drawing/2017/model3d" xmlns:o="urn:schemas-microsoft-com:office:office" xmlns:oel="http://schemas.microsoft.com/office/2019/extlst" xmlns:r="http://schemas.openxmlformats.org/officeDocument/2006/relationships" xmlns:m="http://schemas.openxmlformats.org/officeDocument/2006/math" xmlns:v="urn:schemas-microsoft-com:vml" xmlns:wp14="http://schemas.microsoft.com/office/word/2010/wordprocessingDrawing" xmlns:wp="http://schemas.openxmlformats.org/drawingml/2006/wordprocessingDrawing" xmlns:w10="urn:schemas-microsoft-com:office:word" xmlns:w="http://schemas.openxmlformats.org/wordprocessingml/2006/main" xmlns:w14="http://schemas.microsoft.com/office/word/2010/wordml" xmlns:w15="http://schemas.microsoft.com/office/word/2012/wordml" xmlns:w16cex="http://schemas.microsoft.com/office/word/2018/wordml/cex" xmlns:w16cid="http://schemas.microsoft.com/office/word/2016/wordml/cid" xmlns:w16="http://schemas.microsoft.com/office/word/2018/wordml" xmlns:w16du="http://schemas.microsoft.com/office/word/2023/wordml/word16du" xmlns:w16sdtdh="http://schemas.microsoft.com/office/word/2020/wordml/sdtdatahash" xmlns:w16sdtfl="http://schemas.microsoft.com/office/word/2024/wordml/sdtformatlock" xmlns:w16se="http://schemas.microsoft.com/office/word/2015/wordml/symex" xmlns:wpg="http://schemas.microsoft.com/office/word/2010/wordprocessingGroup" xmlns:wpi="http://schemas.microsoft.com/office/word/2010/wordprocessingInk" xmlns:wne="http://schemas.microsoft.com/office/word/2006/wordml" xmlns:wps="http://schemas.microsoft.com/office/word/2010/wordprocessingShape" mc:Ignorable="w14 w15 w16se w16cid w16 w16cex w16sdtdh w16sdtfl w16du wp14">
   <w:body>
-    <w:p>
-      <w:pPr>
-        <w:spacing w:after="0"/>
-        <w:ind w:right="227"/>
-        <w:rPr>
-          <w:rFonts w:asciiTheme="minorHAnsi" w:hAnsiTheme="minorHAnsi"/>
-          <w:b/>
-          <w:bCs/>
-          <w:u w:val="single"/>
-          <w:lang w:bidi="ar-EG"/>
-        </w:rPr>
-      </w:pPr>
-      <w:r>
-        <w:rPr>
-          <w:rFonts w:asciiTheme="minorHAnsi" w:hAnsiTheme="minorHAnsi" w:cstheme="minorHAnsi" w:hint="cs"/>
-          <w:b/>
-          <w:bCs/>
-          <w:rtl/>
-          <w:lang w:bidi="ar-EG"/>
-        </w:rPr>
-        <w:t xml:space="preserve">                                                                  </w:t>
-      </w:r>
-      <w:r>
-        <w:rPr>
-          <w:rFonts w:cs="PT Bold Heading" w:hint="cs"/>
-          <w:b/>
-          <w:bCs/>
-          <w:sz w:val="44"/>
-          <w:szCs w:val="46"/>
-          <w:u w:val="single"/>
-          <w:rtl/>
-          <w:lang w:bidi="ar-EG"/>
-        </w:rPr>
-        <w:t>شهادة ضمان</w:t>
-      </w:r>
-      <w:r>
-        <w:rPr>
-          <w:rFonts w:asciiTheme="minorHAnsi" w:hAnsiTheme="minorHAnsi" w:cstheme="minorHAnsi" w:hint="cs"/>
-          <w:b/>
-          <w:bCs/>
-          <w:sz w:val="20"/>
-          <w:szCs w:val="20"/>
-          <w:rtl/>
-          <w:lang w:bidi="ar-EG"/>
-        </w:rPr>
-        <w:t xml:space="preserve">              </w:t>
-      </w:r>
-      <w:r>
-        <w:rPr>
-          <w:rFonts w:asciiTheme="majorHAnsi" w:hAnsiTheme="majorHAnsi" w:cstheme="minorHAnsi" w:hint="cs"/>
-          <w:b/>
-          <w:bCs/>
-          <w:sz w:val="28"/>
-          <w:szCs w:val="28"/>
-          <w:rtl/>
-          <w:lang w:bidi="ar-EG"/>
-        </w:rPr>
-        <w:t xml:space="preserve">          </w:t>
-      </w:r>
-      <w:r>
-        <w:rPr>
-          <w:rFonts w:asciiTheme="majorHAnsi" w:hAnsiTheme="majorHAnsi" w:cstheme="minorHAnsi" w:hint="cs"/>
-          <w:b/>
-          <w:bCs/>
-          <w:sz w:val="28"/>
-          <w:szCs w:val="28"/>
-          <w:rtl/>
-          <w:lang w:bidi="ar-EG"/>
-        </w:rPr>
-        <w:t xml:space="preserve">          </w:t>
-      </w:r>
-      <w:r>
-        <w:rPr>
-          <w:rFonts w:asciiTheme="majorHAnsi" w:hAnsiTheme="majorHAnsi" w:cstheme="minorHAnsi" w:hint="cs"/>
-          <w:b/>
-          <w:bCs/>
-          <w:sz w:val="28"/>
-          <w:szCs w:val="28"/>
-          <w:rtl/>
-          <w:lang w:bidi="ar-EG"/>
-        </w:rPr>
-        <w:t xml:space="preserve"> </w:t>
-      </w:r>
-      <w:r>
-        <w:rPr>
-          <w:rFonts w:asciiTheme="majorHAnsi" w:hAnsiTheme="majorHAnsi" w:cstheme="minorHAnsi" w:hint="cs"/>
-          <w:b/>
-          <w:bCs/>
-          <w:sz w:val="28"/>
-          <w:szCs w:val="28"/>
-          <w:rtl/>
-          <w:lang w:bidi="ar-EG"/>
-        </w:rPr>
-        <w:t>الباركود</w:t>
-      </w:r>
-    </w:p>
-    <w:p>
-      <w:pPr>
-        <w:tabs>
-          <w:tab w:val="left" w:pos="5387"/>
-        </w:tabs>
-        <w:spacing w:after="0"/>
-        <w:ind w:left="-794"/>
-        <w:rPr>
-          <w:rFonts w:ascii="Arabic Typesetting" w:hAnsi="Arabic Typesetting" w:cs="Arabic Typesetting"/>
-          <w:b/>
-          <w:bCs/>
-          <w:sz w:val="52"/>
-          <w:szCs w:val="52"/>
-          <w:rtl/>
-          <w:lang w:bidi="ar-EG"/>
-        </w:rPr>
-      </w:pPr>
-      <w:r>
-        <w:rPr>
-          <w:rFonts w:ascii="Arabic Typesetting" w:hAnsi="Arabic Typesetting" w:cs="Arabic Typesetting"/>
-          <w:b/>
-          <w:bCs/>
-          <w:sz w:val="56"/>
-          <w:szCs w:val="56"/>
-          <w:rtl/>
-          <w:lang w:bidi="ar-EG"/>
-        </w:rPr>
-        <w:t xml:space="preserve">      السيد </w:t>
-      </w:r>
-      <w:r>
-        <w:rPr>
-          <w:rFonts w:ascii="Arabic Typesetting" w:hAnsi="Arabic Typesetting" w:cs="Arabic Typesetting"/>
-          <w:b/>
-          <w:bCs/>
-          <w:sz w:val="56"/>
-          <w:szCs w:val="56"/>
-          <w:highlight w:val="red"/>
-          <w:rtl/>
-          <w:lang w:bidi="ar-EG"/>
-        </w:rPr>
-        <w:t>الأستاذ</w:t>
-      </w:r>
-      <w:r>
-        <w:rPr>
-          <w:rFonts w:ascii="Arabic Typesetting" w:hAnsi="Arabic Typesetting" w:cs="Arabic Typesetting"/>
-          <w:b/>
-          <w:bCs/>
-          <w:sz w:val="56"/>
-          <w:szCs w:val="56"/>
-          <w:rtl/>
-          <w:lang w:bidi="ar-EG"/>
-        </w:rPr>
-        <w:t xml:space="preserve"> / </w:t>
-      </w:r>
-      <w:r>
-        <w:rPr>
-          <w:rFonts w:ascii="Arabic Typesetting" w:hAnsi="Arabic Typesetting" w:cs="Arabic Typesetting"/>
-          <w:b/>
-          <w:bCs/>
-          <w:sz w:val="56"/>
-          <w:szCs w:val="56"/>
-          <w:highlight w:val="red"/>
-          <w:rtl/>
-          <w:lang w:bidi="ar-EG"/>
-        </w:rPr>
-        <w:t>مدير الادارة العامة للمشتريات والمخازن بجامعة دمنهور</w:t>
-      </w:r>
-    </w:p>
-    <w:p>
-      <w:pPr>
-        <w:tabs>
-          <w:tab w:val="left" w:pos="5387"/>
-        </w:tabs>
-        <w:spacing w:after="0"/>
-        <w:ind w:left="-567"/>
-        <w:jc w:val="highKashida"/>
-        <w:rPr>
-          <w:b/>
-          <w:bCs/>
-          <w:sz w:val="36"/>
-          <w:szCs w:val="36"/>
-          <w:rtl/>
-          <w:lang w:bidi="ar-EG"/>
-        </w:rPr>
-      </w:pPr>
-      <w:r>
-        <w:rPr>
-          <w:b/>
-          <w:bCs/>
-          <w:sz w:val="36"/>
-          <w:szCs w:val="36"/>
-          <w:u w:val="single"/>
-          <w:rtl/>
-          <w:lang w:bidi="ar-EG"/>
-        </w:rPr>
-        <w:t>الموضوع بخصوص</w:t>
-      </w:r>
-      <w:r>
-        <w:rPr>
-          <w:b/>
-          <w:bCs/>
-          <w:sz w:val="36"/>
-          <w:szCs w:val="36"/>
-          <w:rtl/>
-          <w:lang w:bidi="ar-EG"/>
-        </w:rPr>
-        <w:t xml:space="preserve"> </w:t>
-      </w:r>
-      <w:r>
-        <w:rPr>
-          <w:b/>
-          <w:bCs/>
-          <w:sz w:val="32"/>
-          <w:szCs w:val="32"/>
-          <w:rtl/>
-          <w:lang w:bidi="ar-EG"/>
-        </w:rPr>
-        <w:t xml:space="preserve">: </w:t>
-      </w:r>
-      <w:r>
-        <w:rPr>
-          <w:b/>
-          <w:bCs/>
-          <w:sz w:val="32"/>
-          <w:szCs w:val="32"/>
-          <w:rtl/>
-          <w:lang w:bidi="ar-EG"/>
-        </w:rPr>
-        <w:t xml:space="preserve">شهادة ضمان </w:t>
-      </w:r>
-      <w:r>
-        <w:rPr>
-          <w:b/>
-          <w:bCs/>
-          <w:sz w:val="32"/>
-          <w:szCs w:val="32"/>
-          <w:highlight w:val="red"/>
-          <w:rtl/>
-          <w:lang w:bidi="ar-EG"/>
-        </w:rPr>
-        <w:t>للأصناف</w:t>
-      </w:r>
-      <w:r>
-        <w:rPr>
-          <w:b/>
-          <w:bCs/>
-          <w:sz w:val="32"/>
-          <w:szCs w:val="32"/>
-          <w:rtl/>
-          <w:lang w:bidi="ar-EG"/>
-        </w:rPr>
-        <w:t xml:space="preserve"> لعملية </w:t>
-      </w:r>
-      <w:r>
-        <w:rPr>
-          <w:b/>
-          <w:bCs/>
-          <w:sz w:val="32"/>
-          <w:szCs w:val="32"/>
-          <w:highlight w:val="red"/>
-          <w:rtl/>
-          <w:lang w:bidi="ar-EG"/>
-        </w:rPr>
-        <w:t xml:space="preserve">اسم العملية المسجله </w:t>
-      </w:r>
-      <w:r>
-        <w:rPr>
-          <w:b/>
-          <w:bCs/>
-          <w:sz w:val="32"/>
-          <w:szCs w:val="32"/>
-          <w:rtl/>
-          <w:lang w:bidi="ar-EG"/>
-        </w:rPr>
-        <w:t xml:space="preserve">رقم  </w:t>
-      </w:r>
-      <w:r>
-        <w:rPr>
-          <w:b/>
-          <w:bCs/>
-          <w:sz w:val="32"/>
-          <w:szCs w:val="32"/>
-          <w:highlight w:val="red"/>
-          <w:rtl/>
-          <w:lang w:bidi="ar-EG"/>
-        </w:rPr>
-        <w:t>365</w:t>
-      </w:r>
-      <w:r>
-        <w:rPr>
-          <w:b/>
-          <w:bCs/>
-          <w:sz w:val="32"/>
-          <w:szCs w:val="32"/>
-          <w:rtl/>
-          <w:lang w:bidi="ar-EG"/>
-        </w:rPr>
-        <w:t xml:space="preserve"> </w:t>
-      </w:r>
-    </w:p>
-    <w:p>
-      <w:pPr>
-        <w:spacing w:after="0" w:line="240" w:lineRule="auto"/>
-        <w:rPr>
-          <w:rFonts w:ascii="Arial" w:hAnsi="Arial"/>
-          <w:b/>
-          <w:bCs/>
-          <w:sz w:val="20"/>
-          <w:szCs w:val="20"/>
-          <w:rtl/>
-          <w:lang w:bidi="ar-EG"/>
-        </w:rPr>
-      </w:pPr>
-      <w:r>
-        <w:rPr>
-          <w:rFonts w:ascii="Arial" w:hAnsi="Arial"/>
-          <w:b/>
-          <w:bCs/>
-          <w:sz w:val="36"/>
-          <w:szCs w:val="36"/>
-          <w:rtl/>
-          <w:lang w:bidi="ar-EG"/>
-        </w:rPr>
-        <w:t xml:space="preserve">                                    </w:t>
-      </w:r>
-      <w:r>
-        <w:rPr>
-          <w:rFonts w:ascii="Arial" w:hAnsi="Arial"/>
-          <w:b/>
-          <w:bCs/>
-          <w:sz w:val="28"/>
-          <w:szCs w:val="28"/>
-          <w:rtl/>
-          <w:lang w:bidi="ar-EG"/>
-        </w:rPr>
-        <w:t>تحيه طيبه وبعد</w:t>
-      </w:r>
-    </w:p>
-    <w:tbl>
-      <w:tblPr>
-        <w:tblpPr w:leftFromText="180" w:rightFromText="180" w:bottomFromText="200" w:vertAnchor="page" w:horzAnchor="margin" w:tblpY="6556"/>
-        <w:bidiVisual/>
-        <w:tblW w:w="10147" w:type="dxa"/>
-        <w:tblBorders>
-          <w:top w:val="single" w:sz="4" w:space="0" w:color="auto"/>
-          <w:left w:val="single" w:sz="4" w:space="0" w:color="auto"/>
-          <w:bottom w:val="single" w:sz="4" w:space="0" w:color="auto"/>
-          <w:right w:val="single" w:sz="4" w:space="0" w:color="auto"/>
-          <w:insideH w:val="single" w:sz="4" w:space="0" w:color="auto"/>
-          <w:insideV w:val="single" w:sz="4" w:space="0" w:color="auto"/>
-        </w:tblBorders>
-        <w:tblLook w:val="04A0" w:firstRow="1" w:lastRow="0" w:firstColumn="1" w:lastColumn="0" w:noHBand="0" w:noVBand="1"/>
-      </w:tblPr>
-      <w:tblGrid>
-        <w:gridCol w:w="560"/>
-        <w:gridCol w:w="3589"/>
-        <w:gridCol w:w="976"/>
-        <w:gridCol w:w="989"/>
-        <w:gridCol w:w="2793"/>
-        <w:gridCol w:w="1240"/>
-      </w:tblGrid>
-      <w:tr>
-        <w:trPr>
-          <w:trHeight w:val="300"/>
-        </w:trPr>
-        <w:tc>
-          <w:tcPr>
-            <w:tcW w:w="561" w:type="dxa"/>
-            <w:tcBorders>
-              <w:top w:val="thinThickSmallGap" w:sz="18" w:space="0" w:color="auto"/>
-              <w:left w:val="thinThickSmallGap" w:sz="18" w:space="0" w:color="auto"/>
-              <w:bottom w:val="thinThickSmallGap" w:sz="18" w:space="0" w:color="auto"/>
-              <w:right w:val="thinThickSmallGap" w:sz="18" w:space="0" w:color="auto"/>
-            </w:tcBorders>
-            <w:hideMark/>
-          </w:tcPr>
-          <w:p>
-            <w:pPr>
-              <w:spacing w:after="0" w:line="240" w:lineRule="auto"/>
-              <w:jc w:val="center"/>
-              <w:rPr>
-                <w:rFonts w:ascii="Arabic Typesetting" w:hAnsi="Arabic Typesetting" w:cs="Arabic Typesetting"/>
-                <w:b/>
-                <w:bCs/>
-                <w:sz w:val="40"/>
-                <w:szCs w:val="40"/>
-                <w:lang w:bidi="ar-EG"/>
-              </w:rPr>
-            </w:pPr>
-            <w:r>
-              <w:rPr>
-                <w:rFonts w:ascii="Arabic Typesetting" w:hAnsi="Arabic Typesetting" w:cs="Arabic Typesetting"/>
-                <w:b/>
-                <w:bCs/>
-                <w:sz w:val="44"/>
-                <w:szCs w:val="44"/>
-                <w:rtl/>
-                <w:lang w:bidi="ar-EG"/>
-              </w:rPr>
-              <w:t>م</w:t>
-            </w:r>
-          </w:p>
-        </w:tc>
-        <w:tc>
-          <w:tcPr>
-            <w:tcW w:w="3593" w:type="dxa"/>
-            <w:tcBorders>
-              <w:top w:val="thinThickSmallGap" w:sz="18" w:space="0" w:color="auto"/>
-              <w:left w:val="thinThickSmallGap" w:sz="18" w:space="0" w:color="auto"/>
-              <w:bottom w:val="thinThickSmallGap" w:sz="18" w:space="0" w:color="auto"/>
-              <w:right w:val="thinThickSmallGap" w:sz="18" w:space="0" w:color="auto"/>
-            </w:tcBorders>
-            <w:hideMark/>
-          </w:tcPr>
-          <w:p>
-            <w:pPr>
-              <w:spacing w:after="0" w:line="240" w:lineRule="auto"/>
-              <w:jc w:val="center"/>
-              <w:rPr>
-                <w:rFonts w:ascii="Arabic Typesetting" w:hAnsi="Arabic Typesetting" w:cs="Arabic Typesetting"/>
-                <w:b/>
-                <w:bCs/>
-                <w:sz w:val="40"/>
-                <w:szCs w:val="40"/>
-                <w:rtl/>
-                <w:lang w:bidi="ar-EG"/>
-              </w:rPr>
-            </w:pPr>
-            <w:r>
-              <w:rPr>
-                <w:rFonts w:ascii="Arabic Typesetting" w:hAnsi="Arabic Typesetting" w:cs="Arabic Typesetting" w:hint="cs"/>
-                <w:b/>
-                <w:bCs/>
-                <w:sz w:val="40"/>
-                <w:szCs w:val="40"/>
-                <w:rtl/>
-                <w:lang w:bidi="ar-EG"/>
-              </w:rPr>
-              <w:t>إ</w:t>
-            </w:r>
-            <w:r>
-              <w:rPr>
-                <w:rFonts w:ascii="Arabic Typesetting" w:hAnsi="Arabic Typesetting" w:cs="Arabic Typesetting"/>
-                <w:b/>
-                <w:bCs/>
-                <w:sz w:val="40"/>
-                <w:szCs w:val="40"/>
-                <w:rtl/>
-                <w:lang w:bidi="ar-EG"/>
-              </w:rPr>
-              <w:t>س</w:t>
-            </w:r>
-            <w:r>
-              <w:rPr>
-                <w:rFonts w:ascii="Arabic Typesetting" w:hAnsi="Arabic Typesetting" w:cs="Arabic Typesetting" w:hint="cs"/>
-                <w:b/>
-                <w:bCs/>
-                <w:sz w:val="40"/>
-                <w:szCs w:val="40"/>
-                <w:rtl/>
-                <w:lang w:bidi="ar-EG"/>
-              </w:rPr>
-              <w:t>ــــــــــــــــ</w:t>
-            </w:r>
-            <w:r>
-              <w:rPr>
-                <w:rFonts w:ascii="Arabic Typesetting" w:hAnsi="Arabic Typesetting" w:cs="Arabic Typesetting"/>
-                <w:b/>
-                <w:bCs/>
-                <w:sz w:val="40"/>
-                <w:szCs w:val="40"/>
-                <w:rtl/>
-                <w:lang w:bidi="ar-EG"/>
-              </w:rPr>
-              <w:t>م الص</w:t>
-            </w:r>
-            <w:r>
-              <w:rPr>
-                <w:rFonts w:ascii="Arabic Typesetting" w:hAnsi="Arabic Typesetting" w:cs="Arabic Typesetting" w:hint="cs"/>
-                <w:b/>
-                <w:bCs/>
-                <w:sz w:val="40"/>
-                <w:szCs w:val="40"/>
-                <w:rtl/>
-                <w:lang w:bidi="ar-EG"/>
-              </w:rPr>
-              <w:t>ـــــــــــــــــــ</w:t>
-            </w:r>
-            <w:r>
-              <w:rPr>
-                <w:rFonts w:ascii="Arabic Typesetting" w:hAnsi="Arabic Typesetting" w:cs="Arabic Typesetting"/>
-                <w:b/>
-                <w:bCs/>
-                <w:sz w:val="40"/>
-                <w:szCs w:val="40"/>
-                <w:rtl/>
-                <w:lang w:bidi="ar-EG"/>
-              </w:rPr>
-              <w:t>نف</w:t>
-            </w:r>
-          </w:p>
-        </w:tc>
-        <w:tc>
-          <w:tcPr>
-            <w:tcW w:w="977" w:type="dxa"/>
-            <w:tcBorders>
-              <w:top w:val="thinThickSmallGap" w:sz="18" w:space="0" w:color="auto"/>
-              <w:left w:val="thinThickSmallGap" w:sz="18" w:space="0" w:color="auto"/>
-              <w:bottom w:val="thinThickSmallGap" w:sz="18" w:space="0" w:color="auto"/>
-              <w:right w:val="thinThickSmallGap" w:sz="18" w:space="0" w:color="auto"/>
-            </w:tcBorders>
-            <w:hideMark/>
-          </w:tcPr>
-          <w:p>
-            <w:pPr>
-              <w:spacing w:after="0" w:line="240" w:lineRule="auto"/>
-              <w:jc w:val="center"/>
-              <w:rPr>
-                <w:rFonts w:ascii="Arabic Typesetting" w:hAnsi="Arabic Typesetting" w:cs="Arabic Typesetting"/>
-                <w:b/>
-                <w:bCs/>
-                <w:sz w:val="40"/>
-                <w:szCs w:val="40"/>
-                <w:rtl/>
-                <w:lang w:bidi="ar-EG"/>
-              </w:rPr>
-            </w:pPr>
-            <w:r>
-              <w:rPr>
-                <w:rFonts w:ascii="Arabic Typesetting" w:hAnsi="Arabic Typesetting" w:cs="Arabic Typesetting"/>
-                <w:b/>
-                <w:bCs/>
-                <w:sz w:val="40"/>
-                <w:szCs w:val="40"/>
-                <w:rtl/>
-                <w:lang w:bidi="ar-EG"/>
-              </w:rPr>
-              <w:t>الوح</w:t>
-            </w:r>
-            <w:r>
-              <w:rPr>
-                <w:rFonts w:ascii="Arabic Typesetting" w:hAnsi="Arabic Typesetting" w:cs="Arabic Typesetting" w:hint="cs"/>
-                <w:b/>
-                <w:bCs/>
-                <w:sz w:val="40"/>
-                <w:szCs w:val="40"/>
-                <w:rtl/>
-                <w:lang w:bidi="ar-EG"/>
-              </w:rPr>
-              <w:t>ــ</w:t>
-            </w:r>
-            <w:r>
-              <w:rPr>
-                <w:rFonts w:ascii="Arabic Typesetting" w:hAnsi="Arabic Typesetting" w:cs="Arabic Typesetting"/>
-                <w:b/>
-                <w:bCs/>
-                <w:sz w:val="40"/>
-                <w:szCs w:val="40"/>
-                <w:rtl/>
-                <w:lang w:bidi="ar-EG"/>
-              </w:rPr>
-              <w:t>دة</w:t>
-            </w:r>
-          </w:p>
-        </w:tc>
-        <w:tc>
-          <w:tcPr>
-            <w:tcW w:w="977" w:type="dxa"/>
-            <w:tcBorders>
-              <w:top w:val="thinThickSmallGap" w:sz="18" w:space="0" w:color="auto"/>
-              <w:left w:val="thinThickSmallGap" w:sz="18" w:space="0" w:color="auto"/>
-              <w:bottom w:val="thinThickSmallGap" w:sz="18" w:space="0" w:color="auto"/>
-              <w:right w:val="thinThickSmallGap" w:sz="18" w:space="0" w:color="auto"/>
-            </w:tcBorders>
-            <w:hideMark/>
-          </w:tcPr>
-          <w:p>
-            <w:pPr>
-              <w:spacing w:after="0" w:line="240" w:lineRule="auto"/>
-              <w:jc w:val="center"/>
-              <w:rPr>
-                <w:rFonts w:ascii="Arabic Typesetting" w:hAnsi="Arabic Typesetting" w:cs="Arabic Typesetting"/>
-                <w:b/>
-                <w:bCs/>
-                <w:sz w:val="40"/>
-                <w:szCs w:val="40"/>
-                <w:rtl/>
-                <w:lang w:bidi="ar-EG"/>
-              </w:rPr>
-            </w:pPr>
-            <w:r>
-              <w:rPr>
-                <w:rFonts w:ascii="Arabic Typesetting" w:hAnsi="Arabic Typesetting" w:cs="Arabic Typesetting"/>
-                <w:b/>
-                <w:bCs/>
-                <w:sz w:val="40"/>
-                <w:szCs w:val="40"/>
-                <w:rtl/>
-                <w:lang w:bidi="ar-EG"/>
-              </w:rPr>
-              <w:t>الكم</w:t>
-            </w:r>
-            <w:r>
-              <w:rPr>
-                <w:rFonts w:ascii="Arabic Typesetting" w:hAnsi="Arabic Typesetting" w:cs="Arabic Typesetting" w:hint="cs"/>
-                <w:b/>
-                <w:bCs/>
-                <w:sz w:val="40"/>
-                <w:szCs w:val="40"/>
-                <w:rtl/>
-                <w:lang w:bidi="ar-EG"/>
-              </w:rPr>
-              <w:t>ــــــ</w:t>
-            </w:r>
-            <w:r>
-              <w:rPr>
-                <w:rFonts w:ascii="Arabic Typesetting" w:hAnsi="Arabic Typesetting" w:cs="Arabic Typesetting"/>
-                <w:b/>
-                <w:bCs/>
-                <w:sz w:val="40"/>
-                <w:szCs w:val="40"/>
-                <w:rtl/>
-                <w:lang w:bidi="ar-EG"/>
-              </w:rPr>
-              <w:t>ية</w:t>
-            </w:r>
-          </w:p>
-        </w:tc>
-        <w:tc>
-          <w:tcPr>
-            <w:tcW w:w="2798" w:type="dxa"/>
-            <w:tcBorders>
-              <w:top w:val="thinThickSmallGap" w:sz="18" w:space="0" w:color="auto"/>
-              <w:left w:val="thinThickSmallGap" w:sz="18" w:space="0" w:color="auto"/>
-              <w:bottom w:val="thinThickSmallGap" w:sz="18" w:space="0" w:color="auto"/>
-              <w:right w:val="thinThickSmallGap" w:sz="18" w:space="0" w:color="auto"/>
-            </w:tcBorders>
-            <w:hideMark/>
-          </w:tcPr>
-          <w:p>
-            <w:pPr>
-              <w:spacing w:after="0" w:line="240" w:lineRule="auto"/>
-              <w:jc w:val="center"/>
-              <w:rPr>
-                <w:rFonts w:ascii="Arabic Typesetting" w:hAnsi="Arabic Typesetting" w:cs="Arabic Typesetting"/>
-                <w:b/>
-                <w:bCs/>
-                <w:sz w:val="40"/>
-                <w:szCs w:val="40"/>
-                <w:rtl/>
-                <w:lang w:bidi="ar-EG"/>
-              </w:rPr>
-            </w:pPr>
-            <w:r>
-              <w:rPr>
-                <w:rFonts w:ascii="Arabic Typesetting" w:hAnsi="Arabic Typesetting" w:cs="Arabic Typesetting"/>
-                <w:b/>
-                <w:bCs/>
-                <w:sz w:val="40"/>
-                <w:szCs w:val="40"/>
-                <w:rtl/>
-                <w:lang w:bidi="ar-EG"/>
-              </w:rPr>
-              <w:t>الوص</w:t>
-            </w:r>
-            <w:r>
-              <w:rPr>
-                <w:rFonts w:ascii="Arabic Typesetting" w:hAnsi="Arabic Typesetting" w:cs="Arabic Typesetting" w:hint="cs"/>
-                <w:b/>
-                <w:bCs/>
-                <w:sz w:val="40"/>
-                <w:szCs w:val="40"/>
-                <w:rtl/>
-                <w:lang w:bidi="ar-EG"/>
-              </w:rPr>
-              <w:t>ــ</w:t>
-            </w:r>
-            <w:r>
-              <w:rPr>
-                <w:rFonts w:ascii="Arabic Typesetting" w:hAnsi="Arabic Typesetting" w:cs="Arabic Typesetting"/>
-                <w:b/>
-                <w:bCs/>
-                <w:sz w:val="40"/>
-                <w:szCs w:val="40"/>
-                <w:rtl/>
-                <w:lang w:bidi="ar-EG"/>
-              </w:rPr>
-              <w:t>ف – الملاحظ</w:t>
-            </w:r>
-            <w:r>
-              <w:rPr>
-                <w:rFonts w:ascii="Arabic Typesetting" w:hAnsi="Arabic Typesetting" w:cs="Arabic Typesetting" w:hint="cs"/>
-                <w:b/>
-                <w:bCs/>
-                <w:sz w:val="40"/>
-                <w:szCs w:val="40"/>
-                <w:rtl/>
-                <w:lang w:bidi="ar-EG"/>
-              </w:rPr>
-              <w:t>ـ</w:t>
-            </w:r>
-            <w:r>
-              <w:rPr>
-                <w:rFonts w:ascii="Arabic Typesetting" w:hAnsi="Arabic Typesetting" w:cs="Arabic Typesetting"/>
-                <w:b/>
-                <w:bCs/>
-                <w:sz w:val="40"/>
-                <w:szCs w:val="40"/>
-                <w:rtl/>
-                <w:lang w:bidi="ar-EG"/>
-              </w:rPr>
-              <w:t>ات الفنيه</w:t>
-            </w:r>
-          </w:p>
-        </w:tc>
-        <w:tc>
-          <w:tcPr>
-            <w:tcW w:w="1241" w:type="dxa"/>
-            <w:tcBorders>
-              <w:top w:val="thinThickSmallGap" w:sz="18" w:space="0" w:color="auto"/>
-              <w:left w:val="thinThickSmallGap" w:sz="18" w:space="0" w:color="auto"/>
-              <w:bottom w:val="thinThickSmallGap" w:sz="18" w:space="0" w:color="auto"/>
-              <w:right w:val="thinThickSmallGap" w:sz="18" w:space="0" w:color="auto"/>
-            </w:tcBorders>
-            <w:hideMark/>
-          </w:tcPr>
-          <w:p>
-            <w:pPr>
-              <w:spacing w:after="0" w:line="240" w:lineRule="auto"/>
-              <w:jc w:val="center"/>
-              <w:rPr>
-                <w:rFonts w:ascii="Arabic Typesetting" w:hAnsi="Arabic Typesetting" w:cs="Arabic Typesetting"/>
-                <w:b/>
-                <w:bCs/>
-                <w:sz w:val="40"/>
-                <w:szCs w:val="40"/>
-                <w:rtl/>
-                <w:lang w:bidi="ar-EG"/>
-              </w:rPr>
-            </w:pPr>
-            <w:r>
-              <w:rPr>
-                <w:rFonts w:ascii="Arabic Typesetting" w:hAnsi="Arabic Typesetting" w:cs="Arabic Typesetting"/>
-                <w:b/>
-                <w:bCs/>
-                <w:sz w:val="40"/>
-                <w:szCs w:val="40"/>
-                <w:rtl/>
-                <w:lang w:bidi="ar-EG"/>
-              </w:rPr>
-              <w:t>ملاحظات</w:t>
-            </w:r>
-          </w:p>
-        </w:tc>
-      </w:tr>
-      <w:tr>
-        <w:trPr>
-          <w:trHeight w:val="330"/>
-        </w:trPr>
-        <w:tc>
-          <w:tcPr>
-            <w:tcW w:w="561" w:type="dxa"/>
-            <w:tcBorders>
-              <w:top w:val="thinThickSmallGap" w:sz="18" w:space="0" w:color="auto"/>
-              <w:left w:val="thinThickSmallGap" w:sz="18" w:space="0" w:color="auto"/>
-              <w:bottom w:val="thinThickSmallGap" w:sz="18" w:space="0" w:color="auto"/>
-              <w:right w:val="thinThickSmallGap" w:sz="18" w:space="0" w:color="auto"/>
-            </w:tcBorders>
-            <w:hideMark/>
-          </w:tcPr>
-          <w:p>
-            <w:pPr>
-              <w:spacing w:after="0" w:line="240" w:lineRule="auto"/>
-              <w:jc w:val="center"/>
-              <w:rPr>
-                <w:rFonts w:ascii="Arabic Typesetting" w:hAnsi="Arabic Typesetting" w:cs="Arabic Typesetting"/>
-                <w:b/>
-                <w:bCs/>
-                <w:sz w:val="28"/>
-                <w:szCs w:val="28"/>
-                <w:rtl/>
-                <w:lang w:bidi="ar-EG"/>
-              </w:rPr>
-            </w:pPr>
-            <w:r>
-              <w:rPr>
-                <w:rFonts w:ascii="Arabic Typesetting" w:hAnsi="Arabic Typesetting" w:cs="Arabic Typesetting"/>
-                <w:b/>
-                <w:bCs/>
-                <w:sz w:val="28"/>
-                <w:szCs w:val="28"/>
-                <w:highlight w:val="red"/>
-                <w:rtl/>
-                <w:lang w:bidi="ar-EG"/>
-              </w:rPr>
-              <w:t>1</w:t>
-            </w:r>
-          </w:p>
-        </w:tc>
-        <w:tc>
-          <w:tcPr>
-            <w:tcW w:w="3593" w:type="dxa"/>
-            <w:tcBorders>
-              <w:top w:val="thinThickSmallGap" w:sz="18" w:space="0" w:color="auto"/>
-              <w:left w:val="thinThickSmallGap" w:sz="18" w:space="0" w:color="auto"/>
-              <w:bottom w:val="thinThickSmallGap" w:sz="18" w:space="0" w:color="auto"/>
-              <w:right w:val="thinThickSmallGap" w:sz="18" w:space="0" w:color="auto"/>
-            </w:tcBorders>
-            <w:hideMark/>
-          </w:tcPr>
-          <w:p>
-            <w:pPr>
-              <w:spacing w:after="0" w:line="240" w:lineRule="auto"/>
-              <w:jc w:val="center"/>
-              <w:rPr>
-                <w:rFonts w:ascii="Arabic Typesetting" w:hAnsi="Arabic Typesetting" w:cs="Arabic Typesetting"/>
-                <w:b/>
-                <w:bCs/>
-                <w:sz w:val="28"/>
-                <w:szCs w:val="28"/>
-                <w:rtl/>
-                <w:lang w:bidi="ar-EG"/>
-              </w:rPr>
-            </w:pPr>
-            <w:r>
-              <w:rPr>
-                <w:rFonts w:ascii="Arabic Typesetting" w:hAnsi="Arabic Typesetting" w:cs="Arabic Typesetting"/>
-                <w:b/>
-                <w:bCs/>
-                <w:sz w:val="28"/>
-                <w:szCs w:val="28"/>
-                <w:highlight w:val="red"/>
-                <w:rtl/>
-                <w:lang w:bidi="ar-EG"/>
-              </w:rPr>
-              <w:t>.....................................................</w:t>
-            </w:r>
-          </w:p>
-        </w:tc>
-        <w:tc>
-          <w:tcPr>
-            <w:tcW w:w="977" w:type="dxa"/>
-            <w:tcBorders>
-              <w:top w:val="thinThickSmallGap" w:sz="18" w:space="0" w:color="auto"/>
-              <w:left w:val="thinThickSmallGap" w:sz="18" w:space="0" w:color="auto"/>
-              <w:bottom w:val="thinThickSmallGap" w:sz="18" w:space="0" w:color="auto"/>
-              <w:right w:val="thinThickSmallGap" w:sz="18" w:space="0" w:color="auto"/>
-            </w:tcBorders>
-            <w:hideMark/>
-          </w:tcPr>
-          <w:p>
-            <w:pPr>
-              <w:spacing w:after="0" w:line="240" w:lineRule="auto"/>
-              <w:jc w:val="center"/>
-              <w:rPr>
-                <w:rFonts w:ascii="Arabic Typesetting" w:hAnsi="Arabic Typesetting" w:cs="Arabic Typesetting"/>
-                <w:b/>
-                <w:bCs/>
-                <w:sz w:val="28"/>
-                <w:szCs w:val="28"/>
-                <w:rtl/>
-                <w:lang w:bidi="ar-EG"/>
-              </w:rPr>
-            </w:pPr>
-            <w:r>
-              <w:rPr>
-                <w:rFonts w:ascii="Arabic Typesetting" w:hAnsi="Arabic Typesetting" w:cs="Arabic Typesetting"/>
-                <w:b/>
-                <w:bCs/>
-                <w:sz w:val="28"/>
-                <w:szCs w:val="28"/>
-                <w:highlight w:val="red"/>
-                <w:rtl/>
-                <w:lang w:bidi="ar-EG"/>
-              </w:rPr>
-              <w:t>........</w:t>
-            </w:r>
-          </w:p>
-        </w:tc>
-        <w:tc>
-          <w:tcPr>
-            <w:tcW w:w="977" w:type="dxa"/>
-            <w:tcBorders>
-              <w:top w:val="thinThickSmallGap" w:sz="18" w:space="0" w:color="auto"/>
-              <w:left w:val="thinThickSmallGap" w:sz="18" w:space="0" w:color="auto"/>
-              <w:bottom w:val="thinThickSmallGap" w:sz="18" w:space="0" w:color="auto"/>
-              <w:right w:val="thinThickSmallGap" w:sz="18" w:space="0" w:color="auto"/>
-            </w:tcBorders>
-            <w:hideMark/>
-          </w:tcPr>
-          <w:p>
-            <w:pPr>
-              <w:spacing w:after="0" w:line="240" w:lineRule="auto"/>
-              <w:jc w:val="center"/>
-              <w:rPr>
-                <w:rFonts w:ascii="Arabic Typesetting" w:hAnsi="Arabic Typesetting" w:cs="Arabic Typesetting"/>
-                <w:b/>
-                <w:bCs/>
-                <w:sz w:val="28"/>
-                <w:szCs w:val="28"/>
-                <w:rtl/>
-                <w:lang w:bidi="ar-EG"/>
-              </w:rPr>
-            </w:pPr>
-            <w:r>
-              <w:rPr>
-                <w:rFonts w:ascii="Arabic Typesetting" w:hAnsi="Arabic Typesetting" w:cs="Arabic Typesetting"/>
-                <w:b/>
-                <w:bCs/>
-                <w:sz w:val="28"/>
-                <w:szCs w:val="28"/>
-                <w:highlight w:val="red"/>
-                <w:rtl/>
-                <w:lang w:bidi="ar-EG"/>
-              </w:rPr>
-              <w:t>........</w:t>
-            </w:r>
-          </w:p>
-        </w:tc>
-        <w:tc>
-          <w:tcPr>
-            <w:tcW w:w="2798" w:type="dxa"/>
-            <w:tcBorders>
-              <w:top w:val="thinThickSmallGap" w:sz="18" w:space="0" w:color="auto"/>
-              <w:left w:val="thinThickSmallGap" w:sz="18" w:space="0" w:color="auto"/>
-              <w:bottom w:val="thinThickSmallGap" w:sz="18" w:space="0" w:color="auto"/>
-              <w:right w:val="thinThickSmallGap" w:sz="18" w:space="0" w:color="auto"/>
-            </w:tcBorders>
-            <w:hideMark/>
-          </w:tcPr>
-          <w:p>
-            <w:pPr>
-              <w:spacing w:after="0" w:line="240" w:lineRule="auto"/>
-              <w:jc w:val="center"/>
-              <w:rPr>
-                <w:rFonts w:ascii="Arabic Typesetting" w:hAnsi="Arabic Typesetting" w:cs="Arabic Typesetting"/>
-                <w:b/>
-                <w:bCs/>
-                <w:sz w:val="28"/>
-                <w:szCs w:val="28"/>
-                <w:rtl/>
-                <w:lang w:bidi="ar-EG"/>
-              </w:rPr>
-            </w:pPr>
-            <w:r>
-              <w:rPr>
-                <w:rFonts w:ascii="Arabic Typesetting" w:hAnsi="Arabic Typesetting" w:cs="Arabic Typesetting"/>
-                <w:b/>
-                <w:bCs/>
-                <w:sz w:val="28"/>
-                <w:szCs w:val="28"/>
-                <w:highlight w:val="red"/>
-                <w:rtl/>
-                <w:lang w:bidi="ar-EG"/>
-              </w:rPr>
-              <w:t>................................</w:t>
-            </w:r>
-          </w:p>
-        </w:tc>
-        <w:tc>
-          <w:tcPr>
-            <w:tcW w:w="1241" w:type="dxa"/>
-            <w:tcBorders>
-              <w:top w:val="thinThickSmallGap" w:sz="18" w:space="0" w:color="auto"/>
-              <w:left w:val="thinThickSmallGap" w:sz="18" w:space="0" w:color="auto"/>
-              <w:bottom w:val="thinThickSmallGap" w:sz="18" w:space="0" w:color="auto"/>
-              <w:right w:val="thinThickSmallGap" w:sz="18" w:space="0" w:color="auto"/>
-            </w:tcBorders>
-            <w:hideMark/>
-          </w:tcPr>
-          <w:p>
-            <w:pPr>
-              <w:spacing w:after="0" w:line="240" w:lineRule="auto"/>
-              <w:jc w:val="center"/>
-              <w:rPr>
-                <w:rFonts w:ascii="Arabic Typesetting" w:hAnsi="Arabic Typesetting" w:cs="Arabic Typesetting"/>
-                <w:b/>
-                <w:bCs/>
-                <w:sz w:val="28"/>
-                <w:szCs w:val="28"/>
-                <w:rtl/>
-                <w:lang w:bidi="ar-EG"/>
-              </w:rPr>
-            </w:pPr>
-            <w:r>
-              <w:rPr>
-                <w:rFonts w:ascii="Arabic Typesetting" w:hAnsi="Arabic Typesetting" w:cs="Arabic Typesetting"/>
-                <w:b/>
-                <w:bCs/>
-                <w:sz w:val="28"/>
-                <w:szCs w:val="28"/>
-                <w:highlight w:val="red"/>
-                <w:rtl/>
-                <w:lang w:bidi="ar-EG"/>
-              </w:rPr>
-              <w:t>...............</w:t>
-            </w:r>
-          </w:p>
-        </w:tc>
-      </w:tr>
-      <w:tr>
-        <w:trPr>
-          <w:trHeight w:val="120"/>
-        </w:trPr>
-        <w:tc>
-          <w:tcPr>
-            <w:tcW w:w="561" w:type="dxa"/>
-            <w:tcBorders>
-              <w:top w:val="thinThickSmallGap" w:sz="18" w:space="0" w:color="auto"/>
-              <w:left w:val="thinThickSmallGap" w:sz="18" w:space="0" w:color="auto"/>
-              <w:bottom w:val="thinThickSmallGap" w:sz="18" w:space="0" w:color="auto"/>
-              <w:right w:val="thinThickSmallGap" w:sz="18" w:space="0" w:color="auto"/>
-            </w:tcBorders>
-            <w:hideMark/>
-          </w:tcPr>
-          <w:p>
-            <w:pPr>
-              <w:spacing w:after="0" w:line="240" w:lineRule="auto"/>
-              <w:jc w:val="center"/>
-              <w:rPr>
-                <w:rFonts w:ascii="Arabic Typesetting" w:hAnsi="Arabic Typesetting" w:cs="Arabic Typesetting"/>
-                <w:b/>
-                <w:bCs/>
-                <w:sz w:val="28"/>
-                <w:szCs w:val="28"/>
-                <w:rtl/>
-                <w:lang w:bidi="ar-EG"/>
-              </w:rPr>
-            </w:pPr>
-            <w:r>
-              <w:rPr>
-                <w:rFonts w:ascii="Arabic Typesetting" w:hAnsi="Arabic Typesetting" w:cs="Arabic Typesetting"/>
-                <w:b/>
-                <w:bCs/>
-                <w:sz w:val="28"/>
-                <w:szCs w:val="28"/>
-                <w:highlight w:val="red"/>
-                <w:rtl/>
-                <w:lang w:bidi="ar-EG"/>
-              </w:rPr>
-              <w:t>2</w:t>
-            </w:r>
-          </w:p>
-        </w:tc>
-        <w:tc>
-          <w:tcPr>
-            <w:tcW w:w="3593" w:type="dxa"/>
-            <w:tcBorders>
-              <w:top w:val="thinThickSmallGap" w:sz="18" w:space="0" w:color="auto"/>
-              <w:left w:val="thinThickSmallGap" w:sz="18" w:space="0" w:color="auto"/>
-              <w:bottom w:val="thinThickSmallGap" w:sz="18" w:space="0" w:color="auto"/>
-              <w:right w:val="thinThickSmallGap" w:sz="18" w:space="0" w:color="auto"/>
-            </w:tcBorders>
-            <w:hideMark/>
-          </w:tcPr>
-          <w:p>
-            <w:pPr>
-              <w:spacing w:after="0" w:line="240" w:lineRule="auto"/>
-              <w:jc w:val="center"/>
-              <w:rPr>
-                <w:rFonts w:ascii="Arabic Typesetting" w:hAnsi="Arabic Typesetting" w:cs="Arabic Typesetting"/>
-                <w:b/>
-                <w:bCs/>
-                <w:sz w:val="28"/>
-                <w:szCs w:val="28"/>
-                <w:rtl/>
-                <w:lang w:bidi="ar-EG"/>
-              </w:rPr>
-            </w:pPr>
-            <w:r>
-              <w:rPr>
-                <w:rFonts w:ascii="Arabic Typesetting" w:hAnsi="Arabic Typesetting" w:cs="Arabic Typesetting"/>
-                <w:b/>
-                <w:bCs/>
-                <w:sz w:val="28"/>
-                <w:szCs w:val="28"/>
-                <w:highlight w:val="red"/>
-                <w:rtl/>
-                <w:lang w:bidi="ar-EG"/>
-              </w:rPr>
-              <w:t>......................................................</w:t>
-            </w:r>
-          </w:p>
-        </w:tc>
-        <w:tc>
-          <w:tcPr>
-            <w:tcW w:w="977" w:type="dxa"/>
-            <w:tcBorders>
-              <w:top w:val="thinThickSmallGap" w:sz="18" w:space="0" w:color="auto"/>
-              <w:left w:val="thinThickSmallGap" w:sz="18" w:space="0" w:color="auto"/>
-              <w:bottom w:val="thinThickSmallGap" w:sz="18" w:space="0" w:color="auto"/>
-              <w:right w:val="thinThickSmallGap" w:sz="18" w:space="0" w:color="auto"/>
-            </w:tcBorders>
-            <w:hideMark/>
-          </w:tcPr>
-          <w:p>
-            <w:pPr>
-              <w:spacing w:after="0" w:line="240" w:lineRule="auto"/>
-              <w:jc w:val="center"/>
-              <w:rPr>
-                <w:rFonts w:ascii="Arabic Typesetting" w:hAnsi="Arabic Typesetting" w:cs="Arabic Typesetting"/>
-                <w:b/>
-                <w:bCs/>
-                <w:sz w:val="28"/>
-                <w:szCs w:val="28"/>
-                <w:rtl/>
-                <w:lang w:bidi="ar-EG"/>
-              </w:rPr>
-            </w:pPr>
-            <w:r>
-              <w:rPr>
-                <w:rFonts w:ascii="Arabic Typesetting" w:hAnsi="Arabic Typesetting" w:cs="Arabic Typesetting"/>
-                <w:b/>
-                <w:bCs/>
-                <w:sz w:val="28"/>
-                <w:szCs w:val="28"/>
-                <w:highlight w:val="red"/>
-                <w:rtl/>
-                <w:lang w:bidi="ar-EG"/>
-              </w:rPr>
-              <w:t>........</w:t>
-            </w:r>
-          </w:p>
-        </w:tc>
-        <w:tc>
-          <w:tcPr>
-            <w:tcW w:w="977" w:type="dxa"/>
-            <w:tcBorders>
-              <w:top w:val="thinThickSmallGap" w:sz="18" w:space="0" w:color="auto"/>
-              <w:left w:val="thinThickSmallGap" w:sz="18" w:space="0" w:color="auto"/>
-              <w:bottom w:val="thinThickSmallGap" w:sz="18" w:space="0" w:color="auto"/>
-              <w:right w:val="thinThickSmallGap" w:sz="18" w:space="0" w:color="auto"/>
-            </w:tcBorders>
-            <w:hideMark/>
-          </w:tcPr>
-          <w:p>
-            <w:pPr>
-              <w:spacing w:after="0" w:line="240" w:lineRule="auto"/>
-              <w:jc w:val="center"/>
-              <w:rPr>
-                <w:rFonts w:ascii="Arabic Typesetting" w:hAnsi="Arabic Typesetting" w:cs="Arabic Typesetting"/>
-                <w:b/>
-                <w:bCs/>
-                <w:sz w:val="28"/>
-                <w:szCs w:val="28"/>
-                <w:rtl/>
-                <w:lang w:bidi="ar-EG"/>
-              </w:rPr>
-            </w:pPr>
-            <w:r>
-              <w:rPr>
-                <w:rFonts w:ascii="Arabic Typesetting" w:hAnsi="Arabic Typesetting" w:cs="Arabic Typesetting"/>
-                <w:b/>
-                <w:bCs/>
-                <w:sz w:val="28"/>
-                <w:szCs w:val="28"/>
-                <w:highlight w:val="red"/>
-                <w:rtl/>
-                <w:lang w:bidi="ar-EG"/>
-              </w:rPr>
-              <w:t>.........</w:t>
-            </w:r>
-          </w:p>
-        </w:tc>
-        <w:tc>
-          <w:tcPr>
-            <w:tcW w:w="2798" w:type="dxa"/>
-            <w:tcBorders>
-              <w:top w:val="thinThickSmallGap" w:sz="18" w:space="0" w:color="auto"/>
-              <w:left w:val="thinThickSmallGap" w:sz="18" w:space="0" w:color="auto"/>
-              <w:bottom w:val="thinThickSmallGap" w:sz="18" w:space="0" w:color="auto"/>
-              <w:right w:val="thinThickSmallGap" w:sz="18" w:space="0" w:color="auto"/>
-            </w:tcBorders>
-            <w:hideMark/>
-          </w:tcPr>
-          <w:p>
-            <w:pPr>
-              <w:spacing w:after="0" w:line="240" w:lineRule="auto"/>
-              <w:jc w:val="center"/>
-              <w:rPr>
-                <w:rFonts w:ascii="Arabic Typesetting" w:hAnsi="Arabic Typesetting" w:cs="Arabic Typesetting"/>
-                <w:b/>
-                <w:bCs/>
-                <w:sz w:val="28"/>
-                <w:szCs w:val="28"/>
-                <w:rtl/>
-                <w:lang w:bidi="ar-EG"/>
-              </w:rPr>
-            </w:pPr>
-            <w:r>
-              <w:rPr>
-                <w:rFonts w:ascii="Arabic Typesetting" w:hAnsi="Arabic Typesetting" w:cs="Arabic Typesetting"/>
-                <w:b/>
-                <w:bCs/>
-                <w:sz w:val="28"/>
-                <w:szCs w:val="28"/>
-                <w:highlight w:val="red"/>
-                <w:rtl/>
-                <w:lang w:bidi="ar-EG"/>
-              </w:rPr>
-              <w:t>...................................</w:t>
-            </w:r>
-          </w:p>
-        </w:tc>
-        <w:tc>
-          <w:tcPr>
-            <w:tcW w:w="1241" w:type="dxa"/>
-            <w:tcBorders>
-              <w:top w:val="thinThickSmallGap" w:sz="18" w:space="0" w:color="auto"/>
-              <w:left w:val="thinThickSmallGap" w:sz="18" w:space="0" w:color="auto"/>
-              <w:bottom w:val="thinThickSmallGap" w:sz="18" w:space="0" w:color="auto"/>
-              <w:right w:val="thinThickSmallGap" w:sz="18" w:space="0" w:color="auto"/>
-            </w:tcBorders>
-            <w:hideMark/>
-          </w:tcPr>
-          <w:p>
-            <w:pPr>
-              <w:spacing w:after="0" w:line="240" w:lineRule="auto"/>
-              <w:jc w:val="center"/>
-              <w:rPr>
-                <w:rFonts w:ascii="Arabic Typesetting" w:hAnsi="Arabic Typesetting" w:cs="Arabic Typesetting"/>
-                <w:b/>
-                <w:bCs/>
-                <w:sz w:val="28"/>
-                <w:szCs w:val="28"/>
-                <w:rtl/>
-                <w:lang w:bidi="ar-EG"/>
-              </w:rPr>
-            </w:pPr>
-            <w:r>
-              <w:rPr>
-                <w:rFonts w:ascii="Arabic Typesetting" w:hAnsi="Arabic Typesetting" w:cs="Arabic Typesetting"/>
-                <w:b/>
-                <w:bCs/>
-                <w:sz w:val="28"/>
-                <w:szCs w:val="28"/>
-                <w:highlight w:val="red"/>
-                <w:rtl/>
-                <w:lang w:bidi="ar-EG"/>
-              </w:rPr>
-              <w:t>................</w:t>
-            </w:r>
-          </w:p>
-        </w:tc>
-      </w:tr>
-      <w:tr>
-        <w:trPr>
-          <w:trHeight w:val="225"/>
-        </w:trPr>
-        <w:tc>
-          <w:tcPr>
-            <w:tcW w:w="561" w:type="dxa"/>
-            <w:tcBorders>
-              <w:top w:val="thinThickSmallGap" w:sz="18" w:space="0" w:color="auto"/>
-              <w:left w:val="thinThickSmallGap" w:sz="18" w:space="0" w:color="auto"/>
-              <w:bottom w:val="thinThickSmallGap" w:sz="18" w:space="0" w:color="auto"/>
-              <w:right w:val="thinThickSmallGap" w:sz="18" w:space="0" w:color="auto"/>
-            </w:tcBorders>
-            <w:hideMark/>
-          </w:tcPr>
-          <w:p>
-            <w:pPr>
-              <w:spacing w:after="0" w:line="240" w:lineRule="auto"/>
-              <w:jc w:val="center"/>
-              <w:rPr>
-                <w:rFonts w:ascii="Arabic Typesetting" w:hAnsi="Arabic Typesetting" w:cs="Arabic Typesetting"/>
-                <w:b/>
-                <w:bCs/>
-                <w:sz w:val="28"/>
-                <w:szCs w:val="28"/>
-                <w:rtl/>
-                <w:lang w:bidi="ar-EG"/>
-              </w:rPr>
-            </w:pPr>
-            <w:r>
-              <w:rPr>
-                <w:rFonts w:ascii="Arabic Typesetting" w:hAnsi="Arabic Typesetting" w:cs="Arabic Typesetting"/>
-                <w:b/>
-                <w:bCs/>
-                <w:sz w:val="28"/>
-                <w:szCs w:val="28"/>
-                <w:highlight w:val="red"/>
-                <w:rtl/>
-                <w:lang w:bidi="ar-EG"/>
-              </w:rPr>
-              <w:t>3</w:t>
-            </w:r>
-          </w:p>
-        </w:tc>
-        <w:tc>
-          <w:tcPr>
-            <w:tcW w:w="3593" w:type="dxa"/>
-            <w:tcBorders>
-              <w:top w:val="thinThickSmallGap" w:sz="18" w:space="0" w:color="auto"/>
-              <w:left w:val="thinThickSmallGap" w:sz="18" w:space="0" w:color="auto"/>
-              <w:bottom w:val="thinThickSmallGap" w:sz="18" w:space="0" w:color="auto"/>
-              <w:right w:val="thinThickSmallGap" w:sz="18" w:space="0" w:color="auto"/>
-            </w:tcBorders>
-            <w:hideMark/>
-          </w:tcPr>
-          <w:p>
-            <w:pPr>
-              <w:spacing w:after="0" w:line="240" w:lineRule="auto"/>
-              <w:jc w:val="center"/>
-              <w:rPr>
-                <w:rFonts w:ascii="Arabic Typesetting" w:hAnsi="Arabic Typesetting" w:cs="Arabic Typesetting"/>
-                <w:b/>
-                <w:bCs/>
-                <w:sz w:val="28"/>
-                <w:szCs w:val="28"/>
-                <w:rtl/>
-                <w:lang w:bidi="ar-EG"/>
-              </w:rPr>
-            </w:pPr>
-            <w:r>
-              <w:rPr>
-                <w:rFonts w:ascii="Arabic Typesetting" w:hAnsi="Arabic Typesetting" w:cs="Arabic Typesetting"/>
-                <w:b/>
-                <w:bCs/>
-                <w:sz w:val="28"/>
-                <w:szCs w:val="28"/>
-                <w:highlight w:val="red"/>
-                <w:rtl/>
-                <w:lang w:bidi="ar-EG"/>
-              </w:rPr>
-              <w:t>........................................................</w:t>
-            </w:r>
-          </w:p>
-        </w:tc>
-        <w:tc>
-          <w:tcPr>
-            <w:tcW w:w="977" w:type="dxa"/>
-            <w:tcBorders>
-              <w:top w:val="thinThickSmallGap" w:sz="18" w:space="0" w:color="auto"/>
-              <w:left w:val="thinThickSmallGap" w:sz="18" w:space="0" w:color="auto"/>
-              <w:bottom w:val="thinThickSmallGap" w:sz="18" w:space="0" w:color="auto"/>
-              <w:right w:val="thinThickSmallGap" w:sz="18" w:space="0" w:color="auto"/>
-            </w:tcBorders>
-            <w:hideMark/>
-          </w:tcPr>
-          <w:p>
-            <w:pPr>
-              <w:spacing w:after="0" w:line="240" w:lineRule="auto"/>
-              <w:jc w:val="center"/>
-              <w:rPr>
-                <w:rFonts w:ascii="Arabic Typesetting" w:hAnsi="Arabic Typesetting" w:cs="Arabic Typesetting"/>
-                <w:b/>
-                <w:bCs/>
-                <w:sz w:val="28"/>
-                <w:szCs w:val="28"/>
-                <w:rtl/>
-                <w:lang w:bidi="ar-EG"/>
-              </w:rPr>
-            </w:pPr>
-            <w:r>
-              <w:rPr>
-                <w:rFonts w:ascii="Arabic Typesetting" w:hAnsi="Arabic Typesetting" w:cs="Arabic Typesetting"/>
-                <w:b/>
-                <w:bCs/>
-                <w:sz w:val="28"/>
-                <w:szCs w:val="28"/>
-                <w:highlight w:val="red"/>
-                <w:rtl/>
-                <w:lang w:bidi="ar-EG"/>
-              </w:rPr>
-              <w:t>.........</w:t>
-            </w:r>
-          </w:p>
-        </w:tc>
-        <w:tc>
-          <w:tcPr>
-            <w:tcW w:w="977" w:type="dxa"/>
-            <w:tcBorders>
-              <w:top w:val="thinThickSmallGap" w:sz="18" w:space="0" w:color="auto"/>
-              <w:left w:val="thinThickSmallGap" w:sz="18" w:space="0" w:color="auto"/>
-              <w:bottom w:val="thinThickSmallGap" w:sz="18" w:space="0" w:color="auto"/>
-              <w:right w:val="thinThickSmallGap" w:sz="18" w:space="0" w:color="auto"/>
-            </w:tcBorders>
-            <w:hideMark/>
-          </w:tcPr>
-          <w:p>
-            <w:pPr>
-              <w:spacing w:after="0" w:line="240" w:lineRule="auto"/>
-              <w:jc w:val="center"/>
-              <w:rPr>
-                <w:rFonts w:ascii="Arabic Typesetting" w:hAnsi="Arabic Typesetting" w:cs="Arabic Typesetting"/>
-                <w:b/>
-                <w:bCs/>
-                <w:sz w:val="28"/>
-                <w:szCs w:val="28"/>
-                <w:rtl/>
-                <w:lang w:bidi="ar-EG"/>
-              </w:rPr>
-            </w:pPr>
-            <w:r>
-              <w:rPr>
-                <w:rFonts w:ascii="Arabic Typesetting" w:hAnsi="Arabic Typesetting" w:cs="Arabic Typesetting"/>
-                <w:b/>
-                <w:bCs/>
-                <w:sz w:val="28"/>
-                <w:szCs w:val="28"/>
-                <w:highlight w:val="red"/>
-                <w:rtl/>
-                <w:lang w:bidi="ar-EG"/>
-              </w:rPr>
-              <w:t>........</w:t>
-            </w:r>
-          </w:p>
-        </w:tc>
-        <w:tc>
-          <w:tcPr>
-            <w:tcW w:w="2798" w:type="dxa"/>
-            <w:tcBorders>
-              <w:top w:val="thinThickSmallGap" w:sz="18" w:space="0" w:color="auto"/>
-              <w:left w:val="thinThickSmallGap" w:sz="18" w:space="0" w:color="auto"/>
-              <w:bottom w:val="thinThickSmallGap" w:sz="18" w:space="0" w:color="auto"/>
-              <w:right w:val="thinThickSmallGap" w:sz="18" w:space="0" w:color="auto"/>
-            </w:tcBorders>
-            <w:hideMark/>
-          </w:tcPr>
-          <w:p>
-            <w:pPr>
-              <w:spacing w:after="0" w:line="240" w:lineRule="auto"/>
-              <w:jc w:val="center"/>
-              <w:rPr>
-                <w:rFonts w:ascii="Arabic Typesetting" w:hAnsi="Arabic Typesetting" w:cs="Arabic Typesetting"/>
-                <w:b/>
-                <w:bCs/>
-                <w:sz w:val="28"/>
-                <w:szCs w:val="28"/>
-                <w:rtl/>
-                <w:lang w:bidi="ar-EG"/>
-              </w:rPr>
-            </w:pPr>
-            <w:r>
-              <w:rPr>
-                <w:rFonts w:ascii="Arabic Typesetting" w:hAnsi="Arabic Typesetting" w:cs="Arabic Typesetting"/>
-                <w:b/>
-                <w:bCs/>
-                <w:sz w:val="28"/>
-                <w:szCs w:val="28"/>
-                <w:highlight w:val="red"/>
-                <w:rtl/>
-                <w:lang w:bidi="ar-EG"/>
-              </w:rPr>
-              <w:t>...................................</w:t>
-            </w:r>
-          </w:p>
-        </w:tc>
-        <w:tc>
-          <w:tcPr>
-            <w:tcW w:w="1241" w:type="dxa"/>
-            <w:tcBorders>
-              <w:top w:val="thinThickSmallGap" w:sz="18" w:space="0" w:color="auto"/>
-              <w:left w:val="thinThickSmallGap" w:sz="18" w:space="0" w:color="auto"/>
-              <w:bottom w:val="thinThickSmallGap" w:sz="18" w:space="0" w:color="auto"/>
-              <w:right w:val="thinThickSmallGap" w:sz="18" w:space="0" w:color="auto"/>
-            </w:tcBorders>
-            <w:hideMark/>
-          </w:tcPr>
-          <w:p>
-            <w:pPr>
-              <w:spacing w:after="0" w:line="240" w:lineRule="auto"/>
-              <w:jc w:val="center"/>
-              <w:rPr>
-                <w:rFonts w:ascii="Arabic Typesetting" w:hAnsi="Arabic Typesetting" w:cs="Arabic Typesetting"/>
-                <w:b/>
-                <w:bCs/>
-                <w:sz w:val="28"/>
-                <w:szCs w:val="28"/>
-                <w:rtl/>
-                <w:lang w:bidi="ar-EG"/>
-              </w:rPr>
-            </w:pPr>
-            <w:r>
-              <w:rPr>
-                <w:rFonts w:ascii="Arabic Typesetting" w:hAnsi="Arabic Typesetting" w:cs="Arabic Typesetting"/>
-                <w:b/>
-                <w:bCs/>
-                <w:sz w:val="28"/>
-                <w:szCs w:val="28"/>
-                <w:highlight w:val="red"/>
-                <w:rtl/>
-                <w:lang w:bidi="ar-EG"/>
-              </w:rPr>
-              <w:t>.................</w:t>
-            </w:r>
-          </w:p>
-        </w:tc>
-      </w:tr>
-      <w:tr>
-        <w:trPr>
-          <w:trHeight w:val="60"/>
-        </w:trPr>
-        <w:tc>
-          <w:tcPr>
-            <w:tcW w:w="561" w:type="dxa"/>
-            <w:tcBorders>
-              <w:top w:val="thinThickSmallGap" w:sz="18" w:space="0" w:color="auto"/>
-              <w:left w:val="thinThickSmallGap" w:sz="18" w:space="0" w:color="auto"/>
-              <w:bottom w:val="thinThickSmallGap" w:sz="18" w:space="0" w:color="auto"/>
-              <w:right w:val="thinThickSmallGap" w:sz="18" w:space="0" w:color="auto"/>
-            </w:tcBorders>
-            <w:hideMark/>
-          </w:tcPr>
-          <w:p>
-            <w:pPr>
-              <w:spacing w:after="0" w:line="240" w:lineRule="auto"/>
-              <w:jc w:val="center"/>
-              <w:rPr>
-                <w:rFonts w:ascii="Arabic Typesetting" w:hAnsi="Arabic Typesetting" w:cs="Arabic Typesetting"/>
-                <w:b/>
-                <w:bCs/>
-                <w:sz w:val="28"/>
-                <w:szCs w:val="28"/>
-                <w:rtl/>
-                <w:lang w:bidi="ar-EG"/>
-              </w:rPr>
-            </w:pPr>
-            <w:r>
-              <w:rPr>
-                <w:rFonts w:ascii="Arabic Typesetting" w:hAnsi="Arabic Typesetting" w:cs="Arabic Typesetting"/>
-                <w:b/>
-                <w:bCs/>
-                <w:sz w:val="28"/>
-                <w:szCs w:val="28"/>
-                <w:highlight w:val="red"/>
-                <w:rtl/>
-                <w:lang w:bidi="ar-EG"/>
-              </w:rPr>
-              <w:t>4</w:t>
-            </w:r>
-          </w:p>
-        </w:tc>
-        <w:tc>
-          <w:tcPr>
-            <w:tcW w:w="3593" w:type="dxa"/>
-            <w:tcBorders>
-              <w:top w:val="thinThickSmallGap" w:sz="18" w:space="0" w:color="auto"/>
-              <w:left w:val="thinThickSmallGap" w:sz="18" w:space="0" w:color="auto"/>
-              <w:bottom w:val="thinThickSmallGap" w:sz="18" w:space="0" w:color="auto"/>
-              <w:right w:val="thinThickSmallGap" w:sz="18" w:space="0" w:color="auto"/>
-            </w:tcBorders>
-            <w:hideMark/>
-          </w:tcPr>
-          <w:p>
-            <w:pPr>
-              <w:spacing w:after="0" w:line="240" w:lineRule="auto"/>
-              <w:jc w:val="center"/>
-              <w:rPr>
-                <w:rFonts w:ascii="Arabic Typesetting" w:hAnsi="Arabic Typesetting" w:cs="Arabic Typesetting"/>
-                <w:b/>
-                <w:bCs/>
-                <w:sz w:val="28"/>
-                <w:szCs w:val="28"/>
-                <w:rtl/>
-                <w:lang w:bidi="ar-EG"/>
-              </w:rPr>
-            </w:pPr>
-            <w:r>
-              <w:rPr>
-                <w:rFonts w:ascii="Arabic Typesetting" w:hAnsi="Arabic Typesetting" w:cs="Arabic Typesetting"/>
-                <w:b/>
-                <w:bCs/>
-                <w:sz w:val="28"/>
-                <w:szCs w:val="28"/>
-                <w:highlight w:val="red"/>
-                <w:rtl/>
-                <w:lang w:bidi="ar-EG"/>
-              </w:rPr>
-              <w:t>.....................................................</w:t>
-            </w:r>
-          </w:p>
-        </w:tc>
-        <w:tc>
-          <w:tcPr>
-            <w:tcW w:w="977" w:type="dxa"/>
-            <w:tcBorders>
-              <w:top w:val="thinThickSmallGap" w:sz="18" w:space="0" w:color="auto"/>
-              <w:left w:val="thinThickSmallGap" w:sz="18" w:space="0" w:color="auto"/>
-              <w:bottom w:val="thinThickSmallGap" w:sz="18" w:space="0" w:color="auto"/>
-              <w:right w:val="thinThickSmallGap" w:sz="18" w:space="0" w:color="auto"/>
-            </w:tcBorders>
-            <w:hideMark/>
-          </w:tcPr>
-          <w:p>
-            <w:pPr>
-              <w:spacing w:after="0" w:line="240" w:lineRule="auto"/>
-              <w:jc w:val="center"/>
-              <w:rPr>
-                <w:rFonts w:ascii="Arabic Typesetting" w:hAnsi="Arabic Typesetting" w:cs="Arabic Typesetting"/>
-                <w:b/>
-                <w:bCs/>
-                <w:sz w:val="28"/>
-                <w:szCs w:val="28"/>
-                <w:rtl/>
-                <w:lang w:bidi="ar-EG"/>
-              </w:rPr>
-            </w:pPr>
-            <w:r>
-              <w:rPr>
-                <w:rFonts w:ascii="Arabic Typesetting" w:hAnsi="Arabic Typesetting" w:cs="Arabic Typesetting"/>
-                <w:b/>
-                <w:bCs/>
-                <w:sz w:val="28"/>
-                <w:szCs w:val="28"/>
-                <w:highlight w:val="red"/>
-                <w:rtl/>
-                <w:lang w:bidi="ar-EG"/>
-              </w:rPr>
-              <w:t>.........</w:t>
-            </w:r>
-          </w:p>
-        </w:tc>
-        <w:tc>
-          <w:tcPr>
-            <w:tcW w:w="977" w:type="dxa"/>
-            <w:tcBorders>
-              <w:top w:val="thinThickSmallGap" w:sz="18" w:space="0" w:color="auto"/>
-              <w:left w:val="thinThickSmallGap" w:sz="18" w:space="0" w:color="auto"/>
-              <w:bottom w:val="thinThickSmallGap" w:sz="18" w:space="0" w:color="auto"/>
-              <w:right w:val="thinThickSmallGap" w:sz="18" w:space="0" w:color="auto"/>
-            </w:tcBorders>
-            <w:hideMark/>
-          </w:tcPr>
-          <w:p>
-            <w:pPr>
-              <w:spacing w:after="0" w:line="240" w:lineRule="auto"/>
-              <w:jc w:val="center"/>
-              <w:rPr>
-                <w:rFonts w:ascii="Arabic Typesetting" w:hAnsi="Arabic Typesetting" w:cs="Arabic Typesetting"/>
-                <w:b/>
-                <w:bCs/>
-                <w:sz w:val="28"/>
-                <w:szCs w:val="28"/>
-                <w:rtl/>
-                <w:lang w:bidi="ar-EG"/>
-              </w:rPr>
-            </w:pPr>
-            <w:r>
-              <w:rPr>
-                <w:rFonts w:ascii="Arabic Typesetting" w:hAnsi="Arabic Typesetting" w:cs="Arabic Typesetting"/>
-                <w:b/>
-                <w:bCs/>
-                <w:sz w:val="28"/>
-                <w:szCs w:val="28"/>
-                <w:highlight w:val="red"/>
-                <w:rtl/>
-                <w:lang w:bidi="ar-EG"/>
-              </w:rPr>
-              <w:t>.........</w:t>
-            </w:r>
-          </w:p>
-        </w:tc>
-        <w:tc>
-          <w:tcPr>
-            <w:tcW w:w="2798" w:type="dxa"/>
-            <w:tcBorders>
-              <w:top w:val="thinThickSmallGap" w:sz="18" w:space="0" w:color="auto"/>
-              <w:left w:val="thinThickSmallGap" w:sz="18" w:space="0" w:color="auto"/>
-              <w:bottom w:val="thinThickSmallGap" w:sz="18" w:space="0" w:color="auto"/>
-              <w:right w:val="thinThickSmallGap" w:sz="18" w:space="0" w:color="auto"/>
-            </w:tcBorders>
-            <w:hideMark/>
-          </w:tcPr>
-          <w:p>
-            <w:pPr>
-              <w:spacing w:after="0" w:line="240" w:lineRule="auto"/>
-              <w:jc w:val="center"/>
-              <w:rPr>
-                <w:rFonts w:ascii="Arabic Typesetting" w:hAnsi="Arabic Typesetting" w:cs="Arabic Typesetting"/>
-                <w:b/>
-                <w:bCs/>
-                <w:sz w:val="28"/>
-                <w:szCs w:val="28"/>
-                <w:rtl/>
-                <w:lang w:bidi="ar-EG"/>
-              </w:rPr>
-            </w:pPr>
-            <w:r>
-              <w:rPr>
-                <w:rFonts w:ascii="Arabic Typesetting" w:hAnsi="Arabic Typesetting" w:cs="Arabic Typesetting"/>
-                <w:b/>
-                <w:bCs/>
-                <w:sz w:val="28"/>
-                <w:szCs w:val="28"/>
-                <w:highlight w:val="red"/>
-                <w:rtl/>
-                <w:lang w:bidi="ar-EG"/>
-              </w:rPr>
-              <w:t>..................................</w:t>
-            </w:r>
-          </w:p>
-        </w:tc>
-        <w:tc>
-          <w:tcPr>
-            <w:tcW w:w="1241" w:type="dxa"/>
-            <w:tcBorders>
-              <w:top w:val="thinThickSmallGap" w:sz="18" w:space="0" w:color="auto"/>
-              <w:left w:val="thinThickSmallGap" w:sz="18" w:space="0" w:color="auto"/>
-              <w:bottom w:val="thinThickSmallGap" w:sz="18" w:space="0" w:color="auto"/>
-              <w:right w:val="thinThickSmallGap" w:sz="18" w:space="0" w:color="auto"/>
-            </w:tcBorders>
-            <w:hideMark/>
-          </w:tcPr>
-          <w:p>
-            <w:pPr>
-              <w:spacing w:after="0" w:line="240" w:lineRule="auto"/>
-              <w:jc w:val="center"/>
-              <w:rPr>
-                <w:rFonts w:ascii="Arabic Typesetting" w:hAnsi="Arabic Typesetting" w:cs="Arabic Typesetting"/>
-                <w:b/>
-                <w:bCs/>
-                <w:sz w:val="28"/>
-                <w:szCs w:val="28"/>
-                <w:highlight w:val="red"/>
-                <w:rtl/>
-                <w:lang w:bidi="ar-EG"/>
-              </w:rPr>
-            </w:pPr>
-            <w:r>
-              <w:rPr>
-                <w:rFonts w:ascii="Arabic Typesetting" w:hAnsi="Arabic Typesetting" w:cs="Arabic Typesetting"/>
-                <w:b/>
-                <w:bCs/>
-                <w:sz w:val="28"/>
-                <w:szCs w:val="28"/>
-                <w:highlight w:val="red"/>
-                <w:rtl/>
-                <w:lang w:bidi="ar-EG"/>
-              </w:rPr>
-              <w:t>...............</w:t>
-            </w:r>
-          </w:p>
-        </w:tc>
-      </w:tr>
-      <w:tr>
-        <w:trPr>
-          <w:trHeight w:val="285"/>
-        </w:trPr>
-        <w:tc>
-          <w:tcPr>
-            <w:tcW w:w="561" w:type="dxa"/>
-            <w:tcBorders>
-              <w:top w:val="thinThickSmallGap" w:sz="18" w:space="0" w:color="auto"/>
-              <w:left w:val="thinThickSmallGap" w:sz="18" w:space="0" w:color="auto"/>
-              <w:bottom w:val="thinThickSmallGap" w:sz="18" w:space="0" w:color="auto"/>
-              <w:right w:val="thinThickSmallGap" w:sz="18" w:space="0" w:color="auto"/>
-            </w:tcBorders>
-            <w:hideMark/>
-          </w:tcPr>
-          <w:p>
-            <w:pPr>
-              <w:spacing w:after="0" w:line="240" w:lineRule="auto"/>
-              <w:jc w:val="center"/>
-              <w:rPr>
-                <w:rFonts w:ascii="Arabic Typesetting" w:hAnsi="Arabic Typesetting" w:cs="Arabic Typesetting"/>
-                <w:b/>
-                <w:bCs/>
-                <w:sz w:val="28"/>
-                <w:szCs w:val="28"/>
-                <w:rtl/>
-                <w:lang w:bidi="ar-EG"/>
-              </w:rPr>
-            </w:pPr>
-            <w:r>
-              <w:rPr>
-                <w:rFonts w:ascii="Arabic Typesetting" w:hAnsi="Arabic Typesetting" w:cs="Arabic Typesetting"/>
-                <w:b/>
-                <w:bCs/>
-                <w:sz w:val="28"/>
-                <w:szCs w:val="28"/>
-                <w:highlight w:val="red"/>
-                <w:rtl/>
-                <w:lang w:bidi="ar-EG"/>
-              </w:rPr>
-              <w:t>5</w:t>
-            </w:r>
-          </w:p>
-        </w:tc>
-        <w:tc>
-          <w:tcPr>
-            <w:tcW w:w="3593" w:type="dxa"/>
-            <w:tcBorders>
-              <w:top w:val="thinThickSmallGap" w:sz="18" w:space="0" w:color="auto"/>
-              <w:left w:val="thinThickSmallGap" w:sz="18" w:space="0" w:color="auto"/>
-              <w:bottom w:val="thinThickSmallGap" w:sz="18" w:space="0" w:color="auto"/>
-              <w:right w:val="thinThickSmallGap" w:sz="18" w:space="0" w:color="auto"/>
-            </w:tcBorders>
-            <w:hideMark/>
-          </w:tcPr>
-          <w:p>
-            <w:pPr>
-              <w:spacing w:after="0" w:line="240" w:lineRule="auto"/>
-              <w:jc w:val="center"/>
-              <w:rPr>
-                <w:rFonts w:ascii="Arabic Typesetting" w:hAnsi="Arabic Typesetting" w:cs="Arabic Typesetting"/>
-                <w:b/>
-                <w:bCs/>
-                <w:sz w:val="28"/>
-                <w:szCs w:val="28"/>
-                <w:rtl/>
-                <w:lang w:bidi="ar-EG"/>
-              </w:rPr>
-            </w:pPr>
-            <w:r>
-              <w:rPr>
-                <w:rFonts w:ascii="Arabic Typesetting" w:hAnsi="Arabic Typesetting" w:cs="Arabic Typesetting"/>
-                <w:b/>
-                <w:bCs/>
-                <w:sz w:val="28"/>
-                <w:szCs w:val="28"/>
-                <w:highlight w:val="red"/>
-                <w:rtl/>
-                <w:lang w:bidi="ar-EG"/>
-              </w:rPr>
-              <w:t>......................................................</w:t>
-            </w:r>
-          </w:p>
-        </w:tc>
-        <w:tc>
-          <w:tcPr>
-            <w:tcW w:w="977" w:type="dxa"/>
-            <w:tcBorders>
-              <w:top w:val="thinThickSmallGap" w:sz="18" w:space="0" w:color="auto"/>
-              <w:left w:val="thinThickSmallGap" w:sz="18" w:space="0" w:color="auto"/>
-              <w:bottom w:val="thinThickSmallGap" w:sz="18" w:space="0" w:color="auto"/>
-              <w:right w:val="thinThickSmallGap" w:sz="18" w:space="0" w:color="auto"/>
-            </w:tcBorders>
-            <w:hideMark/>
-          </w:tcPr>
-          <w:p>
-            <w:pPr>
-              <w:spacing w:after="0" w:line="240" w:lineRule="auto"/>
-              <w:jc w:val="center"/>
-              <w:rPr>
-                <w:rFonts w:ascii="Arabic Typesetting" w:hAnsi="Arabic Typesetting" w:cs="Arabic Typesetting"/>
-                <w:b/>
-                <w:bCs/>
-                <w:sz w:val="28"/>
-                <w:szCs w:val="28"/>
-                <w:rtl/>
-                <w:lang w:bidi="ar-EG"/>
-              </w:rPr>
-            </w:pPr>
-            <w:r>
-              <w:rPr>
-                <w:rFonts w:ascii="Arabic Typesetting" w:hAnsi="Arabic Typesetting" w:cs="Arabic Typesetting"/>
-                <w:b/>
-                <w:bCs/>
-                <w:sz w:val="28"/>
-                <w:szCs w:val="28"/>
-                <w:highlight w:val="red"/>
-                <w:rtl/>
-                <w:lang w:bidi="ar-EG"/>
-              </w:rPr>
-              <w:t>......</w:t>
-            </w:r>
-          </w:p>
-        </w:tc>
-        <w:tc>
-          <w:tcPr>
-            <w:tcW w:w="977" w:type="dxa"/>
-            <w:tcBorders>
-              <w:top w:val="thinThickSmallGap" w:sz="18" w:space="0" w:color="auto"/>
-              <w:left w:val="thinThickSmallGap" w:sz="18" w:space="0" w:color="auto"/>
-              <w:bottom w:val="thinThickSmallGap" w:sz="18" w:space="0" w:color="auto"/>
-              <w:right w:val="thinThickSmallGap" w:sz="18" w:space="0" w:color="auto"/>
-            </w:tcBorders>
-            <w:hideMark/>
-          </w:tcPr>
-          <w:p>
-            <w:pPr>
-              <w:spacing w:after="0" w:line="240" w:lineRule="auto"/>
-              <w:jc w:val="center"/>
-              <w:rPr>
-                <w:rFonts w:ascii="Arabic Typesetting" w:hAnsi="Arabic Typesetting" w:cs="Arabic Typesetting"/>
-                <w:b/>
-                <w:bCs/>
-                <w:sz w:val="28"/>
-                <w:szCs w:val="28"/>
-                <w:rtl/>
-                <w:lang w:bidi="ar-EG"/>
-              </w:rPr>
-            </w:pPr>
-            <w:r>
-              <w:rPr>
-                <w:rFonts w:ascii="Arabic Typesetting" w:hAnsi="Arabic Typesetting" w:cs="Arabic Typesetting"/>
-                <w:b/>
-                <w:bCs/>
-                <w:sz w:val="28"/>
-                <w:szCs w:val="28"/>
-                <w:highlight w:val="red"/>
-                <w:rtl/>
-                <w:lang w:bidi="ar-EG"/>
-              </w:rPr>
-              <w:t>.......</w:t>
-            </w:r>
-          </w:p>
-        </w:tc>
-        <w:tc>
-          <w:tcPr>
-            <w:tcW w:w="2798" w:type="dxa"/>
-            <w:tcBorders>
-              <w:top w:val="thinThickSmallGap" w:sz="18" w:space="0" w:color="auto"/>
-              <w:left w:val="thinThickSmallGap" w:sz="18" w:space="0" w:color="auto"/>
-              <w:bottom w:val="thinThickSmallGap" w:sz="18" w:space="0" w:color="auto"/>
-              <w:right w:val="thinThickSmallGap" w:sz="18" w:space="0" w:color="auto"/>
-            </w:tcBorders>
-            <w:hideMark/>
-          </w:tcPr>
-          <w:p>
-            <w:pPr>
-              <w:spacing w:after="0" w:line="240" w:lineRule="auto"/>
-              <w:jc w:val="center"/>
-              <w:rPr>
-                <w:rFonts w:ascii="Arabic Typesetting" w:hAnsi="Arabic Typesetting" w:cs="Arabic Typesetting"/>
-                <w:b/>
-                <w:bCs/>
-                <w:sz w:val="28"/>
-                <w:szCs w:val="28"/>
-                <w:rtl/>
-                <w:lang w:bidi="ar-EG"/>
-              </w:rPr>
-            </w:pPr>
-            <w:r>
-              <w:rPr>
-                <w:rFonts w:ascii="Arabic Typesetting" w:hAnsi="Arabic Typesetting" w:cs="Arabic Typesetting"/>
-                <w:b/>
-                <w:bCs/>
-                <w:sz w:val="28"/>
-                <w:szCs w:val="28"/>
-                <w:highlight w:val="red"/>
-                <w:rtl/>
-                <w:lang w:bidi="ar-EG"/>
-              </w:rPr>
-              <w:t>...................................</w:t>
-            </w:r>
-          </w:p>
-        </w:tc>
-        <w:tc>
-          <w:tcPr>
-            <w:tcW w:w="1241" w:type="dxa"/>
-            <w:tcBorders>
-              <w:top w:val="thinThickSmallGap" w:sz="18" w:space="0" w:color="auto"/>
-              <w:left w:val="thinThickSmallGap" w:sz="18" w:space="0" w:color="auto"/>
-              <w:bottom w:val="thinThickSmallGap" w:sz="18" w:space="0" w:color="auto"/>
-              <w:right w:val="thinThickSmallGap" w:sz="18" w:space="0" w:color="auto"/>
-            </w:tcBorders>
-            <w:hideMark/>
-          </w:tcPr>
-          <w:p>
-            <w:pPr>
-              <w:spacing w:after="0" w:line="240" w:lineRule="auto"/>
-              <w:jc w:val="center"/>
-              <w:rPr>
-                <w:rFonts w:ascii="Arabic Typesetting" w:hAnsi="Arabic Typesetting" w:cs="Arabic Typesetting"/>
-                <w:b/>
-                <w:bCs/>
-                <w:sz w:val="28"/>
-                <w:szCs w:val="28"/>
-                <w:rtl/>
-                <w:lang w:bidi="ar-EG"/>
-              </w:rPr>
-            </w:pPr>
-            <w:r>
-              <w:rPr>
-                <w:rFonts w:ascii="Arabic Typesetting" w:hAnsi="Arabic Typesetting" w:cs="Arabic Typesetting"/>
-                <w:b/>
-                <w:bCs/>
-                <w:sz w:val="28"/>
-                <w:szCs w:val="28"/>
-                <w:highlight w:val="red"/>
-                <w:rtl/>
-                <w:lang w:bidi="ar-EG"/>
-              </w:rPr>
-              <w:t>..............</w:t>
-            </w:r>
-          </w:p>
-        </w:tc>
-      </w:tr>
-    </w:tbl>
-    <w:p>
-      <w:pPr>
-        <w:spacing w:after="0" w:line="240" w:lineRule="auto"/>
-        <w:ind w:left="-567" w:hanging="283"/>
-        <w:jc w:val="highKashida"/>
-        <w:rPr>
-          <w:b/>
-          <w:bCs/>
-          <w:sz w:val="32"/>
-          <w:szCs w:val="32"/>
-          <w:rtl/>
-          <w:lang w:bidi="ar-EG"/>
-        </w:rPr>
-      </w:pPr>
-      <w:r>
-        <w:rPr>
-          <w:sz w:val="40"/>
-          <w:szCs w:val="40"/>
-          <w:rtl/>
-          <w:lang w:bidi="ar-EG"/>
-        </w:rPr>
-        <w:t xml:space="preserve">  </w:t>
-      </w:r>
-      <w:r>
-        <w:rPr>
-          <w:b/>
-          <w:bCs/>
-          <w:sz w:val="36"/>
-          <w:szCs w:val="36"/>
-          <w:rtl/>
-          <w:lang w:bidi="ar-EG"/>
-        </w:rPr>
-        <w:t xml:space="preserve"> </w:t>
-      </w:r>
-      <w:r>
-        <w:rPr>
-          <w:b/>
-          <w:bCs/>
-          <w:sz w:val="32"/>
-          <w:szCs w:val="32"/>
-          <w:rtl/>
-          <w:lang w:bidi="ar-EG"/>
-        </w:rPr>
-        <w:t xml:space="preserve">تضمن جولدن سرفيس الأصناف </w:t>
-      </w:r>
-      <w:r>
-        <w:rPr>
-          <w:b/>
-          <w:bCs/>
-          <w:sz w:val="32"/>
-          <w:szCs w:val="32"/>
-          <w:highlight w:val="red"/>
-          <w:rtl/>
-          <w:lang w:bidi="ar-EG"/>
-        </w:rPr>
-        <w:t>المورده</w:t>
-      </w:r>
-      <w:r>
-        <w:rPr>
-          <w:b/>
-          <w:bCs/>
-          <w:sz w:val="32"/>
-          <w:szCs w:val="32"/>
-          <w:rtl/>
-          <w:lang w:bidi="ar-EG"/>
-        </w:rPr>
-        <w:t xml:space="preserve"> من </w:t>
-      </w:r>
-      <w:r>
-        <w:rPr>
-          <w:b/>
-          <w:bCs/>
-          <w:sz w:val="32"/>
-          <w:szCs w:val="32"/>
-          <w:highlight w:val="red"/>
-          <w:rtl/>
-          <w:lang w:bidi="ar-EG"/>
-        </w:rPr>
-        <w:t>كاوتش وبطاريات</w:t>
-      </w:r>
-      <w:r>
-        <w:rPr>
-          <w:b/>
-          <w:bCs/>
-          <w:sz w:val="32"/>
-          <w:szCs w:val="32"/>
-          <w:rtl/>
-          <w:lang w:bidi="ar-EG"/>
-        </w:rPr>
-        <w:t xml:space="preserve"> طبقا للفاتورة الصادرة من الشركة وأمر التوريد الصادر من </w:t>
-      </w:r>
-      <w:r>
-        <w:rPr>
-          <w:b/>
-          <w:bCs/>
-          <w:sz w:val="32"/>
-          <w:szCs w:val="32"/>
-          <w:highlight w:val="red"/>
-          <w:rtl/>
-          <w:lang w:bidi="ar-EG"/>
-        </w:rPr>
-        <w:t>الجامعه</w:t>
-      </w:r>
-      <w:r>
-        <w:rPr>
-          <w:b/>
-          <w:bCs/>
-          <w:sz w:val="32"/>
-          <w:szCs w:val="32"/>
-          <w:rtl/>
-          <w:lang w:bidi="ar-EG"/>
-        </w:rPr>
-        <w:t xml:space="preserve"> طرفكم  والخاصة </w:t>
-      </w:r>
-      <w:r>
-        <w:rPr>
-          <w:b/>
-          <w:bCs/>
-          <w:sz w:val="32"/>
-          <w:szCs w:val="32"/>
-          <w:highlight w:val="red"/>
-          <w:rtl/>
-          <w:lang w:bidi="ar-EG"/>
-        </w:rPr>
-        <w:t>بالمناقصة المحدودة</w:t>
-      </w:r>
-      <w:r>
-        <w:rPr>
-          <w:b/>
-          <w:bCs/>
-          <w:sz w:val="32"/>
-          <w:szCs w:val="32"/>
-          <w:rtl/>
-          <w:lang w:bidi="ar-EG"/>
-        </w:rPr>
-        <w:t xml:space="preserve"> لزوم</w:t>
-      </w:r>
-      <w:r>
-        <w:rPr>
-          <w:b/>
-          <w:bCs/>
-          <w:sz w:val="32"/>
-          <w:szCs w:val="32"/>
-          <w:highlight w:val="red"/>
-          <w:rtl/>
-          <w:lang w:bidi="ar-EG"/>
-        </w:rPr>
-        <w:t xml:space="preserve"> توريد كاوتش وبطاريات للسيارات للجامعه</w:t>
-      </w:r>
-      <w:r>
-        <w:rPr>
-          <w:b/>
-          <w:bCs/>
-          <w:sz w:val="32"/>
-          <w:szCs w:val="32"/>
-          <w:rtl/>
-          <w:lang w:bidi="ar-EG"/>
-        </w:rPr>
-        <w:t xml:space="preserve"> طرفكم للعام المالى  </w:t>
-      </w:r>
-      <w:r>
-        <w:rPr>
-          <w:b/>
-          <w:bCs/>
-          <w:sz w:val="32"/>
-          <w:szCs w:val="32"/>
-          <w:highlight w:val="red"/>
-          <w:rtl/>
-          <w:lang w:bidi="ar-EG"/>
-        </w:rPr>
-        <w:t>2024 / 2025</w:t>
-      </w:r>
-      <w:r>
-        <w:rPr>
-          <w:b/>
-          <w:bCs/>
-          <w:sz w:val="32"/>
-          <w:szCs w:val="32"/>
-          <w:rtl/>
-          <w:lang w:bidi="ar-EG"/>
-        </w:rPr>
-        <w:t xml:space="preserve"> والمحدد لها جلسة ( </w:t>
-      </w:r>
-      <w:r>
-        <w:rPr>
-          <w:b/>
-          <w:bCs/>
-          <w:sz w:val="32"/>
-          <w:szCs w:val="32"/>
-          <w:highlight w:val="red"/>
-          <w:rtl/>
-          <w:lang w:bidi="ar-EG"/>
-        </w:rPr>
-        <w:t>14/ 1 /2024</w:t>
-      </w:r>
-      <w:r>
-        <w:rPr>
-          <w:b/>
-          <w:bCs/>
-          <w:sz w:val="32"/>
-          <w:szCs w:val="32"/>
-          <w:rtl/>
-          <w:lang w:bidi="ar-EG"/>
-        </w:rPr>
-        <w:t xml:space="preserve"> ) لفتح المظروف الفنى . وفيما يلى الأصناف </w:t>
-      </w:r>
-      <w:r>
-        <w:rPr>
-          <w:b/>
-          <w:bCs/>
-          <w:sz w:val="32"/>
-          <w:szCs w:val="32"/>
-          <w:highlight w:val="red"/>
-          <w:rtl/>
-          <w:lang w:bidi="ar-EG"/>
-        </w:rPr>
-        <w:t>الموردة</w:t>
-      </w:r>
-      <w:r>
-        <w:rPr>
-          <w:b/>
-          <w:bCs/>
-          <w:sz w:val="32"/>
-          <w:szCs w:val="32"/>
-          <w:rtl/>
-          <w:lang w:bidi="ar-EG"/>
-        </w:rPr>
-        <w:t xml:space="preserve"> :</w:t>
-      </w:r>
-    </w:p>
     <w:p>
       <w:pPr>
         <w:pStyle w:val="ListParagraph"/>
@@ -2222,9 +14,8 @@
         <w:rPr>
           <w:b/>
           <w:bCs/>
-          <w:sz w:val="44"/>
-          <w:szCs w:val="44"/>
-          <w:u w:val="single"/>
+          <w:sz w:val="32"/>
+          <w:szCs w:val="32"/>
           <w:rtl/>
           <w:lang w:bidi="ar-EG"/>
         </w:rPr>
@@ -2243,26 +34,15 @@
       </w:r>
       <w:r>
         <w:rPr>
-          <w:rFonts w:hint="cs"/>
-          <w:b/>
-          <w:bCs/>
-          <w:sz w:val="40"/>
-          <w:szCs w:val="40"/>
-          <w:rtl/>
-          <w:lang w:bidi="ar-EG"/>
-        </w:rPr>
-        <w:t>:</w:t>
-      </w:r>
-      <w:r>
-        <w:rPr>
-          <w:b/>
-          <w:bCs/>
-          <w:sz w:val="40"/>
-          <w:szCs w:val="40"/>
-          <w:rtl/>
-          <w:lang w:bidi="ar-EG"/>
-        </w:rPr>
-        <w:t xml:space="preserve">              </w:t>
+          <w:b/>
+          <w:bCs/>
+          <w:sz w:val="36"/>
+          <w:szCs w:val="36"/>
+          <w:u w:val="none"/>
+          <w:rtl/>
+          <w:lang w:bidi="ar-EG"/>
+        </w:rPr>
+        <w:t>: </w:t>
       </w:r>
       <w:r>
         <w:rPr>
@@ -2270,34 +50,11 @@
           <w:bCs/>
           <w:sz w:val="32"/>
           <w:szCs w:val="32"/>
-          <w:highlight w:val="red"/>
-          <w:rtl/>
-          <w:lang w:bidi="ar-EG"/>
-        </w:rPr>
-        <w:t>سنة</w:t>
-      </w:r>
-      <w:r>
-        <w:rPr>
-          <w:b/>
-          <w:bCs/>
-          <w:sz w:val="32"/>
-          <w:szCs w:val="32"/>
-          <w:rtl/>
-          <w:lang w:bidi="ar-EG"/>
-        </w:rPr>
-        <w:t xml:space="preserve"> ضد عيوب الصناعه في </w:t>
-      </w:r>
-      <w:r>
-        <w:rPr>
-          <w:b/>
-          <w:bCs/>
-          <w:sz w:val="32"/>
-          <w:szCs w:val="32"/>
-          <w:highlight w:val="red"/>
-          <w:rtl/>
-          <w:lang w:bidi="ar-EG"/>
-        </w:rPr>
-        <w:t>مداس الكاوتش  فقط</w:t>
+          <w:u w:val="none"/>
+          <w:rtl/>
+          <w:lang w:bidi="ar-EG"/>
+        </w:rPr>
+        <w:t xml:space="preserve">سنة ضد عيوب الصناعه في مداس الكاوتش  فقط</w:t>
       </w:r>
     </w:p>
     <w:p>

</xml_diff>

<commit_message>
fix(word-viewer-warranty-archive): authentic word preview, complete warranty certificate template, auto-load preview modal, and add-to-archive widget on letter cards
</commit_message>
<xml_diff>
--- a/frontend/public/templates/warranty_certificate_template.docx
+++ b/frontend/public/templates/warranty_certificate_template.docx
@@ -2,6 +2,467 @@
 <file path=word/document.xml><?xml version="1.0" encoding="utf-8"?>
 <w:document xmlns:wpc="http://schemas.microsoft.com/office/word/2010/wordprocessingCanvas" xmlns:cx="http://schemas.microsoft.com/office/drawing/2014/chartex" xmlns:cx1="http://schemas.microsoft.com/office/drawing/2015/9/8/chartex" xmlns:cx2="http://schemas.microsoft.com/office/drawing/2015/10/21/chartex" xmlns:cx3="http://schemas.microsoft.com/office/drawing/2016/5/9/chartex" xmlns:cx4="http://schemas.microsoft.com/office/drawing/2016/5/10/chartex" xmlns:cx5="http://schemas.microsoft.com/office/drawing/2016/5/11/chartex" xmlns:cx6="http://schemas.microsoft.com/office/drawing/2016/5/12/chartex" xmlns:cx7="http://schemas.microsoft.com/office/drawing/2016/5/13/chartex" xmlns:cx8="http://schemas.microsoft.com/office/drawing/2016/5/14/chartex" xmlns:mc="http://schemas.openxmlformats.org/markup-compatibility/2006" xmlns:aink="http://schemas.microsoft.com/office/drawing/2016/ink" xmlns:am3d="http://schemas.microsoft.com/office/drawing/2017/model3d" xmlns:o="urn:schemas-microsoft-com:office:office" xmlns:oel="http://schemas.microsoft.com/office/2019/extlst" xmlns:r="http://schemas.openxmlformats.org/officeDocument/2006/relationships" xmlns:m="http://schemas.openxmlformats.org/officeDocument/2006/math" xmlns:v="urn:schemas-microsoft-com:vml" xmlns:wp14="http://schemas.microsoft.com/office/word/2010/wordprocessingDrawing" xmlns:wp="http://schemas.openxmlformats.org/drawingml/2006/wordprocessingDrawing" xmlns:w10="urn:schemas-microsoft-com:office:word" xmlns:w="http://schemas.openxmlformats.org/wordprocessingml/2006/main" xmlns:w14="http://schemas.microsoft.com/office/word/2010/wordml" xmlns:w15="http://schemas.microsoft.com/office/word/2012/wordml" xmlns:w16cex="http://schemas.microsoft.com/office/word/2018/wordml/cex" xmlns:w16cid="http://schemas.microsoft.com/office/word/2016/wordml/cid" xmlns:w16="http://schemas.microsoft.com/office/word/2018/wordml" xmlns:w16du="http://schemas.microsoft.com/office/word/2023/wordml/word16du" xmlns:w16sdtdh="http://schemas.microsoft.com/office/word/2020/wordml/sdtdatahash" xmlns:w16sdtfl="http://schemas.microsoft.com/office/word/2024/wordml/sdtformatlock" xmlns:w16se="http://schemas.microsoft.com/office/word/2015/wordml/symex" xmlns:wpg="http://schemas.microsoft.com/office/word/2010/wordprocessingGroup" xmlns:wpi="http://schemas.microsoft.com/office/word/2010/wordprocessingInk" xmlns:wne="http://schemas.microsoft.com/office/word/2006/wordml" xmlns:wps="http://schemas.microsoft.com/office/word/2010/wordprocessingShape" mc:Ignorable="w14 w15 w16se w16cid w16 w16cex w16sdtdh w16sdtfl w16du wp14">
   <w:body>
+    <w:p>
+      <w:pPr>
+        <w:spacing w:after="0" w:line="240" w:lineRule="auto"/>
+        <w:ind w:left="-567"/>
+        <w:rPr>
+          <w:b/>
+          <w:bCs/>
+          <w:sz w:val="36"/>
+          <w:szCs w:val="36"/>
+          <w:rtl/>
+          <w:lang w:bidi="ar-EG"/>
+        </w:rPr>
+      </w:pPr>
+      <w:r>
+        <w:rPr>
+          <w:b/>
+          <w:bCs/>
+          <w:sz w:val="36"/>
+          <w:szCs w:val="36"/>
+          <w:rtl/>
+          <w:lang w:bidi="ar-EG"/>
+        </w:rPr>
+        <w:t>السيد ال</w:t>
+      </w:r>
+      <w:r>
+        <w:rPr>
+          <w:b/>
+          <w:bCs/>
+          <w:sz w:val="36"/>
+          <w:szCs w:val="36"/>
+          <w:highlight w:val="red"/>
+          <w:rtl/>
+          <w:lang w:bidi="ar-EG"/>
+        </w:rPr>
+        <w:t>أستاذ</w:t>
+      </w:r>
+      <w:r>
+        <w:rPr>
+          <w:b/>
+          <w:bCs/>
+          <w:sz w:val="36"/>
+          <w:szCs w:val="36"/>
+          <w:rtl/>
+          <w:lang w:bidi="ar-EG"/>
+        </w:rPr>
+        <w:t> / </w:t>
+      </w:r>
+      <w:r>
+        <w:rPr>
+          <w:b/>
+          <w:bCs/>
+          <w:sz w:val="32"/>
+          <w:szCs w:val="32"/>
+          <w:highlight w:val="red"/>
+          <w:rtl/>
+          <w:lang w:bidi="ar-EG"/>
+        </w:rPr>
+        <w:t>مدير الادارة العامة للمشتريات والمخازن بجامعة دمنهور</w:t>
+      </w:r>
+    </w:p>
+    <w:p>
+      <w:pPr>
+        <w:tabs>
+          <w:tab w:val="left" w:pos="5387"/>
+        </w:tabs>
+        <w:spacing w:after="0"/>
+        <w:ind w:left="-567"/>
+        <w:jc w:val="both"/>
+        <w:rPr>
+          <w:b/>
+          <w:bCs/>
+          <w:sz w:val="36"/>
+          <w:szCs w:val="36"/>
+          <w:rtl/>
+          <w:lang w:bidi="ar-EG"/>
+        </w:rPr>
+      </w:pPr>
+      <w:r>
+        <w:rPr>
+          <w:b/>
+          <w:bCs/>
+          <w:sz w:val="36"/>
+          <w:szCs w:val="36"/>
+          <w:u w:val="single"/>
+          <w:rtl/>
+          <w:lang w:bidi="ar-EG"/>
+        </w:rPr>
+        <w:t>الموضوع بخصوص</w:t>
+      </w:r>
+      <w:r>
+        <w:rPr>
+          <w:b/>
+          <w:bCs/>
+          <w:sz w:val="32"/>
+          <w:szCs w:val="32"/>
+          <w:rtl/>
+          <w:lang w:bidi="ar-EG"/>
+        </w:rPr>
+        <w:t> : شهادة ضمان </w:t>
+      </w:r>
+      <w:r>
+        <w:rPr>
+          <w:b/>
+          <w:bCs/>
+          <w:sz w:val="32"/>
+          <w:szCs w:val="32"/>
+          <w:highlight w:val="red"/>
+          <w:rtl/>
+          <w:lang w:bidi="ar-EG"/>
+        </w:rPr>
+        <w:t>للأصناف</w:t>
+      </w:r>
+      <w:r>
+        <w:rPr>
+          <w:b/>
+          <w:bCs/>
+          <w:sz w:val="32"/>
+          <w:szCs w:val="32"/>
+          <w:rtl/>
+          <w:lang w:bidi="ar-EG"/>
+        </w:rPr>
+        <w:t> لعملية </w:t>
+      </w:r>
+      <w:r>
+        <w:rPr>
+          <w:b/>
+          <w:bCs/>
+          <w:sz w:val="32"/>
+          <w:szCs w:val="32"/>
+          <w:highlight w:val="red"/>
+          <w:rtl/>
+          <w:lang w:bidi="ar-EG"/>
+        </w:rPr>
+        <w:t>اسم العملية المسجله </w:t>
+      </w:r>
+      <w:r>
+        <w:rPr>
+          <w:b/>
+          <w:bCs/>
+          <w:sz w:val="32"/>
+          <w:szCs w:val="32"/>
+          <w:rtl/>
+          <w:lang w:bidi="ar-EG"/>
+        </w:rPr>
+        <w:t>رقم </w:t>
+      </w:r>
+      <w:r>
+        <w:rPr>
+          <w:b/>
+          <w:bCs/>
+          <w:sz w:val="32"/>
+          <w:szCs w:val="32"/>
+          <w:highlight w:val="red"/>
+          <w:rtl/>
+          <w:lang w:bidi="ar-EG"/>
+        </w:rPr>
+        <w:t>365</w:t>
+      </w:r>
+    </w:p>
+    <w:p>
+      <w:pPr>
+        <w:spacing w:after="0" w:line="240" w:lineRule="auto"/>
+        <w:rPr>
+          <w:rFonts w:ascii="Arial" w:hAnsi="Arial"/>
+          <w:b/>
+          <w:bCs/>
+          <w:sz w:val="36"/>
+          <w:szCs w:val="36"/>
+          <w:lang w:bidi="ar-EG"/>
+        </w:rPr>
+      </w:pPr>
+      <w:r>
+        <w:rPr>
+          <w:rFonts w:ascii="Arial" w:hAnsi="Arial"/>
+          <w:b/>
+          <w:bCs/>
+          <w:sz w:val="36"/>
+          <w:szCs w:val="36"/>
+          <w:rtl/>
+          <w:lang w:bidi="ar-EG"/>
+        </w:rPr>
+        <w:t xml:space="preserve">                                    تحيه طيبه وبعد ،،،</w:t>
+      </w:r>
+    </w:p>
+    <w:p>
+      <w:pPr>
+        <w:spacing w:after="120" w:line="240" w:lineRule="auto"/>
+        <w:ind w:left="-567" w:hanging="283"/>
+        <w:jc w:val="both"/>
+        <w:rPr>
+          <w:b/>
+          <w:bCs/>
+          <w:sz w:val="32"/>
+          <w:szCs w:val="32"/>
+          <w:rtl/>
+          <w:lang w:bidi="ar-EG"/>
+        </w:rPr>
+      </w:pPr>
+      <w:r>
+        <w:rPr>
+          <w:b/>
+          <w:bCs/>
+          <w:sz w:val="32"/>
+          <w:szCs w:val="32"/>
+          <w:rtl/>
+          <w:lang w:bidi="ar-EG"/>
+        </w:rPr>
+        <w:t>تتشرف جولدن سرفيس بأن تضمن وتتعهد بأن كافة الأصناف والمهمات المذكورة أدناه والموردة لسيادتكم للعملية المذكورة أعلاه طرفكم للعام المالى 2024 / 2025 والمحدد لها جلسة 14/ 1 /2024 لفتح المظاريف الفنية، مطابقة للمواصفات الفنية المعتمدة. وفيما يلى بيان الأصناف وفترات الضمان المقررة :</w:t>
+      </w:r>
+    </w:p>
+    <w:tbl>
+      <w:tblPr>
+        <w:bidiVisual/>
+        <w:tblW w:w="10147" w:type="dxa"/>
+        <w:jc w:val="center"/>
+        <w:tblBorders>
+          <w:top w:val="thinThickSmallGap" w:sz="24" w:space="0" w:color="auto"/>
+          <w:left w:val="thinThickSmallGap" w:sz="24" w:space="0" w:color="auto"/>
+          <w:bottom w:val="thinThickSmallGap" w:sz="24" w:space="0" w:color="auto"/>
+          <w:right w:val="thinThickSmallGap" w:sz="24" w:space="0" w:color="auto"/>
+          <w:insideH w:val="thinThickSmallGap" w:sz="18" w:space="0" w:color="auto"/>
+          <w:insideV w:val="thinThickSmallGap" w:sz="18" w:space="0" w:color="auto"/>
+        </w:tblBorders>
+        <w:tblLook w:val="0000" w:firstRow="0" w:lastRow="0" w:firstColumn="0" w:lastColumn="0" w:noHBand="0" w:noVBand="0"/>
+      </w:tblPr>
+      <w:tblGrid>
+        <w:gridCol w:w="561"/>
+        <w:gridCol w:w="3593"/>
+        <w:gridCol w:w="977"/>
+        <w:gridCol w:w="977"/>
+        <w:gridCol w:w="2798"/>
+        <w:gridCol w:w="1241"/>
+      </w:tblGrid>
+      <w:tr>
+        <w:trPr>
+          <w:trHeight w:val="330"/>
+          <w:jc w:val="center"/>
+        </w:trPr>
+        <w:tc>
+          <w:tcPr>
+            <w:tcW w:w="561" w:type="dxa"/>
+            <w:tcBorders>
+              <w:top w:val="thinThickSmallGap" w:sz="24" w:space="0" w:color="auto"/>
+              <w:left w:val="thinThickSmallGap" w:sz="24" w:space="0" w:color="auto"/>
+              <w:bottom w:val="thinThickSmallGap" w:sz="24" w:space="0" w:color="auto"/>
+              <w:right w:val="thinThickSmallGap" w:sz="24" w:space="0" w:color="auto"/>
+            </w:tcBorders>
+          </w:tcPr>
+          <w:p>
+            <w:pPr>
+              <w:spacing w:after="0" w:line="240" w:lineRule="auto"/>
+              <w:jc w:val="center"/>
+              <w:rPr>
+                <w:b/>
+                <w:bCs/>
+                <w:sz w:val="30"/>
+                <w:szCs w:val="30"/>
+                <w:rtl/>
+                <w:lang w:bidi="ar-EG"/>
+              </w:rPr>
+            </w:pPr>
+            <w:r>
+              <w:rPr>
+                <w:b/>
+                <w:bCs/>
+                <w:sz w:val="30"/>
+                <w:szCs w:val="30"/>
+                <w:rtl/>
+                <w:lang w:bidi="ar-EG"/>
+              </w:rPr>
+              <w:t>م</w:t>
+            </w:r>
+          </w:p>
+        </w:tc>
+        <w:tc>
+          <w:tcPr>
+            <w:tcW w:w="3593" w:type="dxa"/>
+            <w:tcBorders>
+              <w:top w:val="thinThickSmallGap" w:sz="24" w:space="0" w:color="auto"/>
+              <w:left w:val="thinThickSmallGap" w:sz="24" w:space="0" w:color="auto"/>
+              <w:bottom w:val="thinThickSmallGap" w:sz="24" w:space="0" w:color="auto"/>
+              <w:right w:val="thinThickSmallGap" w:sz="24" w:space="0" w:color="auto"/>
+            </w:tcBorders>
+          </w:tcPr>
+          <w:p>
+            <w:pPr>
+              <w:spacing w:after="0" w:line="240" w:lineRule="auto"/>
+              <w:jc w:val="center"/>
+              <w:rPr>
+                <w:b/>
+                <w:bCs/>
+                <w:sz w:val="30"/>
+                <w:szCs w:val="30"/>
+                <w:rtl/>
+                <w:lang w:bidi="ar-EG"/>
+              </w:rPr>
+            </w:pPr>
+            <w:r>
+              <w:rPr>
+                <w:b/>
+                <w:bCs/>
+                <w:sz w:val="30"/>
+                <w:szCs w:val="30"/>
+                <w:rtl/>
+                <w:lang w:bidi="ar-EG"/>
+              </w:rPr>
+              <w:t>إســــم الصــــــنف والمواصفات</w:t>
+            </w:r>
+          </w:p>
+        </w:tc>
+        <w:tc>
+          <w:tcPr>
+            <w:tcW w:w="977" w:type="dxa"/>
+            <w:tcBorders>
+              <w:top w:val="thinThickSmallGap" w:sz="24" w:space="0" w:color="auto"/>
+              <w:left w:val="thinThickSmallGap" w:sz="24" w:space="0" w:color="auto"/>
+              <w:bottom w:val="thinThickSmallGap" w:sz="24" w:space="0" w:color="auto"/>
+              <w:right w:val="thinThickSmallGap" w:sz="24" w:space="0" w:color="auto"/>
+            </w:tcBorders>
+          </w:tcPr>
+          <w:p>
+            <w:pPr>
+              <w:spacing w:after="0" w:line="240" w:lineRule="auto"/>
+              <w:jc w:val="center"/>
+              <w:rPr>
+                <w:b/>
+                <w:bCs/>
+                <w:sz w:val="30"/>
+                <w:szCs w:val="30"/>
+                <w:rtl/>
+                <w:lang w:bidi="ar-EG"/>
+              </w:rPr>
+            </w:pPr>
+            <w:r>
+              <w:rPr>
+                <w:b/>
+                <w:bCs/>
+                <w:sz w:val="30"/>
+                <w:szCs w:val="30"/>
+                <w:rtl/>
+                <w:lang w:bidi="ar-EG"/>
+              </w:rPr>
+              <w:t>الوحدة</w:t>
+            </w:r>
+          </w:p>
+        </w:tc>
+        <w:tc>
+          <w:tcPr>
+            <w:tcW w:w="977" w:type="dxa"/>
+            <w:tcBorders>
+              <w:top w:val="thinThickSmallGap" w:sz="24" w:space="0" w:color="auto"/>
+              <w:left w:val="thinThickSmallGap" w:sz="24" w:space="0" w:color="auto"/>
+              <w:bottom w:val="thinThickSmallGap" w:sz="24" w:space="0" w:color="auto"/>
+              <w:right w:val="thinThickSmallGap" w:sz="24" w:space="0" w:color="auto"/>
+            </w:tcBorders>
+          </w:tcPr>
+          <w:p>
+            <w:pPr>
+              <w:spacing w:after="0" w:line="240" w:lineRule="auto"/>
+              <w:jc w:val="center"/>
+              <w:rPr>
+                <w:b/>
+                <w:bCs/>
+                <w:sz w:val="30"/>
+                <w:szCs w:val="30"/>
+                <w:rtl/>
+                <w:lang w:bidi="ar-EG"/>
+              </w:rPr>
+            </w:pPr>
+            <w:r>
+              <w:rPr>
+                <w:b/>
+                <w:bCs/>
+                <w:sz w:val="30"/>
+                <w:szCs w:val="30"/>
+                <w:rtl/>
+                <w:lang w:bidi="ar-EG"/>
+              </w:rPr>
+              <w:t>الكميه</w:t>
+            </w:r>
+          </w:p>
+        </w:tc>
+        <w:tc>
+          <w:tcPr>
+            <w:tcW w:w="2798" w:type="dxa"/>
+            <w:tcBorders>
+              <w:top w:val="thinThickSmallGap" w:sz="24" w:space="0" w:color="auto"/>
+              <w:left w:val="thinThickSmallGap" w:sz="24" w:space="0" w:color="auto"/>
+              <w:bottom w:val="thinThickSmallGap" w:sz="24" w:space="0" w:color="auto"/>
+              <w:right w:val="thinThickSmallGap" w:sz="24" w:space="0" w:color="auto"/>
+            </w:tcBorders>
+          </w:tcPr>
+          <w:p>
+            <w:pPr>
+              <w:spacing w:after="0" w:line="240" w:lineRule="auto"/>
+              <w:jc w:val="center"/>
+              <w:rPr>
+                <w:b/>
+                <w:bCs/>
+                <w:sz w:val="30"/>
+                <w:szCs w:val="30"/>
+                <w:rtl/>
+                <w:lang w:bidi="ar-EG"/>
+              </w:rPr>
+            </w:pPr>
+            <w:r>
+              <w:rPr>
+                <w:b/>
+                <w:bCs/>
+                <w:sz w:val="30"/>
+                <w:szCs w:val="30"/>
+                <w:rtl/>
+                <w:lang w:bidi="ar-EG"/>
+              </w:rPr>
+              <w:t>بيان وتغطية الضمان</w:t>
+            </w:r>
+          </w:p>
+        </w:tc>
+        <w:tc>
+          <w:tcPr>
+            <w:tcW w:w="1241" w:type="dxa"/>
+            <w:tcBorders>
+              <w:top w:val="thinThickSmallGap" w:sz="24" w:space="0" w:color="auto"/>
+              <w:left w:val="thinThickSmallGap" w:sz="24" w:space="0" w:color="auto"/>
+              <w:bottom w:val="thinThickSmallGap" w:sz="24" w:space="0" w:color="auto"/>
+              <w:right w:val="thinThickSmallGap" w:sz="24" w:space="0" w:color="auto"/>
+            </w:tcBorders>
+          </w:tcPr>
+          <w:p>
+            <w:pPr>
+              <w:spacing w:after="0" w:line="240" w:lineRule="auto"/>
+              <w:jc w:val="center"/>
+              <w:rPr>
+                <w:b/>
+                <w:bCs/>
+                <w:sz w:val="30"/>
+                <w:szCs w:val="30"/>
+                <w:rtl/>
+                <w:lang w:bidi="ar-EG"/>
+              </w:rPr>
+            </w:pPr>
+            <w:r>
+              <w:rPr>
+                <w:b/>
+                <w:bCs/>
+                <w:sz w:val="30"/>
+                <w:szCs w:val="30"/>
+                <w:rtl/>
+                <w:lang w:bidi="ar-EG"/>
+              </w:rPr>
+              <w:t>ملاحظات الضمان</w:t>
+            </w:r>
+          </w:p>
+        </w:tc>
+      </w:tr>
+    </w:tbl>
+    <w:p>
+      <w:pPr>
+        <w:spacing w:before="120" w:after="120" w:line="240" w:lineRule="auto"/>
+      </w:pPr>
+    </w:p>
     <w:p>
       <w:pPr>
         <w:pStyle w:val="ListParagraph"/>

</xml_diff>

<commit_message>
fix(warranty): adopt official شهادة ضمان سيستم template with in-place field replacements and preserve full document header and items table
</commit_message>
<xml_diff>
--- a/frontend/public/templates/warranty_certificate_template.docx
+++ b/frontend/public/templates/warranty_certificate_template.docx
@@ -4,57 +4,161 @@
   <w:body>
     <w:p>
       <w:pPr>
-        <w:spacing w:after="0" w:line="240" w:lineRule="auto"/>
-        <w:ind w:left="-567"/>
-        <w:rPr>
-          <w:b/>
-          <w:bCs/>
-          <w:sz w:val="36"/>
-          <w:szCs w:val="36"/>
-          <w:rtl/>
+        <w:spacing w:after="0"/>
+        <w:ind w:right="227"/>
+        <w:rPr>
+          <w:rFonts w:asciiTheme="minorHAnsi" w:hAnsiTheme="minorHAnsi"/>
+          <w:b/>
+          <w:bCs/>
+          <w:u w:val="single"/>
           <w:lang w:bidi="ar-EG"/>
         </w:rPr>
       </w:pPr>
       <w:r>
         <w:rPr>
-          <w:b/>
-          <w:bCs/>
-          <w:sz w:val="36"/>
-          <w:szCs w:val="36"/>
-          <w:rtl/>
-          <w:lang w:bidi="ar-EG"/>
-        </w:rPr>
-        <w:t>السيد ال</w:t>
-      </w:r>
-      <w:r>
-        <w:rPr>
-          <w:b/>
-          <w:bCs/>
-          <w:sz w:val="36"/>
-          <w:szCs w:val="36"/>
+          <w:rFonts w:asciiTheme="minorHAnsi" w:hAnsiTheme="minorHAnsi" w:cstheme="minorHAnsi" w:hint="cs"/>
+          <w:b/>
+          <w:bCs/>
+          <w:rtl/>
+          <w:lang w:bidi="ar-EG"/>
+        </w:rPr>
+        <w:t xml:space="preserve">                                                                  </w:t>
+      </w:r>
+      <w:r>
+        <w:rPr>
+          <w:rFonts w:cs="PT Bold Heading" w:hint="cs"/>
+          <w:b/>
+          <w:bCs/>
+          <w:sz w:val="44"/>
+          <w:szCs w:val="46"/>
+          <w:u w:val="single"/>
+          <w:rtl/>
+          <w:lang w:bidi="ar-EG"/>
+        </w:rPr>
+        <w:t>شهادة ضمان</w:t>
+      </w:r>
+      <w:r>
+        <w:rPr>
+          <w:rFonts w:asciiTheme="minorHAnsi" w:hAnsiTheme="minorHAnsi" w:cstheme="minorHAnsi" w:hint="cs"/>
+          <w:b/>
+          <w:bCs/>
+          <w:sz w:val="20"/>
+          <w:szCs w:val="20"/>
+          <w:rtl/>
+          <w:lang w:bidi="ar-EG"/>
+        </w:rPr>
+        <w:t xml:space="preserve">              </w:t>
+      </w:r>
+      <w:r>
+        <w:rPr>
+          <w:rFonts w:asciiTheme="majorHAnsi" w:hAnsiTheme="majorHAnsi" w:cstheme="minorHAnsi" w:hint="cs"/>
+          <w:b/>
+          <w:bCs/>
+          <w:sz w:val="28"/>
+          <w:szCs w:val="28"/>
+          <w:rtl/>
+          <w:lang w:bidi="ar-EG"/>
+        </w:rPr>
+        <w:t xml:space="preserve">          </w:t>
+      </w:r>
+      <w:r>
+        <w:rPr>
+          <w:rFonts w:asciiTheme="majorHAnsi" w:hAnsiTheme="majorHAnsi" w:cstheme="minorHAnsi" w:hint="cs"/>
+          <w:b/>
+          <w:bCs/>
+          <w:sz w:val="28"/>
+          <w:szCs w:val="28"/>
+          <w:rtl/>
+          <w:lang w:bidi="ar-EG"/>
+        </w:rPr>
+        <w:t xml:space="preserve">          </w:t>
+      </w:r>
+      <w:r>
+        <w:rPr>
+          <w:rFonts w:asciiTheme="majorHAnsi" w:hAnsiTheme="majorHAnsi" w:cstheme="minorHAnsi" w:hint="cs"/>
+          <w:b/>
+          <w:bCs/>
+          <w:sz w:val="28"/>
+          <w:szCs w:val="28"/>
+          <w:rtl/>
+          <w:lang w:bidi="ar-EG"/>
+        </w:rPr>
+        <w:t xml:space="preserve"> </w:t>
+      </w:r>
+      <w:r>
+        <w:rPr>
+          <w:rFonts w:asciiTheme="majorHAnsi" w:hAnsiTheme="majorHAnsi" w:cstheme="minorHAnsi" w:hint="cs"/>
+          <w:b/>
+          <w:bCs/>
+          <w:sz w:val="28"/>
+          <w:szCs w:val="28"/>
+          <w:rtl/>
+          <w:lang w:bidi="ar-EG"/>
+        </w:rPr>
+        <w:t>الباركود</w:t>
+      </w:r>
+    </w:p>
+    <w:p>
+      <w:pPr>
+        <w:tabs>
+          <w:tab w:val="left" w:pos="5387"/>
+        </w:tabs>
+        <w:spacing w:after="0"/>
+        <w:ind w:left="-794"/>
+        <w:rPr>
+          <w:rFonts w:ascii="Arabic Typesetting" w:hAnsi="Arabic Typesetting" w:cs="Arabic Typesetting"/>
+          <w:b/>
+          <w:bCs/>
+          <w:sz w:val="52"/>
+          <w:szCs w:val="52"/>
+          <w:rtl/>
+          <w:lang w:bidi="ar-EG"/>
+        </w:rPr>
+      </w:pPr>
+      <w:r>
+        <w:rPr>
+          <w:rFonts w:ascii="Arabic Typesetting" w:hAnsi="Arabic Typesetting" w:cs="Arabic Typesetting"/>
+          <w:b/>
+          <w:bCs/>
+          <w:sz w:val="56"/>
+          <w:szCs w:val="56"/>
+          <w:rtl/>
+          <w:lang w:bidi="ar-EG"/>
+        </w:rPr>
+        <w:t xml:space="preserve">      السيد </w:t>
+      </w:r>
+      <w:r>
+        <w:rPr>
+          <w:rFonts w:ascii="Arabic Typesetting" w:hAnsi="Arabic Typesetting" w:cs="Arabic Typesetting"/>
+          <w:b/>
+          <w:bCs/>
+          <w:sz w:val="56"/>
+          <w:szCs w:val="56"/>
           <w:highlight w:val="red"/>
           <w:rtl/>
           <w:lang w:bidi="ar-EG"/>
         </w:rPr>
-        <w:t>أستاذ</w:t>
-      </w:r>
-      <w:r>
-        <w:rPr>
-          <w:b/>
-          <w:bCs/>
-          <w:sz w:val="36"/>
-          <w:szCs w:val="36"/>
-          <w:rtl/>
-          <w:lang w:bidi="ar-EG"/>
-        </w:rPr>
-        <w:t> / </w:t>
-      </w:r>
-      <w:r>
-        <w:rPr>
-          <w:b/>
-          <w:bCs/>
-          <w:sz w:val="32"/>
-          <w:szCs w:val="32"/>
+        <w:t>الأستاذ</w:t>
+      </w:r>
+      <w:r>
+        <w:rPr>
+          <w:rFonts w:ascii="Arabic Typesetting" w:hAnsi="Arabic Typesetting" w:cs="Arabic Typesetting"/>
+          <w:b/>
+          <w:bCs/>
+          <w:sz w:val="56"/>
+          <w:szCs w:val="56"/>
+          <w:rtl/>
+          <w:lang w:bidi="ar-EG"/>
+        </w:rPr>
+        <w:t xml:space="preserve"> / </w:t>
+      </w:r>
+      <w:r>
+        <w:rPr>
+          <w:rFonts w:ascii="Arabic Typesetting" w:hAnsi="Arabic Typesetting" w:cs="Arabic Typesetting"/>
+          <w:b/>
+          <w:bCs/>
+          <w:sz w:val="56"/>
+          <w:szCs w:val="56"/>
           <w:highlight w:val="red"/>
           <w:rtl/>
           <w:lang w:bidi="ar-EG"/>
@@ -69,7 +173,7 @@
         </w:tabs>
         <w:spacing w:after="0"/>
         <w:ind w:left="-567"/>
-        <w:jc w:val="both"/>
+        <w:jc w:val="highKashida"/>
         <w:rPr>
           <w:b/>
           <w:bCs/>
@@ -95,12 +199,34 @@
         <w:rPr>
           <w:b/>
           <w:bCs/>
+          <w:sz w:val="36"/>
+          <w:szCs w:val="36"/>
+          <w:rtl/>
+          <w:lang w:bidi="ar-EG"/>
+        </w:rPr>
+        <w:t xml:space="preserve"> </w:t>
+      </w:r>
+      <w:r>
+        <w:rPr>
+          <w:b/>
+          <w:bCs/>
           <w:sz w:val="32"/>
           <w:szCs w:val="32"/>
           <w:rtl/>
           <w:lang w:bidi="ar-EG"/>
         </w:rPr>
-        <w:t> : شهادة ضمان </w:t>
+        <w:t xml:space="preserve">: </w:t>
+      </w:r>
+      <w:r>
+        <w:rPr>
+          <w:b/>
+          <w:bCs/>
+          <w:sz w:val="32"/>
+          <w:szCs w:val="32"/>
+          <w:rtl/>
+          <w:lang w:bidi="ar-EG"/>
+        </w:rPr>
+        <w:t xml:space="preserve">شهادة ضمان </w:t>
       </w:r>
       <w:r>
         <w:rPr>
@@ -123,7 +249,7 @@
           <w:rtl/>
           <w:lang w:bidi="ar-EG"/>
         </w:rPr>
-        <w:t> لعملية </w:t>
+        <w:t xml:space="preserve"> لعملية </w:t>
       </w:r>
       <w:r>
         <w:rPr>
@@ -135,7 +261,7 @@
           <w:rtl/>
           <w:lang w:bidi="ar-EG"/>
         </w:rPr>
-        <w:t>اسم العملية المسجله </w:t>
+        <w:t xml:space="preserve">اسم العملية المسجله </w:t>
       </w:r>
       <w:r>
         <w:rPr>
@@ -146,7 +272,7 @@
           <w:rtl/>
           <w:lang w:bidi="ar-EG"/>
         </w:rPr>
-        <w:t>رقم </w:t>
+        <w:t xml:space="preserve">رقم  </w:t>
       </w:r>
       <w:r>
         <w:rPr>
@@ -159,6 +285,17 @@
           <w:lang w:bidi="ar-EG"/>
         </w:rPr>
         <w:t>365</w:t>
+      </w:r>
+      <w:r>
+        <w:rPr>
+          <w:b/>
+          <w:bCs/>
+          <w:sz w:val="32"/>
+          <w:szCs w:val="32"/>
+          <w:rtl/>
+          <w:lang w:bidi="ar-EG"/>
+        </w:rPr>
+        <w:t xml:space="preserve"> </w:t>
       </w:r>
     </w:p>
     <w:p>
@@ -168,107 +305,95 @@
           <w:rFonts w:ascii="Arial" w:hAnsi="Arial"/>
           <w:b/>
           <w:bCs/>
+          <w:sz w:val="20"/>
+          <w:szCs w:val="20"/>
+          <w:rtl/>
+          <w:lang w:bidi="ar-EG"/>
+        </w:rPr>
+      </w:pPr>
+      <w:r>
+        <w:rPr>
+          <w:rFonts w:ascii="Arial" w:hAnsi="Arial"/>
+          <w:b/>
+          <w:bCs/>
           <w:sz w:val="36"/>
           <w:szCs w:val="36"/>
-          <w:lang w:bidi="ar-EG"/>
-        </w:rPr>
-      </w:pPr>
+          <w:rtl/>
+          <w:lang w:bidi="ar-EG"/>
+        </w:rPr>
+        <w:t xml:space="preserve">                                    </w:t>
+      </w:r>
       <w:r>
         <w:rPr>
           <w:rFonts w:ascii="Arial" w:hAnsi="Arial"/>
           <w:b/>
           <w:bCs/>
-          <w:sz w:val="36"/>
-          <w:szCs w:val="36"/>
-          <w:rtl/>
-          <w:lang w:bidi="ar-EG"/>
-        </w:rPr>
-        <w:t xml:space="preserve">                                    تحيه طيبه وبعد ،،،</w:t>
-      </w:r>
-    </w:p>
-    <w:p>
-      <w:pPr>
-        <w:spacing w:after="120" w:line="240" w:lineRule="auto"/>
-        <w:ind w:left="-567" w:hanging="283"/>
-        <w:jc w:val="both"/>
-        <w:rPr>
-          <w:b/>
-          <w:bCs/>
-          <w:sz w:val="32"/>
-          <w:szCs w:val="32"/>
-          <w:rtl/>
-          <w:lang w:bidi="ar-EG"/>
-        </w:rPr>
-      </w:pPr>
-      <w:r>
-        <w:rPr>
-          <w:b/>
-          <w:bCs/>
-          <w:sz w:val="32"/>
-          <w:szCs w:val="32"/>
-          <w:rtl/>
-          <w:lang w:bidi="ar-EG"/>
-        </w:rPr>
-        <w:t>تتشرف جولدن سرفيس بأن تضمن وتتعهد بأن كافة الأصناف والمهمات المذكورة أدناه والموردة لسيادتكم للعملية المذكورة أعلاه طرفكم للعام المالى 2024 / 2025 والمحدد لها جلسة 14/ 1 /2024 لفتح المظاريف الفنية، مطابقة للمواصفات الفنية المعتمدة. وفيما يلى بيان الأصناف وفترات الضمان المقررة :</w:t>
+          <w:sz w:val="28"/>
+          <w:szCs w:val="28"/>
+          <w:rtl/>
+          <w:lang w:bidi="ar-EG"/>
+        </w:rPr>
+        <w:t>تحيه طيبه وبعد</w:t>
       </w:r>
     </w:p>
     <w:tbl>
       <w:tblPr>
+        <w:tblpPr w:leftFromText="180" w:rightFromText="180" w:bottomFromText="200" w:vertAnchor="page" w:horzAnchor="margin" w:tblpY="6556"/>
         <w:bidiVisual/>
         <w:tblW w:w="10147" w:type="dxa"/>
-        <w:jc w:val="center"/>
         <w:tblBorders>
-          <w:top w:val="thinThickSmallGap" w:sz="24" w:space="0" w:color="auto"/>
-          <w:left w:val="thinThickSmallGap" w:sz="24" w:space="0" w:color="auto"/>
-          <w:bottom w:val="thinThickSmallGap" w:sz="24" w:space="0" w:color="auto"/>
-          <w:right w:val="thinThickSmallGap" w:sz="24" w:space="0" w:color="auto"/>
-          <w:insideH w:val="thinThickSmallGap" w:sz="18" w:space="0" w:color="auto"/>
-          <w:insideV w:val="thinThickSmallGap" w:sz="18" w:space="0" w:color="auto"/>
+          <w:top w:val="single" w:sz="4" w:space="0" w:color="auto"/>
+          <w:left w:val="single" w:sz="4" w:space="0" w:color="auto"/>
+          <w:bottom w:val="single" w:sz="4" w:space="0" w:color="auto"/>
+          <w:right w:val="single" w:sz="4" w:space="0" w:color="auto"/>
+          <w:insideH w:val="single" w:sz="4" w:space="0" w:color="auto"/>
+          <w:insideV w:val="single" w:sz="4" w:space="0" w:color="auto"/>
         </w:tblBorders>
-        <w:tblLook w:val="0000" w:firstRow="0" w:lastRow="0" w:firstColumn="0" w:lastColumn="0" w:noHBand="0" w:noVBand="0"/>
+        <w:tblLook w:val="04A0" w:firstRow="1" w:lastRow="0" w:firstColumn="1" w:lastColumn="0" w:noHBand="0" w:noVBand="1"/>
       </w:tblPr>
       <w:tblGrid>
-        <w:gridCol w:w="561"/>
-        <w:gridCol w:w="3593"/>
-        <w:gridCol w:w="977"/>
-        <w:gridCol w:w="977"/>
-        <w:gridCol w:w="2798"/>
-        <w:gridCol w:w="1241"/>
+        <w:gridCol w:w="560"/>
+        <w:gridCol w:w="3589"/>
+        <w:gridCol w:w="976"/>
+        <w:gridCol w:w="989"/>
+        <w:gridCol w:w="2793"/>
+        <w:gridCol w:w="1240"/>
       </w:tblGrid>
       <w:tr>
         <w:trPr>
-          <w:trHeight w:val="330"/>
-          <w:jc w:val="center"/>
+          <w:trHeight w:val="300"/>
         </w:trPr>
         <w:tc>
           <w:tcPr>
             <w:tcW w:w="561" w:type="dxa"/>
             <w:tcBorders>
-              <w:top w:val="thinThickSmallGap" w:sz="24" w:space="0" w:color="auto"/>
-              <w:left w:val="thinThickSmallGap" w:sz="24" w:space="0" w:color="auto"/>
-              <w:bottom w:val="thinThickSmallGap" w:sz="24" w:space="0" w:color="auto"/>
-              <w:right w:val="thinThickSmallGap" w:sz="24" w:space="0" w:color="auto"/>
+              <w:top w:val="thinThickSmallGap" w:sz="18" w:space="0" w:color="auto"/>
+              <w:left w:val="thinThickSmallGap" w:sz="18" w:space="0" w:color="auto"/>
+              <w:bottom w:val="thinThickSmallGap" w:sz="18" w:space="0" w:color="auto"/>
+              <w:right w:val="thinThickSmallGap" w:sz="18" w:space="0" w:color="auto"/>
             </w:tcBorders>
+            <w:hideMark/>
           </w:tcPr>
           <w:p>
             <w:pPr>
               <w:spacing w:after="0" w:line="240" w:lineRule="auto"/>
               <w:jc w:val="center"/>
               <w:rPr>
-                <w:b/>
-                <w:bCs/>
-                <w:sz w:val="30"/>
-                <w:szCs w:val="30"/>
-                <w:rtl/>
+                <w:rFonts w:ascii="Arabic Typesetting" w:hAnsi="Arabic Typesetting" w:cs="Arabic Typesetting"/>
+                <w:b/>
+                <w:bCs/>
+                <w:sz w:val="40"/>
+                <w:szCs w:val="40"/>
                 <w:lang w:bidi="ar-EG"/>
               </w:rPr>
             </w:pPr>
             <w:r>
               <w:rPr>
-                <w:b/>
-                <w:bCs/>
-                <w:sz w:val="30"/>
-                <w:szCs w:val="30"/>
+                <w:rFonts w:ascii="Arabic Typesetting" w:hAnsi="Arabic Typesetting" w:cs="Arabic Typesetting"/>
+                <w:b/>
+                <w:bCs/>
+                <w:sz w:val="44"/>
+                <w:szCs w:val="44"/>
                 <w:rtl/>
                 <w:lang w:bidi="ar-EG"/>
               </w:rPr>
@@ -280,35 +405,98 @@
           <w:tcPr>
             <w:tcW w:w="3593" w:type="dxa"/>
             <w:tcBorders>
-              <w:top w:val="thinThickSmallGap" w:sz="24" w:space="0" w:color="auto"/>
-              <w:left w:val="thinThickSmallGap" w:sz="24" w:space="0" w:color="auto"/>
-              <w:bottom w:val="thinThickSmallGap" w:sz="24" w:space="0" w:color="auto"/>
-              <w:right w:val="thinThickSmallGap" w:sz="24" w:space="0" w:color="auto"/>
+              <w:top w:val="thinThickSmallGap" w:sz="18" w:space="0" w:color="auto"/>
+              <w:left w:val="thinThickSmallGap" w:sz="18" w:space="0" w:color="auto"/>
+              <w:bottom w:val="thinThickSmallGap" w:sz="18" w:space="0" w:color="auto"/>
+              <w:right w:val="thinThickSmallGap" w:sz="18" w:space="0" w:color="auto"/>
             </w:tcBorders>
+            <w:hideMark/>
           </w:tcPr>
           <w:p>
             <w:pPr>
               <w:spacing w:after="0" w:line="240" w:lineRule="auto"/>
               <w:jc w:val="center"/>
               <w:rPr>
-                <w:b/>
-                <w:bCs/>
-                <w:sz w:val="30"/>
-                <w:szCs w:val="30"/>
+                <w:rFonts w:ascii="Arabic Typesetting" w:hAnsi="Arabic Typesetting" w:cs="Arabic Typesetting"/>
+                <w:b/>
+                <w:bCs/>
+                <w:sz w:val="40"/>
+                <w:szCs w:val="40"/>
                 <w:rtl/>
                 <w:lang w:bidi="ar-EG"/>
               </w:rPr>
             </w:pPr>
             <w:r>
               <w:rPr>
-                <w:b/>
-                <w:bCs/>
-                <w:sz w:val="30"/>
-                <w:szCs w:val="30"/>
-                <w:rtl/>
-                <w:lang w:bidi="ar-EG"/>
-              </w:rPr>
-              <w:t>إســــم الصــــــنف والمواصفات</w:t>
+                <w:rFonts w:ascii="Arabic Typesetting" w:hAnsi="Arabic Typesetting" w:cs="Arabic Typesetting" w:hint="cs"/>
+                <w:b/>
+                <w:bCs/>
+                <w:sz w:val="40"/>
+                <w:szCs w:val="40"/>
+                <w:rtl/>
+                <w:lang w:bidi="ar-EG"/>
+              </w:rPr>
+              <w:t>إ</w:t>
+            </w:r>
+            <w:r>
+              <w:rPr>
+                <w:rFonts w:ascii="Arabic Typesetting" w:hAnsi="Arabic Typesetting" w:cs="Arabic Typesetting"/>
+                <w:b/>
+                <w:bCs/>
+                <w:sz w:val="40"/>
+                <w:szCs w:val="40"/>
+                <w:rtl/>
+                <w:lang w:bidi="ar-EG"/>
+              </w:rPr>
+              <w:t>س</w:t>
+            </w:r>
+            <w:r>
+              <w:rPr>
+                <w:rFonts w:ascii="Arabic Typesetting" w:hAnsi="Arabic Typesetting" w:cs="Arabic Typesetting" w:hint="cs"/>
+                <w:b/>
+                <w:bCs/>
+                <w:sz w:val="40"/>
+                <w:szCs w:val="40"/>
+                <w:rtl/>
+                <w:lang w:bidi="ar-EG"/>
+              </w:rPr>
+              <w:t>ــــــــــــــــ</w:t>
+            </w:r>
+            <w:r>
+              <w:rPr>
+                <w:rFonts w:ascii="Arabic Typesetting" w:hAnsi="Arabic Typesetting" w:cs="Arabic Typesetting"/>
+                <w:b/>
+                <w:bCs/>
+                <w:sz w:val="40"/>
+                <w:szCs w:val="40"/>
+                <w:rtl/>
+                <w:lang w:bidi="ar-EG"/>
+              </w:rPr>
+              <w:t>م الص</w:t>
+            </w:r>
+            <w:r>
+              <w:rPr>
+                <w:rFonts w:ascii="Arabic Typesetting" w:hAnsi="Arabic Typesetting" w:cs="Arabic Typesetting" w:hint="cs"/>
+                <w:b/>
+                <w:bCs/>
+                <w:sz w:val="40"/>
+                <w:szCs w:val="40"/>
+                <w:rtl/>
+                <w:lang w:bidi="ar-EG"/>
+              </w:rPr>
+              <w:t>ـــــــــــــــــــ</w:t>
+            </w:r>
+            <w:r>
+              <w:rPr>
+                <w:rFonts w:ascii="Arabic Typesetting" w:hAnsi="Arabic Typesetting" w:cs="Arabic Typesetting"/>
+                <w:b/>
+                <w:bCs/>
+                <w:sz w:val="40"/>
+                <w:szCs w:val="40"/>
+                <w:rtl/>
+                <w:lang w:bidi="ar-EG"/>
+              </w:rPr>
+              <w:t>نف</w:t>
             </w:r>
           </w:p>
         </w:tc>
@@ -316,35 +504,62 @@
           <w:tcPr>
             <w:tcW w:w="977" w:type="dxa"/>
             <w:tcBorders>
-              <w:top w:val="thinThickSmallGap" w:sz="24" w:space="0" w:color="auto"/>
-              <w:left w:val="thinThickSmallGap" w:sz="24" w:space="0" w:color="auto"/>
-              <w:bottom w:val="thinThickSmallGap" w:sz="24" w:space="0" w:color="auto"/>
-              <w:right w:val="thinThickSmallGap" w:sz="24" w:space="0" w:color="auto"/>
+              <w:top w:val="thinThickSmallGap" w:sz="18" w:space="0" w:color="auto"/>
+              <w:left w:val="thinThickSmallGap" w:sz="18" w:space="0" w:color="auto"/>
+              <w:bottom w:val="thinThickSmallGap" w:sz="18" w:space="0" w:color="auto"/>
+              <w:right w:val="thinThickSmallGap" w:sz="18" w:space="0" w:color="auto"/>
             </w:tcBorders>
+            <w:hideMark/>
           </w:tcPr>
           <w:p>
             <w:pPr>
               <w:spacing w:after="0" w:line="240" w:lineRule="auto"/>
               <w:jc w:val="center"/>
               <w:rPr>
-                <w:b/>
-                <w:bCs/>
-                <w:sz w:val="30"/>
-                <w:szCs w:val="30"/>
+                <w:rFonts w:ascii="Arabic Typesetting" w:hAnsi="Arabic Typesetting" w:cs="Arabic Typesetting"/>
+                <w:b/>
+                <w:bCs/>
+                <w:sz w:val="40"/>
+                <w:szCs w:val="40"/>
                 <w:rtl/>
                 <w:lang w:bidi="ar-EG"/>
               </w:rPr>
             </w:pPr>
             <w:r>
               <w:rPr>
-                <w:b/>
-                <w:bCs/>
-                <w:sz w:val="30"/>
-                <w:szCs w:val="30"/>
-                <w:rtl/>
-                <w:lang w:bidi="ar-EG"/>
-              </w:rPr>
-              <w:t>الوحدة</w:t>
+                <w:rFonts w:ascii="Arabic Typesetting" w:hAnsi="Arabic Typesetting" w:cs="Arabic Typesetting"/>
+                <w:b/>
+                <w:bCs/>
+                <w:sz w:val="40"/>
+                <w:szCs w:val="40"/>
+                <w:rtl/>
+                <w:lang w:bidi="ar-EG"/>
+              </w:rPr>
+              <w:t>الوح</w:t>
+            </w:r>
+            <w:r>
+              <w:rPr>
+                <w:rFonts w:ascii="Arabic Typesetting" w:hAnsi="Arabic Typesetting" w:cs="Arabic Typesetting" w:hint="cs"/>
+                <w:b/>
+                <w:bCs/>
+                <w:sz w:val="40"/>
+                <w:szCs w:val="40"/>
+                <w:rtl/>
+                <w:lang w:bidi="ar-EG"/>
+              </w:rPr>
+              <w:t>ــ</w:t>
+            </w:r>
+            <w:r>
+              <w:rPr>
+                <w:rFonts w:ascii="Arabic Typesetting" w:hAnsi="Arabic Typesetting" w:cs="Arabic Typesetting"/>
+                <w:b/>
+                <w:bCs/>
+                <w:sz w:val="40"/>
+                <w:szCs w:val="40"/>
+                <w:rtl/>
+                <w:lang w:bidi="ar-EG"/>
+              </w:rPr>
+              <w:t>دة</w:t>
             </w:r>
           </w:p>
         </w:tc>
@@ -352,35 +567,62 @@
           <w:tcPr>
             <w:tcW w:w="977" w:type="dxa"/>
             <w:tcBorders>
-              <w:top w:val="thinThickSmallGap" w:sz="24" w:space="0" w:color="auto"/>
-              <w:left w:val="thinThickSmallGap" w:sz="24" w:space="0" w:color="auto"/>
-              <w:bottom w:val="thinThickSmallGap" w:sz="24" w:space="0" w:color="auto"/>
-              <w:right w:val="thinThickSmallGap" w:sz="24" w:space="0" w:color="auto"/>
+              <w:top w:val="thinThickSmallGap" w:sz="18" w:space="0" w:color="auto"/>
+              <w:left w:val="thinThickSmallGap" w:sz="18" w:space="0" w:color="auto"/>
+              <w:bottom w:val="thinThickSmallGap" w:sz="18" w:space="0" w:color="auto"/>
+              <w:right w:val="thinThickSmallGap" w:sz="18" w:space="0" w:color="auto"/>
             </w:tcBorders>
+            <w:hideMark/>
           </w:tcPr>
           <w:p>
             <w:pPr>
               <w:spacing w:after="0" w:line="240" w:lineRule="auto"/>
               <w:jc w:val="center"/>
               <w:rPr>
-                <w:b/>
-                <w:bCs/>
-                <w:sz w:val="30"/>
-                <w:szCs w:val="30"/>
+                <w:rFonts w:ascii="Arabic Typesetting" w:hAnsi="Arabic Typesetting" w:cs="Arabic Typesetting"/>
+                <w:b/>
+                <w:bCs/>
+                <w:sz w:val="40"/>
+                <w:szCs w:val="40"/>
                 <w:rtl/>
                 <w:lang w:bidi="ar-EG"/>
               </w:rPr>
             </w:pPr>
             <w:r>
               <w:rPr>
-                <w:b/>
-                <w:bCs/>
-                <w:sz w:val="30"/>
-                <w:szCs w:val="30"/>
-                <w:rtl/>
-                <w:lang w:bidi="ar-EG"/>
-              </w:rPr>
-              <w:t>الكميه</w:t>
+                <w:rFonts w:ascii="Arabic Typesetting" w:hAnsi="Arabic Typesetting" w:cs="Arabic Typesetting"/>
+                <w:b/>
+                <w:bCs/>
+                <w:sz w:val="40"/>
+                <w:szCs w:val="40"/>
+                <w:rtl/>
+                <w:lang w:bidi="ar-EG"/>
+              </w:rPr>
+              <w:t>الكم</w:t>
+            </w:r>
+            <w:r>
+              <w:rPr>
+                <w:rFonts w:ascii="Arabic Typesetting" w:hAnsi="Arabic Typesetting" w:cs="Arabic Typesetting" w:hint="cs"/>
+                <w:b/>
+                <w:bCs/>
+                <w:sz w:val="40"/>
+                <w:szCs w:val="40"/>
+                <w:rtl/>
+                <w:lang w:bidi="ar-EG"/>
+              </w:rPr>
+              <w:t>ــــــ</w:t>
+            </w:r>
+            <w:r>
+              <w:rPr>
+                <w:rFonts w:ascii="Arabic Typesetting" w:hAnsi="Arabic Typesetting" w:cs="Arabic Typesetting"/>
+                <w:b/>
+                <w:bCs/>
+                <w:sz w:val="40"/>
+                <w:szCs w:val="40"/>
+                <w:rtl/>
+                <w:lang w:bidi="ar-EG"/>
+              </w:rPr>
+              <w:t>ية</w:t>
             </w:r>
           </w:p>
         </w:tc>
@@ -388,35 +630,86 @@
           <w:tcPr>
             <w:tcW w:w="2798" w:type="dxa"/>
             <w:tcBorders>
-              <w:top w:val="thinThickSmallGap" w:sz="24" w:space="0" w:color="auto"/>
-              <w:left w:val="thinThickSmallGap" w:sz="24" w:space="0" w:color="auto"/>
-              <w:bottom w:val="thinThickSmallGap" w:sz="24" w:space="0" w:color="auto"/>
-              <w:right w:val="thinThickSmallGap" w:sz="24" w:space="0" w:color="auto"/>
+              <w:top w:val="thinThickSmallGap" w:sz="18" w:space="0" w:color="auto"/>
+              <w:left w:val="thinThickSmallGap" w:sz="18" w:space="0" w:color="auto"/>
+              <w:bottom w:val="thinThickSmallGap" w:sz="18" w:space="0" w:color="auto"/>
+              <w:right w:val="thinThickSmallGap" w:sz="18" w:space="0" w:color="auto"/>
             </w:tcBorders>
+            <w:hideMark/>
           </w:tcPr>
           <w:p>
             <w:pPr>
               <w:spacing w:after="0" w:line="240" w:lineRule="auto"/>
               <w:jc w:val="center"/>
               <w:rPr>
-                <w:b/>
-                <w:bCs/>
-                <w:sz w:val="30"/>
-                <w:szCs w:val="30"/>
+                <w:rFonts w:ascii="Arabic Typesetting" w:hAnsi="Arabic Typesetting" w:cs="Arabic Typesetting"/>
+                <w:b/>
+                <w:bCs/>
+                <w:sz w:val="40"/>
+                <w:szCs w:val="40"/>
                 <w:rtl/>
                 <w:lang w:bidi="ar-EG"/>
               </w:rPr>
             </w:pPr>
             <w:r>
               <w:rPr>
-                <w:b/>
-                <w:bCs/>
-                <w:sz w:val="30"/>
-                <w:szCs w:val="30"/>
-                <w:rtl/>
-                <w:lang w:bidi="ar-EG"/>
-              </w:rPr>
-              <w:t>بيان وتغطية الضمان</w:t>
+                <w:rFonts w:ascii="Arabic Typesetting" w:hAnsi="Arabic Typesetting" w:cs="Arabic Typesetting"/>
+                <w:b/>
+                <w:bCs/>
+                <w:sz w:val="40"/>
+                <w:szCs w:val="40"/>
+                <w:rtl/>
+                <w:lang w:bidi="ar-EG"/>
+              </w:rPr>
+              <w:t>الوص</w:t>
+            </w:r>
+            <w:r>
+              <w:rPr>
+                <w:rFonts w:ascii="Arabic Typesetting" w:hAnsi="Arabic Typesetting" w:cs="Arabic Typesetting" w:hint="cs"/>
+                <w:b/>
+                <w:bCs/>
+                <w:sz w:val="40"/>
+                <w:szCs w:val="40"/>
+                <w:rtl/>
+                <w:lang w:bidi="ar-EG"/>
+              </w:rPr>
+              <w:t>ــ</w:t>
+            </w:r>
+            <w:r>
+              <w:rPr>
+                <w:rFonts w:ascii="Arabic Typesetting" w:hAnsi="Arabic Typesetting" w:cs="Arabic Typesetting"/>
+                <w:b/>
+                <w:bCs/>
+                <w:sz w:val="40"/>
+                <w:szCs w:val="40"/>
+                <w:rtl/>
+                <w:lang w:bidi="ar-EG"/>
+              </w:rPr>
+              <w:t>ف – الملاحظ</w:t>
+            </w:r>
+            <w:r>
+              <w:rPr>
+                <w:rFonts w:ascii="Arabic Typesetting" w:hAnsi="Arabic Typesetting" w:cs="Arabic Typesetting" w:hint="cs"/>
+                <w:b/>
+                <w:bCs/>
+                <w:sz w:val="40"/>
+                <w:szCs w:val="40"/>
+                <w:rtl/>
+                <w:lang w:bidi="ar-EG"/>
+              </w:rPr>
+              <w:t>ـ</w:t>
+            </w:r>
+            <w:r>
+              <w:rPr>
+                <w:rFonts w:ascii="Arabic Typesetting" w:hAnsi="Arabic Typesetting" w:cs="Arabic Typesetting"/>
+                <w:b/>
+                <w:bCs/>
+                <w:sz w:val="40"/>
+                <w:szCs w:val="40"/>
+                <w:rtl/>
+                <w:lang w:bidi="ar-EG"/>
+              </w:rPr>
+              <w:t>ات الفنيه</w:t>
             </w:r>
           </w:p>
         </w:tc>
@@ -424,35 +717,1264 @@
           <w:tcPr>
             <w:tcW w:w="1241" w:type="dxa"/>
             <w:tcBorders>
-              <w:top w:val="thinThickSmallGap" w:sz="24" w:space="0" w:color="auto"/>
-              <w:left w:val="thinThickSmallGap" w:sz="24" w:space="0" w:color="auto"/>
-              <w:bottom w:val="thinThickSmallGap" w:sz="24" w:space="0" w:color="auto"/>
-              <w:right w:val="thinThickSmallGap" w:sz="24" w:space="0" w:color="auto"/>
+              <w:top w:val="thinThickSmallGap" w:sz="18" w:space="0" w:color="auto"/>
+              <w:left w:val="thinThickSmallGap" w:sz="18" w:space="0" w:color="auto"/>
+              <w:bottom w:val="thinThickSmallGap" w:sz="18" w:space="0" w:color="auto"/>
+              <w:right w:val="thinThickSmallGap" w:sz="18" w:space="0" w:color="auto"/>
             </w:tcBorders>
+            <w:hideMark/>
           </w:tcPr>
           <w:p>
             <w:pPr>
               <w:spacing w:after="0" w:line="240" w:lineRule="auto"/>
               <w:jc w:val="center"/>
               <w:rPr>
-                <w:b/>
-                <w:bCs/>
-                <w:sz w:val="30"/>
-                <w:szCs w:val="30"/>
+                <w:rFonts w:ascii="Arabic Typesetting" w:hAnsi="Arabic Typesetting" w:cs="Arabic Typesetting"/>
+                <w:b/>
+                <w:bCs/>
+                <w:sz w:val="40"/>
+                <w:szCs w:val="40"/>
                 <w:rtl/>
                 <w:lang w:bidi="ar-EG"/>
               </w:rPr>
             </w:pPr>
             <w:r>
               <w:rPr>
-                <w:b/>
-                <w:bCs/>
-                <w:sz w:val="30"/>
-                <w:szCs w:val="30"/>
-                <w:rtl/>
-                <w:lang w:bidi="ar-EG"/>
-              </w:rPr>
-              <w:t>ملاحظات الضمان</w:t>
+                <w:rFonts w:ascii="Arabic Typesetting" w:hAnsi="Arabic Typesetting" w:cs="Arabic Typesetting"/>
+                <w:b/>
+                <w:bCs/>
+                <w:sz w:val="40"/>
+                <w:szCs w:val="40"/>
+                <w:rtl/>
+                <w:lang w:bidi="ar-EG"/>
+              </w:rPr>
+              <w:t>ملاحظات</w:t>
+            </w:r>
+          </w:p>
+        </w:tc>
+      </w:tr>
+      <w:tr>
+        <w:trPr>
+          <w:trHeight w:val="330"/>
+        </w:trPr>
+        <w:tc>
+          <w:tcPr>
+            <w:tcW w:w="561" w:type="dxa"/>
+            <w:tcBorders>
+              <w:top w:val="thinThickSmallGap" w:sz="18" w:space="0" w:color="auto"/>
+              <w:left w:val="thinThickSmallGap" w:sz="18" w:space="0" w:color="auto"/>
+              <w:bottom w:val="thinThickSmallGap" w:sz="18" w:space="0" w:color="auto"/>
+              <w:right w:val="thinThickSmallGap" w:sz="18" w:space="0" w:color="auto"/>
+            </w:tcBorders>
+            <w:hideMark/>
+          </w:tcPr>
+          <w:p>
+            <w:pPr>
+              <w:spacing w:after="0" w:line="240" w:lineRule="auto"/>
+              <w:jc w:val="center"/>
+              <w:rPr>
+                <w:rFonts w:ascii="Arabic Typesetting" w:hAnsi="Arabic Typesetting" w:cs="Arabic Typesetting"/>
+                <w:b/>
+                <w:bCs/>
+                <w:sz w:val="28"/>
+                <w:szCs w:val="28"/>
+                <w:rtl/>
+                <w:lang w:bidi="ar-EG"/>
+              </w:rPr>
+            </w:pPr>
+            <w:r>
+              <w:rPr>
+                <w:rFonts w:ascii="Arabic Typesetting" w:hAnsi="Arabic Typesetting" w:cs="Arabic Typesetting"/>
+                <w:b/>
+                <w:bCs/>
+                <w:sz w:val="28"/>
+                <w:szCs w:val="28"/>
+                <w:highlight w:val="red"/>
+                <w:rtl/>
+                <w:lang w:bidi="ar-EG"/>
+              </w:rPr>
+              <w:t>1</w:t>
+            </w:r>
+          </w:p>
+        </w:tc>
+        <w:tc>
+          <w:tcPr>
+            <w:tcW w:w="3593" w:type="dxa"/>
+            <w:tcBorders>
+              <w:top w:val="thinThickSmallGap" w:sz="18" w:space="0" w:color="auto"/>
+              <w:left w:val="thinThickSmallGap" w:sz="18" w:space="0" w:color="auto"/>
+              <w:bottom w:val="thinThickSmallGap" w:sz="18" w:space="0" w:color="auto"/>
+              <w:right w:val="thinThickSmallGap" w:sz="18" w:space="0" w:color="auto"/>
+            </w:tcBorders>
+            <w:hideMark/>
+          </w:tcPr>
+          <w:p>
+            <w:pPr>
+              <w:spacing w:after="0" w:line="240" w:lineRule="auto"/>
+              <w:jc w:val="center"/>
+              <w:rPr>
+                <w:rFonts w:ascii="Arabic Typesetting" w:hAnsi="Arabic Typesetting" w:cs="Arabic Typesetting"/>
+                <w:b/>
+                <w:bCs/>
+                <w:sz w:val="28"/>
+                <w:szCs w:val="28"/>
+                <w:rtl/>
+                <w:lang w:bidi="ar-EG"/>
+              </w:rPr>
+            </w:pPr>
+            <w:r>
+              <w:rPr>
+                <w:rFonts w:ascii="Arabic Typesetting" w:hAnsi="Arabic Typesetting" w:cs="Arabic Typesetting"/>
+                <w:b/>
+                <w:bCs/>
+                <w:sz w:val="28"/>
+                <w:szCs w:val="28"/>
+                <w:highlight w:val="red"/>
+                <w:rtl/>
+                <w:lang w:bidi="ar-EG"/>
+              </w:rPr>
+              <w:t>.....................................................</w:t>
+            </w:r>
+          </w:p>
+        </w:tc>
+        <w:tc>
+          <w:tcPr>
+            <w:tcW w:w="977" w:type="dxa"/>
+            <w:tcBorders>
+              <w:top w:val="thinThickSmallGap" w:sz="18" w:space="0" w:color="auto"/>
+              <w:left w:val="thinThickSmallGap" w:sz="18" w:space="0" w:color="auto"/>
+              <w:bottom w:val="thinThickSmallGap" w:sz="18" w:space="0" w:color="auto"/>
+              <w:right w:val="thinThickSmallGap" w:sz="18" w:space="0" w:color="auto"/>
+            </w:tcBorders>
+            <w:hideMark/>
+          </w:tcPr>
+          <w:p>
+            <w:pPr>
+              <w:spacing w:after="0" w:line="240" w:lineRule="auto"/>
+              <w:jc w:val="center"/>
+              <w:rPr>
+                <w:rFonts w:ascii="Arabic Typesetting" w:hAnsi="Arabic Typesetting" w:cs="Arabic Typesetting"/>
+                <w:b/>
+                <w:bCs/>
+                <w:sz w:val="28"/>
+                <w:szCs w:val="28"/>
+                <w:rtl/>
+                <w:lang w:bidi="ar-EG"/>
+              </w:rPr>
+            </w:pPr>
+            <w:r>
+              <w:rPr>
+                <w:rFonts w:ascii="Arabic Typesetting" w:hAnsi="Arabic Typesetting" w:cs="Arabic Typesetting"/>
+                <w:b/>
+                <w:bCs/>
+                <w:sz w:val="28"/>
+                <w:szCs w:val="28"/>
+                <w:highlight w:val="red"/>
+                <w:rtl/>
+                <w:lang w:bidi="ar-EG"/>
+              </w:rPr>
+              <w:t>........</w:t>
+            </w:r>
+          </w:p>
+        </w:tc>
+        <w:tc>
+          <w:tcPr>
+            <w:tcW w:w="977" w:type="dxa"/>
+            <w:tcBorders>
+              <w:top w:val="thinThickSmallGap" w:sz="18" w:space="0" w:color="auto"/>
+              <w:left w:val="thinThickSmallGap" w:sz="18" w:space="0" w:color="auto"/>
+              <w:bottom w:val="thinThickSmallGap" w:sz="18" w:space="0" w:color="auto"/>
+              <w:right w:val="thinThickSmallGap" w:sz="18" w:space="0" w:color="auto"/>
+            </w:tcBorders>
+            <w:hideMark/>
+          </w:tcPr>
+          <w:p>
+            <w:pPr>
+              <w:spacing w:after="0" w:line="240" w:lineRule="auto"/>
+              <w:jc w:val="center"/>
+              <w:rPr>
+                <w:rFonts w:ascii="Arabic Typesetting" w:hAnsi="Arabic Typesetting" w:cs="Arabic Typesetting"/>
+                <w:b/>
+                <w:bCs/>
+                <w:sz w:val="28"/>
+                <w:szCs w:val="28"/>
+                <w:rtl/>
+                <w:lang w:bidi="ar-EG"/>
+              </w:rPr>
+            </w:pPr>
+            <w:r>
+              <w:rPr>
+                <w:rFonts w:ascii="Arabic Typesetting" w:hAnsi="Arabic Typesetting" w:cs="Arabic Typesetting"/>
+                <w:b/>
+                <w:bCs/>
+                <w:sz w:val="28"/>
+                <w:szCs w:val="28"/>
+                <w:highlight w:val="red"/>
+                <w:rtl/>
+                <w:lang w:bidi="ar-EG"/>
+              </w:rPr>
+              <w:t>........</w:t>
+            </w:r>
+          </w:p>
+        </w:tc>
+        <w:tc>
+          <w:tcPr>
+            <w:tcW w:w="2798" w:type="dxa"/>
+            <w:tcBorders>
+              <w:top w:val="thinThickSmallGap" w:sz="18" w:space="0" w:color="auto"/>
+              <w:left w:val="thinThickSmallGap" w:sz="18" w:space="0" w:color="auto"/>
+              <w:bottom w:val="thinThickSmallGap" w:sz="18" w:space="0" w:color="auto"/>
+              <w:right w:val="thinThickSmallGap" w:sz="18" w:space="0" w:color="auto"/>
+            </w:tcBorders>
+            <w:hideMark/>
+          </w:tcPr>
+          <w:p>
+            <w:pPr>
+              <w:spacing w:after="0" w:line="240" w:lineRule="auto"/>
+              <w:jc w:val="center"/>
+              <w:rPr>
+                <w:rFonts w:ascii="Arabic Typesetting" w:hAnsi="Arabic Typesetting" w:cs="Arabic Typesetting"/>
+                <w:b/>
+                <w:bCs/>
+                <w:sz w:val="28"/>
+                <w:szCs w:val="28"/>
+                <w:rtl/>
+                <w:lang w:bidi="ar-EG"/>
+              </w:rPr>
+            </w:pPr>
+            <w:r>
+              <w:rPr>
+                <w:rFonts w:ascii="Arabic Typesetting" w:hAnsi="Arabic Typesetting" w:cs="Arabic Typesetting"/>
+                <w:b/>
+                <w:bCs/>
+                <w:sz w:val="28"/>
+                <w:szCs w:val="28"/>
+                <w:highlight w:val="red"/>
+                <w:rtl/>
+                <w:lang w:bidi="ar-EG"/>
+              </w:rPr>
+              <w:t>................................</w:t>
+            </w:r>
+          </w:p>
+        </w:tc>
+        <w:tc>
+          <w:tcPr>
+            <w:tcW w:w="1241" w:type="dxa"/>
+            <w:tcBorders>
+              <w:top w:val="thinThickSmallGap" w:sz="18" w:space="0" w:color="auto"/>
+              <w:left w:val="thinThickSmallGap" w:sz="18" w:space="0" w:color="auto"/>
+              <w:bottom w:val="thinThickSmallGap" w:sz="18" w:space="0" w:color="auto"/>
+              <w:right w:val="thinThickSmallGap" w:sz="18" w:space="0" w:color="auto"/>
+            </w:tcBorders>
+            <w:hideMark/>
+          </w:tcPr>
+          <w:p>
+            <w:pPr>
+              <w:spacing w:after="0" w:line="240" w:lineRule="auto"/>
+              <w:jc w:val="center"/>
+              <w:rPr>
+                <w:rFonts w:ascii="Arabic Typesetting" w:hAnsi="Arabic Typesetting" w:cs="Arabic Typesetting"/>
+                <w:b/>
+                <w:bCs/>
+                <w:sz w:val="28"/>
+                <w:szCs w:val="28"/>
+                <w:rtl/>
+                <w:lang w:bidi="ar-EG"/>
+              </w:rPr>
+            </w:pPr>
+            <w:r>
+              <w:rPr>
+                <w:rFonts w:ascii="Arabic Typesetting" w:hAnsi="Arabic Typesetting" w:cs="Arabic Typesetting"/>
+                <w:b/>
+                <w:bCs/>
+                <w:sz w:val="28"/>
+                <w:szCs w:val="28"/>
+                <w:highlight w:val="red"/>
+                <w:rtl/>
+                <w:lang w:bidi="ar-EG"/>
+              </w:rPr>
+              <w:t>...............</w:t>
+            </w:r>
+          </w:p>
+        </w:tc>
+      </w:tr>
+      <w:tr>
+        <w:trPr>
+          <w:trHeight w:val="120"/>
+        </w:trPr>
+        <w:tc>
+          <w:tcPr>
+            <w:tcW w:w="561" w:type="dxa"/>
+            <w:tcBorders>
+              <w:top w:val="thinThickSmallGap" w:sz="18" w:space="0" w:color="auto"/>
+              <w:left w:val="thinThickSmallGap" w:sz="18" w:space="0" w:color="auto"/>
+              <w:bottom w:val="thinThickSmallGap" w:sz="18" w:space="0" w:color="auto"/>
+              <w:right w:val="thinThickSmallGap" w:sz="18" w:space="0" w:color="auto"/>
+            </w:tcBorders>
+            <w:hideMark/>
+          </w:tcPr>
+          <w:p>
+            <w:pPr>
+              <w:spacing w:after="0" w:line="240" w:lineRule="auto"/>
+              <w:jc w:val="center"/>
+              <w:rPr>
+                <w:rFonts w:ascii="Arabic Typesetting" w:hAnsi="Arabic Typesetting" w:cs="Arabic Typesetting"/>
+                <w:b/>
+                <w:bCs/>
+                <w:sz w:val="28"/>
+                <w:szCs w:val="28"/>
+                <w:rtl/>
+                <w:lang w:bidi="ar-EG"/>
+              </w:rPr>
+            </w:pPr>
+            <w:r>
+              <w:rPr>
+                <w:rFonts w:ascii="Arabic Typesetting" w:hAnsi="Arabic Typesetting" w:cs="Arabic Typesetting"/>
+                <w:b/>
+                <w:bCs/>
+                <w:sz w:val="28"/>
+                <w:szCs w:val="28"/>
+                <w:highlight w:val="red"/>
+                <w:rtl/>
+                <w:lang w:bidi="ar-EG"/>
+              </w:rPr>
+              <w:t>2</w:t>
+            </w:r>
+          </w:p>
+        </w:tc>
+        <w:tc>
+          <w:tcPr>
+            <w:tcW w:w="3593" w:type="dxa"/>
+            <w:tcBorders>
+              <w:top w:val="thinThickSmallGap" w:sz="18" w:space="0" w:color="auto"/>
+              <w:left w:val="thinThickSmallGap" w:sz="18" w:space="0" w:color="auto"/>
+              <w:bottom w:val="thinThickSmallGap" w:sz="18" w:space="0" w:color="auto"/>
+              <w:right w:val="thinThickSmallGap" w:sz="18" w:space="0" w:color="auto"/>
+            </w:tcBorders>
+            <w:hideMark/>
+          </w:tcPr>
+          <w:p>
+            <w:pPr>
+              <w:spacing w:after="0" w:line="240" w:lineRule="auto"/>
+              <w:jc w:val="center"/>
+              <w:rPr>
+                <w:rFonts w:ascii="Arabic Typesetting" w:hAnsi="Arabic Typesetting" w:cs="Arabic Typesetting"/>
+                <w:b/>
+                <w:bCs/>
+                <w:sz w:val="28"/>
+                <w:szCs w:val="28"/>
+                <w:rtl/>
+                <w:lang w:bidi="ar-EG"/>
+              </w:rPr>
+            </w:pPr>
+            <w:r>
+              <w:rPr>
+                <w:rFonts w:ascii="Arabic Typesetting" w:hAnsi="Arabic Typesetting" w:cs="Arabic Typesetting"/>
+                <w:b/>
+                <w:bCs/>
+                <w:sz w:val="28"/>
+                <w:szCs w:val="28"/>
+                <w:highlight w:val="red"/>
+                <w:rtl/>
+                <w:lang w:bidi="ar-EG"/>
+              </w:rPr>
+              <w:t>......................................................</w:t>
+            </w:r>
+          </w:p>
+        </w:tc>
+        <w:tc>
+          <w:tcPr>
+            <w:tcW w:w="977" w:type="dxa"/>
+            <w:tcBorders>
+              <w:top w:val="thinThickSmallGap" w:sz="18" w:space="0" w:color="auto"/>
+              <w:left w:val="thinThickSmallGap" w:sz="18" w:space="0" w:color="auto"/>
+              <w:bottom w:val="thinThickSmallGap" w:sz="18" w:space="0" w:color="auto"/>
+              <w:right w:val="thinThickSmallGap" w:sz="18" w:space="0" w:color="auto"/>
+            </w:tcBorders>
+            <w:hideMark/>
+          </w:tcPr>
+          <w:p>
+            <w:pPr>
+              <w:spacing w:after="0" w:line="240" w:lineRule="auto"/>
+              <w:jc w:val="center"/>
+              <w:rPr>
+                <w:rFonts w:ascii="Arabic Typesetting" w:hAnsi="Arabic Typesetting" w:cs="Arabic Typesetting"/>
+                <w:b/>
+                <w:bCs/>
+                <w:sz w:val="28"/>
+                <w:szCs w:val="28"/>
+                <w:rtl/>
+                <w:lang w:bidi="ar-EG"/>
+              </w:rPr>
+            </w:pPr>
+            <w:r>
+              <w:rPr>
+                <w:rFonts w:ascii="Arabic Typesetting" w:hAnsi="Arabic Typesetting" w:cs="Arabic Typesetting"/>
+                <w:b/>
+                <w:bCs/>
+                <w:sz w:val="28"/>
+                <w:szCs w:val="28"/>
+                <w:highlight w:val="red"/>
+                <w:rtl/>
+                <w:lang w:bidi="ar-EG"/>
+              </w:rPr>
+              <w:t>........</w:t>
+            </w:r>
+          </w:p>
+        </w:tc>
+        <w:tc>
+          <w:tcPr>
+            <w:tcW w:w="977" w:type="dxa"/>
+            <w:tcBorders>
+              <w:top w:val="thinThickSmallGap" w:sz="18" w:space="0" w:color="auto"/>
+              <w:left w:val="thinThickSmallGap" w:sz="18" w:space="0" w:color="auto"/>
+              <w:bottom w:val="thinThickSmallGap" w:sz="18" w:space="0" w:color="auto"/>
+              <w:right w:val="thinThickSmallGap" w:sz="18" w:space="0" w:color="auto"/>
+            </w:tcBorders>
+            <w:hideMark/>
+          </w:tcPr>
+          <w:p>
+            <w:pPr>
+              <w:spacing w:after="0" w:line="240" w:lineRule="auto"/>
+              <w:jc w:val="center"/>
+              <w:rPr>
+                <w:rFonts w:ascii="Arabic Typesetting" w:hAnsi="Arabic Typesetting" w:cs="Arabic Typesetting"/>
+                <w:b/>
+                <w:bCs/>
+                <w:sz w:val="28"/>
+                <w:szCs w:val="28"/>
+                <w:rtl/>
+                <w:lang w:bidi="ar-EG"/>
+              </w:rPr>
+            </w:pPr>
+            <w:r>
+              <w:rPr>
+                <w:rFonts w:ascii="Arabic Typesetting" w:hAnsi="Arabic Typesetting" w:cs="Arabic Typesetting"/>
+                <w:b/>
+                <w:bCs/>
+                <w:sz w:val="28"/>
+                <w:szCs w:val="28"/>
+                <w:highlight w:val="red"/>
+                <w:rtl/>
+                <w:lang w:bidi="ar-EG"/>
+              </w:rPr>
+              <w:t>.........</w:t>
+            </w:r>
+          </w:p>
+        </w:tc>
+        <w:tc>
+          <w:tcPr>
+            <w:tcW w:w="2798" w:type="dxa"/>
+            <w:tcBorders>
+              <w:top w:val="thinThickSmallGap" w:sz="18" w:space="0" w:color="auto"/>
+              <w:left w:val="thinThickSmallGap" w:sz="18" w:space="0" w:color="auto"/>
+              <w:bottom w:val="thinThickSmallGap" w:sz="18" w:space="0" w:color="auto"/>
+              <w:right w:val="thinThickSmallGap" w:sz="18" w:space="0" w:color="auto"/>
+            </w:tcBorders>
+            <w:hideMark/>
+          </w:tcPr>
+          <w:p>
+            <w:pPr>
+              <w:spacing w:after="0" w:line="240" w:lineRule="auto"/>
+              <w:jc w:val="center"/>
+              <w:rPr>
+                <w:rFonts w:ascii="Arabic Typesetting" w:hAnsi="Arabic Typesetting" w:cs="Arabic Typesetting"/>
+                <w:b/>
+                <w:bCs/>
+                <w:sz w:val="28"/>
+                <w:szCs w:val="28"/>
+                <w:rtl/>
+                <w:lang w:bidi="ar-EG"/>
+              </w:rPr>
+            </w:pPr>
+            <w:r>
+              <w:rPr>
+                <w:rFonts w:ascii="Arabic Typesetting" w:hAnsi="Arabic Typesetting" w:cs="Arabic Typesetting"/>
+                <w:b/>
+                <w:bCs/>
+                <w:sz w:val="28"/>
+                <w:szCs w:val="28"/>
+                <w:highlight w:val="red"/>
+                <w:rtl/>
+                <w:lang w:bidi="ar-EG"/>
+              </w:rPr>
+              <w:t>...................................</w:t>
+            </w:r>
+          </w:p>
+        </w:tc>
+        <w:tc>
+          <w:tcPr>
+            <w:tcW w:w="1241" w:type="dxa"/>
+            <w:tcBorders>
+              <w:top w:val="thinThickSmallGap" w:sz="18" w:space="0" w:color="auto"/>
+              <w:left w:val="thinThickSmallGap" w:sz="18" w:space="0" w:color="auto"/>
+              <w:bottom w:val="thinThickSmallGap" w:sz="18" w:space="0" w:color="auto"/>
+              <w:right w:val="thinThickSmallGap" w:sz="18" w:space="0" w:color="auto"/>
+            </w:tcBorders>
+            <w:hideMark/>
+          </w:tcPr>
+          <w:p>
+            <w:pPr>
+              <w:spacing w:after="0" w:line="240" w:lineRule="auto"/>
+              <w:jc w:val="center"/>
+              <w:rPr>
+                <w:rFonts w:ascii="Arabic Typesetting" w:hAnsi="Arabic Typesetting" w:cs="Arabic Typesetting"/>
+                <w:b/>
+                <w:bCs/>
+                <w:sz w:val="28"/>
+                <w:szCs w:val="28"/>
+                <w:rtl/>
+                <w:lang w:bidi="ar-EG"/>
+              </w:rPr>
+            </w:pPr>
+            <w:r>
+              <w:rPr>
+                <w:rFonts w:ascii="Arabic Typesetting" w:hAnsi="Arabic Typesetting" w:cs="Arabic Typesetting"/>
+                <w:b/>
+                <w:bCs/>
+                <w:sz w:val="28"/>
+                <w:szCs w:val="28"/>
+                <w:highlight w:val="red"/>
+                <w:rtl/>
+                <w:lang w:bidi="ar-EG"/>
+              </w:rPr>
+              <w:t>................</w:t>
+            </w:r>
+          </w:p>
+        </w:tc>
+      </w:tr>
+      <w:tr>
+        <w:trPr>
+          <w:trHeight w:val="225"/>
+        </w:trPr>
+        <w:tc>
+          <w:tcPr>
+            <w:tcW w:w="561" w:type="dxa"/>
+            <w:tcBorders>
+              <w:top w:val="thinThickSmallGap" w:sz="18" w:space="0" w:color="auto"/>
+              <w:left w:val="thinThickSmallGap" w:sz="18" w:space="0" w:color="auto"/>
+              <w:bottom w:val="thinThickSmallGap" w:sz="18" w:space="0" w:color="auto"/>
+              <w:right w:val="thinThickSmallGap" w:sz="18" w:space="0" w:color="auto"/>
+            </w:tcBorders>
+            <w:hideMark/>
+          </w:tcPr>
+          <w:p>
+            <w:pPr>
+              <w:spacing w:after="0" w:line="240" w:lineRule="auto"/>
+              <w:jc w:val="center"/>
+              <w:rPr>
+                <w:rFonts w:ascii="Arabic Typesetting" w:hAnsi="Arabic Typesetting" w:cs="Arabic Typesetting"/>
+                <w:b/>
+                <w:bCs/>
+                <w:sz w:val="28"/>
+                <w:szCs w:val="28"/>
+                <w:rtl/>
+                <w:lang w:bidi="ar-EG"/>
+              </w:rPr>
+            </w:pPr>
+            <w:r>
+              <w:rPr>
+                <w:rFonts w:ascii="Arabic Typesetting" w:hAnsi="Arabic Typesetting" w:cs="Arabic Typesetting"/>
+                <w:b/>
+                <w:bCs/>
+                <w:sz w:val="28"/>
+                <w:szCs w:val="28"/>
+                <w:highlight w:val="red"/>
+                <w:rtl/>
+                <w:lang w:bidi="ar-EG"/>
+              </w:rPr>
+              <w:t>3</w:t>
+            </w:r>
+          </w:p>
+        </w:tc>
+        <w:tc>
+          <w:tcPr>
+            <w:tcW w:w="3593" w:type="dxa"/>
+            <w:tcBorders>
+              <w:top w:val="thinThickSmallGap" w:sz="18" w:space="0" w:color="auto"/>
+              <w:left w:val="thinThickSmallGap" w:sz="18" w:space="0" w:color="auto"/>
+              <w:bottom w:val="thinThickSmallGap" w:sz="18" w:space="0" w:color="auto"/>
+              <w:right w:val="thinThickSmallGap" w:sz="18" w:space="0" w:color="auto"/>
+            </w:tcBorders>
+            <w:hideMark/>
+          </w:tcPr>
+          <w:p>
+            <w:pPr>
+              <w:spacing w:after="0" w:line="240" w:lineRule="auto"/>
+              <w:jc w:val="center"/>
+              <w:rPr>
+                <w:rFonts w:ascii="Arabic Typesetting" w:hAnsi="Arabic Typesetting" w:cs="Arabic Typesetting"/>
+                <w:b/>
+                <w:bCs/>
+                <w:sz w:val="28"/>
+                <w:szCs w:val="28"/>
+                <w:rtl/>
+                <w:lang w:bidi="ar-EG"/>
+              </w:rPr>
+            </w:pPr>
+            <w:r>
+              <w:rPr>
+                <w:rFonts w:ascii="Arabic Typesetting" w:hAnsi="Arabic Typesetting" w:cs="Arabic Typesetting"/>
+                <w:b/>
+                <w:bCs/>
+                <w:sz w:val="28"/>
+                <w:szCs w:val="28"/>
+                <w:highlight w:val="red"/>
+                <w:rtl/>
+                <w:lang w:bidi="ar-EG"/>
+              </w:rPr>
+              <w:t>........................................................</w:t>
+            </w:r>
+          </w:p>
+        </w:tc>
+        <w:tc>
+          <w:tcPr>
+            <w:tcW w:w="977" w:type="dxa"/>
+            <w:tcBorders>
+              <w:top w:val="thinThickSmallGap" w:sz="18" w:space="0" w:color="auto"/>
+              <w:left w:val="thinThickSmallGap" w:sz="18" w:space="0" w:color="auto"/>
+              <w:bottom w:val="thinThickSmallGap" w:sz="18" w:space="0" w:color="auto"/>
+              <w:right w:val="thinThickSmallGap" w:sz="18" w:space="0" w:color="auto"/>
+            </w:tcBorders>
+            <w:hideMark/>
+          </w:tcPr>
+          <w:p>
+            <w:pPr>
+              <w:spacing w:after="0" w:line="240" w:lineRule="auto"/>
+              <w:jc w:val="center"/>
+              <w:rPr>
+                <w:rFonts w:ascii="Arabic Typesetting" w:hAnsi="Arabic Typesetting" w:cs="Arabic Typesetting"/>
+                <w:b/>
+                <w:bCs/>
+                <w:sz w:val="28"/>
+                <w:szCs w:val="28"/>
+                <w:rtl/>
+                <w:lang w:bidi="ar-EG"/>
+              </w:rPr>
+            </w:pPr>
+            <w:r>
+              <w:rPr>
+                <w:rFonts w:ascii="Arabic Typesetting" w:hAnsi="Arabic Typesetting" w:cs="Arabic Typesetting"/>
+                <w:b/>
+                <w:bCs/>
+                <w:sz w:val="28"/>
+                <w:szCs w:val="28"/>
+                <w:highlight w:val="red"/>
+                <w:rtl/>
+                <w:lang w:bidi="ar-EG"/>
+              </w:rPr>
+              <w:t>.........</w:t>
+            </w:r>
+          </w:p>
+        </w:tc>
+        <w:tc>
+          <w:tcPr>
+            <w:tcW w:w="977" w:type="dxa"/>
+            <w:tcBorders>
+              <w:top w:val="thinThickSmallGap" w:sz="18" w:space="0" w:color="auto"/>
+              <w:left w:val="thinThickSmallGap" w:sz="18" w:space="0" w:color="auto"/>
+              <w:bottom w:val="thinThickSmallGap" w:sz="18" w:space="0" w:color="auto"/>
+              <w:right w:val="thinThickSmallGap" w:sz="18" w:space="0" w:color="auto"/>
+            </w:tcBorders>
+            <w:hideMark/>
+          </w:tcPr>
+          <w:p>
+            <w:pPr>
+              <w:spacing w:after="0" w:line="240" w:lineRule="auto"/>
+              <w:jc w:val="center"/>
+              <w:rPr>
+                <w:rFonts w:ascii="Arabic Typesetting" w:hAnsi="Arabic Typesetting" w:cs="Arabic Typesetting"/>
+                <w:b/>
+                <w:bCs/>
+                <w:sz w:val="28"/>
+                <w:szCs w:val="28"/>
+                <w:rtl/>
+                <w:lang w:bidi="ar-EG"/>
+              </w:rPr>
+            </w:pPr>
+            <w:r>
+              <w:rPr>
+                <w:rFonts w:ascii="Arabic Typesetting" w:hAnsi="Arabic Typesetting" w:cs="Arabic Typesetting"/>
+                <w:b/>
+                <w:bCs/>
+                <w:sz w:val="28"/>
+                <w:szCs w:val="28"/>
+                <w:highlight w:val="red"/>
+                <w:rtl/>
+                <w:lang w:bidi="ar-EG"/>
+              </w:rPr>
+              <w:t>........</w:t>
+            </w:r>
+          </w:p>
+        </w:tc>
+        <w:tc>
+          <w:tcPr>
+            <w:tcW w:w="2798" w:type="dxa"/>
+            <w:tcBorders>
+              <w:top w:val="thinThickSmallGap" w:sz="18" w:space="0" w:color="auto"/>
+              <w:left w:val="thinThickSmallGap" w:sz="18" w:space="0" w:color="auto"/>
+              <w:bottom w:val="thinThickSmallGap" w:sz="18" w:space="0" w:color="auto"/>
+              <w:right w:val="thinThickSmallGap" w:sz="18" w:space="0" w:color="auto"/>
+            </w:tcBorders>
+            <w:hideMark/>
+          </w:tcPr>
+          <w:p>
+            <w:pPr>
+              <w:spacing w:after="0" w:line="240" w:lineRule="auto"/>
+              <w:jc w:val="center"/>
+              <w:rPr>
+                <w:rFonts w:ascii="Arabic Typesetting" w:hAnsi="Arabic Typesetting" w:cs="Arabic Typesetting"/>
+                <w:b/>
+                <w:bCs/>
+                <w:sz w:val="28"/>
+                <w:szCs w:val="28"/>
+                <w:rtl/>
+                <w:lang w:bidi="ar-EG"/>
+              </w:rPr>
+            </w:pPr>
+            <w:r>
+              <w:rPr>
+                <w:rFonts w:ascii="Arabic Typesetting" w:hAnsi="Arabic Typesetting" w:cs="Arabic Typesetting"/>
+                <w:b/>
+                <w:bCs/>
+                <w:sz w:val="28"/>
+                <w:szCs w:val="28"/>
+                <w:highlight w:val="red"/>
+                <w:rtl/>
+                <w:lang w:bidi="ar-EG"/>
+              </w:rPr>
+              <w:t>...................................</w:t>
+            </w:r>
+          </w:p>
+        </w:tc>
+        <w:tc>
+          <w:tcPr>
+            <w:tcW w:w="1241" w:type="dxa"/>
+            <w:tcBorders>
+              <w:top w:val="thinThickSmallGap" w:sz="18" w:space="0" w:color="auto"/>
+              <w:left w:val="thinThickSmallGap" w:sz="18" w:space="0" w:color="auto"/>
+              <w:bottom w:val="thinThickSmallGap" w:sz="18" w:space="0" w:color="auto"/>
+              <w:right w:val="thinThickSmallGap" w:sz="18" w:space="0" w:color="auto"/>
+            </w:tcBorders>
+            <w:hideMark/>
+          </w:tcPr>
+          <w:p>
+            <w:pPr>
+              <w:spacing w:after="0" w:line="240" w:lineRule="auto"/>
+              <w:jc w:val="center"/>
+              <w:rPr>
+                <w:rFonts w:ascii="Arabic Typesetting" w:hAnsi="Arabic Typesetting" w:cs="Arabic Typesetting"/>
+                <w:b/>
+                <w:bCs/>
+                <w:sz w:val="28"/>
+                <w:szCs w:val="28"/>
+                <w:rtl/>
+                <w:lang w:bidi="ar-EG"/>
+              </w:rPr>
+            </w:pPr>
+            <w:r>
+              <w:rPr>
+                <w:rFonts w:ascii="Arabic Typesetting" w:hAnsi="Arabic Typesetting" w:cs="Arabic Typesetting"/>
+                <w:b/>
+                <w:bCs/>
+                <w:sz w:val="28"/>
+                <w:szCs w:val="28"/>
+                <w:highlight w:val="red"/>
+                <w:rtl/>
+                <w:lang w:bidi="ar-EG"/>
+              </w:rPr>
+              <w:t>.................</w:t>
+            </w:r>
+          </w:p>
+        </w:tc>
+      </w:tr>
+      <w:tr>
+        <w:trPr>
+          <w:trHeight w:val="60"/>
+        </w:trPr>
+        <w:tc>
+          <w:tcPr>
+            <w:tcW w:w="561" w:type="dxa"/>
+            <w:tcBorders>
+              <w:top w:val="thinThickSmallGap" w:sz="18" w:space="0" w:color="auto"/>
+              <w:left w:val="thinThickSmallGap" w:sz="18" w:space="0" w:color="auto"/>
+              <w:bottom w:val="thinThickSmallGap" w:sz="18" w:space="0" w:color="auto"/>
+              <w:right w:val="thinThickSmallGap" w:sz="18" w:space="0" w:color="auto"/>
+            </w:tcBorders>
+            <w:hideMark/>
+          </w:tcPr>
+          <w:p>
+            <w:pPr>
+              <w:spacing w:after="0" w:line="240" w:lineRule="auto"/>
+              <w:jc w:val="center"/>
+              <w:rPr>
+                <w:rFonts w:ascii="Arabic Typesetting" w:hAnsi="Arabic Typesetting" w:cs="Arabic Typesetting"/>
+                <w:b/>
+                <w:bCs/>
+                <w:sz w:val="28"/>
+                <w:szCs w:val="28"/>
+                <w:rtl/>
+                <w:lang w:bidi="ar-EG"/>
+              </w:rPr>
+            </w:pPr>
+            <w:r>
+              <w:rPr>
+                <w:rFonts w:ascii="Arabic Typesetting" w:hAnsi="Arabic Typesetting" w:cs="Arabic Typesetting"/>
+                <w:b/>
+                <w:bCs/>
+                <w:sz w:val="28"/>
+                <w:szCs w:val="28"/>
+                <w:highlight w:val="red"/>
+                <w:rtl/>
+                <w:lang w:bidi="ar-EG"/>
+              </w:rPr>
+              <w:t>4</w:t>
+            </w:r>
+          </w:p>
+        </w:tc>
+        <w:tc>
+          <w:tcPr>
+            <w:tcW w:w="3593" w:type="dxa"/>
+            <w:tcBorders>
+              <w:top w:val="thinThickSmallGap" w:sz="18" w:space="0" w:color="auto"/>
+              <w:left w:val="thinThickSmallGap" w:sz="18" w:space="0" w:color="auto"/>
+              <w:bottom w:val="thinThickSmallGap" w:sz="18" w:space="0" w:color="auto"/>
+              <w:right w:val="thinThickSmallGap" w:sz="18" w:space="0" w:color="auto"/>
+            </w:tcBorders>
+            <w:hideMark/>
+          </w:tcPr>
+          <w:p>
+            <w:pPr>
+              <w:spacing w:after="0" w:line="240" w:lineRule="auto"/>
+              <w:jc w:val="center"/>
+              <w:rPr>
+                <w:rFonts w:ascii="Arabic Typesetting" w:hAnsi="Arabic Typesetting" w:cs="Arabic Typesetting"/>
+                <w:b/>
+                <w:bCs/>
+                <w:sz w:val="28"/>
+                <w:szCs w:val="28"/>
+                <w:rtl/>
+                <w:lang w:bidi="ar-EG"/>
+              </w:rPr>
+            </w:pPr>
+            <w:r>
+              <w:rPr>
+                <w:rFonts w:ascii="Arabic Typesetting" w:hAnsi="Arabic Typesetting" w:cs="Arabic Typesetting"/>
+                <w:b/>
+                <w:bCs/>
+                <w:sz w:val="28"/>
+                <w:szCs w:val="28"/>
+                <w:highlight w:val="red"/>
+                <w:rtl/>
+                <w:lang w:bidi="ar-EG"/>
+              </w:rPr>
+              <w:t>.....................................................</w:t>
+            </w:r>
+          </w:p>
+        </w:tc>
+        <w:tc>
+          <w:tcPr>
+            <w:tcW w:w="977" w:type="dxa"/>
+            <w:tcBorders>
+              <w:top w:val="thinThickSmallGap" w:sz="18" w:space="0" w:color="auto"/>
+              <w:left w:val="thinThickSmallGap" w:sz="18" w:space="0" w:color="auto"/>
+              <w:bottom w:val="thinThickSmallGap" w:sz="18" w:space="0" w:color="auto"/>
+              <w:right w:val="thinThickSmallGap" w:sz="18" w:space="0" w:color="auto"/>
+            </w:tcBorders>
+            <w:hideMark/>
+          </w:tcPr>
+          <w:p>
+            <w:pPr>
+              <w:spacing w:after="0" w:line="240" w:lineRule="auto"/>
+              <w:jc w:val="center"/>
+              <w:rPr>
+                <w:rFonts w:ascii="Arabic Typesetting" w:hAnsi="Arabic Typesetting" w:cs="Arabic Typesetting"/>
+                <w:b/>
+                <w:bCs/>
+                <w:sz w:val="28"/>
+                <w:szCs w:val="28"/>
+                <w:rtl/>
+                <w:lang w:bidi="ar-EG"/>
+              </w:rPr>
+            </w:pPr>
+            <w:r>
+              <w:rPr>
+                <w:rFonts w:ascii="Arabic Typesetting" w:hAnsi="Arabic Typesetting" w:cs="Arabic Typesetting"/>
+                <w:b/>
+                <w:bCs/>
+                <w:sz w:val="28"/>
+                <w:szCs w:val="28"/>
+                <w:highlight w:val="red"/>
+                <w:rtl/>
+                <w:lang w:bidi="ar-EG"/>
+              </w:rPr>
+              <w:t>.........</w:t>
+            </w:r>
+          </w:p>
+        </w:tc>
+        <w:tc>
+          <w:tcPr>
+            <w:tcW w:w="977" w:type="dxa"/>
+            <w:tcBorders>
+              <w:top w:val="thinThickSmallGap" w:sz="18" w:space="0" w:color="auto"/>
+              <w:left w:val="thinThickSmallGap" w:sz="18" w:space="0" w:color="auto"/>
+              <w:bottom w:val="thinThickSmallGap" w:sz="18" w:space="0" w:color="auto"/>
+              <w:right w:val="thinThickSmallGap" w:sz="18" w:space="0" w:color="auto"/>
+            </w:tcBorders>
+            <w:hideMark/>
+          </w:tcPr>
+          <w:p>
+            <w:pPr>
+              <w:spacing w:after="0" w:line="240" w:lineRule="auto"/>
+              <w:jc w:val="center"/>
+              <w:rPr>
+                <w:rFonts w:ascii="Arabic Typesetting" w:hAnsi="Arabic Typesetting" w:cs="Arabic Typesetting"/>
+                <w:b/>
+                <w:bCs/>
+                <w:sz w:val="28"/>
+                <w:szCs w:val="28"/>
+                <w:rtl/>
+                <w:lang w:bidi="ar-EG"/>
+              </w:rPr>
+            </w:pPr>
+            <w:r>
+              <w:rPr>
+                <w:rFonts w:ascii="Arabic Typesetting" w:hAnsi="Arabic Typesetting" w:cs="Arabic Typesetting"/>
+                <w:b/>
+                <w:bCs/>
+                <w:sz w:val="28"/>
+                <w:szCs w:val="28"/>
+                <w:highlight w:val="red"/>
+                <w:rtl/>
+                <w:lang w:bidi="ar-EG"/>
+              </w:rPr>
+              <w:t>.........</w:t>
+            </w:r>
+          </w:p>
+        </w:tc>
+        <w:tc>
+          <w:tcPr>
+            <w:tcW w:w="2798" w:type="dxa"/>
+            <w:tcBorders>
+              <w:top w:val="thinThickSmallGap" w:sz="18" w:space="0" w:color="auto"/>
+              <w:left w:val="thinThickSmallGap" w:sz="18" w:space="0" w:color="auto"/>
+              <w:bottom w:val="thinThickSmallGap" w:sz="18" w:space="0" w:color="auto"/>
+              <w:right w:val="thinThickSmallGap" w:sz="18" w:space="0" w:color="auto"/>
+            </w:tcBorders>
+            <w:hideMark/>
+          </w:tcPr>
+          <w:p>
+            <w:pPr>
+              <w:spacing w:after="0" w:line="240" w:lineRule="auto"/>
+              <w:jc w:val="center"/>
+              <w:rPr>
+                <w:rFonts w:ascii="Arabic Typesetting" w:hAnsi="Arabic Typesetting" w:cs="Arabic Typesetting"/>
+                <w:b/>
+                <w:bCs/>
+                <w:sz w:val="28"/>
+                <w:szCs w:val="28"/>
+                <w:rtl/>
+                <w:lang w:bidi="ar-EG"/>
+              </w:rPr>
+            </w:pPr>
+            <w:r>
+              <w:rPr>
+                <w:rFonts w:ascii="Arabic Typesetting" w:hAnsi="Arabic Typesetting" w:cs="Arabic Typesetting"/>
+                <w:b/>
+                <w:bCs/>
+                <w:sz w:val="28"/>
+                <w:szCs w:val="28"/>
+                <w:highlight w:val="red"/>
+                <w:rtl/>
+                <w:lang w:bidi="ar-EG"/>
+              </w:rPr>
+              <w:t>..................................</w:t>
+            </w:r>
+          </w:p>
+        </w:tc>
+        <w:tc>
+          <w:tcPr>
+            <w:tcW w:w="1241" w:type="dxa"/>
+            <w:tcBorders>
+              <w:top w:val="thinThickSmallGap" w:sz="18" w:space="0" w:color="auto"/>
+              <w:left w:val="thinThickSmallGap" w:sz="18" w:space="0" w:color="auto"/>
+              <w:bottom w:val="thinThickSmallGap" w:sz="18" w:space="0" w:color="auto"/>
+              <w:right w:val="thinThickSmallGap" w:sz="18" w:space="0" w:color="auto"/>
+            </w:tcBorders>
+            <w:hideMark/>
+          </w:tcPr>
+          <w:p>
+            <w:pPr>
+              <w:spacing w:after="0" w:line="240" w:lineRule="auto"/>
+              <w:jc w:val="center"/>
+              <w:rPr>
+                <w:rFonts w:ascii="Arabic Typesetting" w:hAnsi="Arabic Typesetting" w:cs="Arabic Typesetting"/>
+                <w:b/>
+                <w:bCs/>
+                <w:sz w:val="28"/>
+                <w:szCs w:val="28"/>
+                <w:highlight w:val="red"/>
+                <w:rtl/>
+                <w:lang w:bidi="ar-EG"/>
+              </w:rPr>
+            </w:pPr>
+            <w:r>
+              <w:rPr>
+                <w:rFonts w:ascii="Arabic Typesetting" w:hAnsi="Arabic Typesetting" w:cs="Arabic Typesetting"/>
+                <w:b/>
+                <w:bCs/>
+                <w:sz w:val="28"/>
+                <w:szCs w:val="28"/>
+                <w:highlight w:val="red"/>
+                <w:rtl/>
+                <w:lang w:bidi="ar-EG"/>
+              </w:rPr>
+              <w:t>...............</w:t>
+            </w:r>
+          </w:p>
+        </w:tc>
+      </w:tr>
+      <w:tr>
+        <w:trPr>
+          <w:trHeight w:val="285"/>
+        </w:trPr>
+        <w:tc>
+          <w:tcPr>
+            <w:tcW w:w="561" w:type="dxa"/>
+            <w:tcBorders>
+              <w:top w:val="thinThickSmallGap" w:sz="18" w:space="0" w:color="auto"/>
+              <w:left w:val="thinThickSmallGap" w:sz="18" w:space="0" w:color="auto"/>
+              <w:bottom w:val="thinThickSmallGap" w:sz="18" w:space="0" w:color="auto"/>
+              <w:right w:val="thinThickSmallGap" w:sz="18" w:space="0" w:color="auto"/>
+            </w:tcBorders>
+            <w:hideMark/>
+          </w:tcPr>
+          <w:p>
+            <w:pPr>
+              <w:spacing w:after="0" w:line="240" w:lineRule="auto"/>
+              <w:jc w:val="center"/>
+              <w:rPr>
+                <w:rFonts w:ascii="Arabic Typesetting" w:hAnsi="Arabic Typesetting" w:cs="Arabic Typesetting"/>
+                <w:b/>
+                <w:bCs/>
+                <w:sz w:val="28"/>
+                <w:szCs w:val="28"/>
+                <w:rtl/>
+                <w:lang w:bidi="ar-EG"/>
+              </w:rPr>
+            </w:pPr>
+            <w:r>
+              <w:rPr>
+                <w:rFonts w:ascii="Arabic Typesetting" w:hAnsi="Arabic Typesetting" w:cs="Arabic Typesetting"/>
+                <w:b/>
+                <w:bCs/>
+                <w:sz w:val="28"/>
+                <w:szCs w:val="28"/>
+                <w:highlight w:val="red"/>
+                <w:rtl/>
+                <w:lang w:bidi="ar-EG"/>
+              </w:rPr>
+              <w:t>5</w:t>
+            </w:r>
+          </w:p>
+        </w:tc>
+        <w:tc>
+          <w:tcPr>
+            <w:tcW w:w="3593" w:type="dxa"/>
+            <w:tcBorders>
+              <w:top w:val="thinThickSmallGap" w:sz="18" w:space="0" w:color="auto"/>
+              <w:left w:val="thinThickSmallGap" w:sz="18" w:space="0" w:color="auto"/>
+              <w:bottom w:val="thinThickSmallGap" w:sz="18" w:space="0" w:color="auto"/>
+              <w:right w:val="thinThickSmallGap" w:sz="18" w:space="0" w:color="auto"/>
+            </w:tcBorders>
+            <w:hideMark/>
+          </w:tcPr>
+          <w:p>
+            <w:pPr>
+              <w:spacing w:after="0" w:line="240" w:lineRule="auto"/>
+              <w:jc w:val="center"/>
+              <w:rPr>
+                <w:rFonts w:ascii="Arabic Typesetting" w:hAnsi="Arabic Typesetting" w:cs="Arabic Typesetting"/>
+                <w:b/>
+                <w:bCs/>
+                <w:sz w:val="28"/>
+                <w:szCs w:val="28"/>
+                <w:rtl/>
+                <w:lang w:bidi="ar-EG"/>
+              </w:rPr>
+            </w:pPr>
+            <w:r>
+              <w:rPr>
+                <w:rFonts w:ascii="Arabic Typesetting" w:hAnsi="Arabic Typesetting" w:cs="Arabic Typesetting"/>
+                <w:b/>
+                <w:bCs/>
+                <w:sz w:val="28"/>
+                <w:szCs w:val="28"/>
+                <w:highlight w:val="red"/>
+                <w:rtl/>
+                <w:lang w:bidi="ar-EG"/>
+              </w:rPr>
+              <w:t>......................................................</w:t>
+            </w:r>
+          </w:p>
+        </w:tc>
+        <w:tc>
+          <w:tcPr>
+            <w:tcW w:w="977" w:type="dxa"/>
+            <w:tcBorders>
+              <w:top w:val="thinThickSmallGap" w:sz="18" w:space="0" w:color="auto"/>
+              <w:left w:val="thinThickSmallGap" w:sz="18" w:space="0" w:color="auto"/>
+              <w:bottom w:val="thinThickSmallGap" w:sz="18" w:space="0" w:color="auto"/>
+              <w:right w:val="thinThickSmallGap" w:sz="18" w:space="0" w:color="auto"/>
+            </w:tcBorders>
+            <w:hideMark/>
+          </w:tcPr>
+          <w:p>
+            <w:pPr>
+              <w:spacing w:after="0" w:line="240" w:lineRule="auto"/>
+              <w:jc w:val="center"/>
+              <w:rPr>
+                <w:rFonts w:ascii="Arabic Typesetting" w:hAnsi="Arabic Typesetting" w:cs="Arabic Typesetting"/>
+                <w:b/>
+                <w:bCs/>
+                <w:sz w:val="28"/>
+                <w:szCs w:val="28"/>
+                <w:rtl/>
+                <w:lang w:bidi="ar-EG"/>
+              </w:rPr>
+            </w:pPr>
+            <w:r>
+              <w:rPr>
+                <w:rFonts w:ascii="Arabic Typesetting" w:hAnsi="Arabic Typesetting" w:cs="Arabic Typesetting"/>
+                <w:b/>
+                <w:bCs/>
+                <w:sz w:val="28"/>
+                <w:szCs w:val="28"/>
+                <w:highlight w:val="red"/>
+                <w:rtl/>
+                <w:lang w:bidi="ar-EG"/>
+              </w:rPr>
+              <w:t>......</w:t>
+            </w:r>
+          </w:p>
+        </w:tc>
+        <w:tc>
+          <w:tcPr>
+            <w:tcW w:w="977" w:type="dxa"/>
+            <w:tcBorders>
+              <w:top w:val="thinThickSmallGap" w:sz="18" w:space="0" w:color="auto"/>
+              <w:left w:val="thinThickSmallGap" w:sz="18" w:space="0" w:color="auto"/>
+              <w:bottom w:val="thinThickSmallGap" w:sz="18" w:space="0" w:color="auto"/>
+              <w:right w:val="thinThickSmallGap" w:sz="18" w:space="0" w:color="auto"/>
+            </w:tcBorders>
+            <w:hideMark/>
+          </w:tcPr>
+          <w:p>
+            <w:pPr>
+              <w:spacing w:after="0" w:line="240" w:lineRule="auto"/>
+              <w:jc w:val="center"/>
+              <w:rPr>
+                <w:rFonts w:ascii="Arabic Typesetting" w:hAnsi="Arabic Typesetting" w:cs="Arabic Typesetting"/>
+                <w:b/>
+                <w:bCs/>
+                <w:sz w:val="28"/>
+                <w:szCs w:val="28"/>
+                <w:rtl/>
+                <w:lang w:bidi="ar-EG"/>
+              </w:rPr>
+            </w:pPr>
+            <w:r>
+              <w:rPr>
+                <w:rFonts w:ascii="Arabic Typesetting" w:hAnsi="Arabic Typesetting" w:cs="Arabic Typesetting"/>
+                <w:b/>
+                <w:bCs/>
+                <w:sz w:val="28"/>
+                <w:szCs w:val="28"/>
+                <w:highlight w:val="red"/>
+                <w:rtl/>
+                <w:lang w:bidi="ar-EG"/>
+              </w:rPr>
+              <w:t>.......</w:t>
+            </w:r>
+          </w:p>
+        </w:tc>
+        <w:tc>
+          <w:tcPr>
+            <w:tcW w:w="2798" w:type="dxa"/>
+            <w:tcBorders>
+              <w:top w:val="thinThickSmallGap" w:sz="18" w:space="0" w:color="auto"/>
+              <w:left w:val="thinThickSmallGap" w:sz="18" w:space="0" w:color="auto"/>
+              <w:bottom w:val="thinThickSmallGap" w:sz="18" w:space="0" w:color="auto"/>
+              <w:right w:val="thinThickSmallGap" w:sz="18" w:space="0" w:color="auto"/>
+            </w:tcBorders>
+            <w:hideMark/>
+          </w:tcPr>
+          <w:p>
+            <w:pPr>
+              <w:spacing w:after="0" w:line="240" w:lineRule="auto"/>
+              <w:jc w:val="center"/>
+              <w:rPr>
+                <w:rFonts w:ascii="Arabic Typesetting" w:hAnsi="Arabic Typesetting" w:cs="Arabic Typesetting"/>
+                <w:b/>
+                <w:bCs/>
+                <w:sz w:val="28"/>
+                <w:szCs w:val="28"/>
+                <w:rtl/>
+                <w:lang w:bidi="ar-EG"/>
+              </w:rPr>
+            </w:pPr>
+            <w:r>
+              <w:rPr>
+                <w:rFonts w:ascii="Arabic Typesetting" w:hAnsi="Arabic Typesetting" w:cs="Arabic Typesetting"/>
+                <w:b/>
+                <w:bCs/>
+                <w:sz w:val="28"/>
+                <w:szCs w:val="28"/>
+                <w:highlight w:val="red"/>
+                <w:rtl/>
+                <w:lang w:bidi="ar-EG"/>
+              </w:rPr>
+              <w:t>...................................</w:t>
+            </w:r>
+          </w:p>
+        </w:tc>
+        <w:tc>
+          <w:tcPr>
+            <w:tcW w:w="1241" w:type="dxa"/>
+            <w:tcBorders>
+              <w:top w:val="thinThickSmallGap" w:sz="18" w:space="0" w:color="auto"/>
+              <w:left w:val="thinThickSmallGap" w:sz="18" w:space="0" w:color="auto"/>
+              <w:bottom w:val="thinThickSmallGap" w:sz="18" w:space="0" w:color="auto"/>
+              <w:right w:val="thinThickSmallGap" w:sz="18" w:space="0" w:color="auto"/>
+            </w:tcBorders>
+            <w:hideMark/>
+          </w:tcPr>
+          <w:p>
+            <w:pPr>
+              <w:spacing w:after="0" w:line="240" w:lineRule="auto"/>
+              <w:jc w:val="center"/>
+              <w:rPr>
+                <w:rFonts w:ascii="Arabic Typesetting" w:hAnsi="Arabic Typesetting" w:cs="Arabic Typesetting"/>
+                <w:b/>
+                <w:bCs/>
+                <w:sz w:val="28"/>
+                <w:szCs w:val="28"/>
+                <w:rtl/>
+                <w:lang w:bidi="ar-EG"/>
+              </w:rPr>
+            </w:pPr>
+            <w:r>
+              <w:rPr>
+                <w:rFonts w:ascii="Arabic Typesetting" w:hAnsi="Arabic Typesetting" w:cs="Arabic Typesetting"/>
+                <w:b/>
+                <w:bCs/>
+                <w:sz w:val="28"/>
+                <w:szCs w:val="28"/>
+                <w:highlight w:val="red"/>
+                <w:rtl/>
+                <w:lang w:bidi="ar-EG"/>
+              </w:rPr>
+              <w:t>..............</w:t>
             </w:r>
           </w:p>
         </w:tc>
@@ -460,8 +1982,233 @@
     </w:tbl>
     <w:p>
       <w:pPr>
-        <w:spacing w:before="120" w:after="120" w:line="240" w:lineRule="auto"/>
+        <w:spacing w:after="0" w:line="240" w:lineRule="auto"/>
+        <w:ind w:left="-567" w:hanging="283"/>
+        <w:jc w:val="highKashida"/>
+        <w:rPr>
+          <w:b/>
+          <w:bCs/>
+          <w:sz w:val="32"/>
+          <w:szCs w:val="32"/>
+          <w:rtl/>
+          <w:lang w:bidi="ar-EG"/>
+        </w:rPr>
       </w:pPr>
+      <w:r>
+        <w:rPr>
+          <w:sz w:val="40"/>
+          <w:szCs w:val="40"/>
+          <w:rtl/>
+          <w:lang w:bidi="ar-EG"/>
+        </w:rPr>
+        <w:t xml:space="preserve">  </w:t>
+      </w:r>
+      <w:r>
+        <w:rPr>
+          <w:b/>
+          <w:bCs/>
+          <w:sz w:val="36"/>
+          <w:szCs w:val="36"/>
+          <w:rtl/>
+          <w:lang w:bidi="ar-EG"/>
+        </w:rPr>
+        <w:t xml:space="preserve"> </w:t>
+      </w:r>
+      <w:r>
+        <w:rPr>
+          <w:b/>
+          <w:bCs/>
+          <w:sz w:val="32"/>
+          <w:szCs w:val="32"/>
+          <w:rtl/>
+          <w:lang w:bidi="ar-EG"/>
+        </w:rPr>
+        <w:t xml:space="preserve">تضمن جولدن سرفيس الأصناف </w:t>
+      </w:r>
+      <w:r>
+        <w:rPr>
+          <w:b/>
+          <w:bCs/>
+          <w:sz w:val="32"/>
+          <w:szCs w:val="32"/>
+          <w:highlight w:val="red"/>
+          <w:rtl/>
+          <w:lang w:bidi="ar-EG"/>
+        </w:rPr>
+        <w:t>المورده</w:t>
+      </w:r>
+      <w:r>
+        <w:rPr>
+          <w:b/>
+          <w:bCs/>
+          <w:sz w:val="32"/>
+          <w:szCs w:val="32"/>
+          <w:rtl/>
+          <w:lang w:bidi="ar-EG"/>
+        </w:rPr>
+        <w:t xml:space="preserve"> من </w:t>
+      </w:r>
+      <w:r>
+        <w:rPr>
+          <w:b/>
+          <w:bCs/>
+          <w:sz w:val="32"/>
+          <w:szCs w:val="32"/>
+          <w:highlight w:val="red"/>
+          <w:rtl/>
+          <w:lang w:bidi="ar-EG"/>
+        </w:rPr>
+        <w:t>كاوتش وبطاريات</w:t>
+      </w:r>
+      <w:r>
+        <w:rPr>
+          <w:b/>
+          <w:bCs/>
+          <w:sz w:val="32"/>
+          <w:szCs w:val="32"/>
+          <w:rtl/>
+          <w:lang w:bidi="ar-EG"/>
+        </w:rPr>
+        <w:t xml:space="preserve"> طبقا للفاتورة الصادرة من الشركة وأمر التوريد الصادر من </w:t>
+      </w:r>
+      <w:r>
+        <w:rPr>
+          <w:b/>
+          <w:bCs/>
+          <w:sz w:val="32"/>
+          <w:szCs w:val="32"/>
+          <w:highlight w:val="red"/>
+          <w:rtl/>
+          <w:lang w:bidi="ar-EG"/>
+        </w:rPr>
+        <w:t>الجامعه</w:t>
+      </w:r>
+      <w:r>
+        <w:rPr>
+          <w:b/>
+          <w:bCs/>
+          <w:sz w:val="32"/>
+          <w:szCs w:val="32"/>
+          <w:rtl/>
+          <w:lang w:bidi="ar-EG"/>
+        </w:rPr>
+        <w:t xml:space="preserve"> طرفكم  والخاصة </w:t>
+      </w:r>
+      <w:r>
+        <w:rPr>
+          <w:b/>
+          <w:bCs/>
+          <w:sz w:val="32"/>
+          <w:szCs w:val="32"/>
+          <w:highlight w:val="red"/>
+          <w:rtl/>
+          <w:lang w:bidi="ar-EG"/>
+        </w:rPr>
+        <w:t>بالمناقصة المحدودة</w:t>
+      </w:r>
+      <w:r>
+        <w:rPr>
+          <w:b/>
+          <w:bCs/>
+          <w:sz w:val="32"/>
+          <w:szCs w:val="32"/>
+          <w:rtl/>
+          <w:lang w:bidi="ar-EG"/>
+        </w:rPr>
+        <w:t xml:space="preserve"> لزوم</w:t>
+      </w:r>
+      <w:r>
+        <w:rPr>
+          <w:b/>
+          <w:bCs/>
+          <w:sz w:val="32"/>
+          <w:szCs w:val="32"/>
+          <w:highlight w:val="red"/>
+          <w:rtl/>
+          <w:lang w:bidi="ar-EG"/>
+        </w:rPr>
+        <w:t xml:space="preserve"> توريد كاوتش وبطاريات للسيارات للجامعه</w:t>
+      </w:r>
+      <w:r>
+        <w:rPr>
+          <w:b/>
+          <w:bCs/>
+          <w:sz w:val="32"/>
+          <w:szCs w:val="32"/>
+          <w:rtl/>
+          <w:lang w:bidi="ar-EG"/>
+        </w:rPr>
+        <w:t xml:space="preserve"> طرفكم للعام المالى  </w:t>
+      </w:r>
+      <w:r>
+        <w:rPr>
+          <w:b/>
+          <w:bCs/>
+          <w:sz w:val="32"/>
+          <w:szCs w:val="32"/>
+          <w:highlight w:val="red"/>
+          <w:rtl/>
+          <w:lang w:bidi="ar-EG"/>
+        </w:rPr>
+        <w:t>2024 / 2025</w:t>
+      </w:r>
+      <w:r>
+        <w:rPr>
+          <w:b/>
+          <w:bCs/>
+          <w:sz w:val="32"/>
+          <w:szCs w:val="32"/>
+          <w:rtl/>
+          <w:lang w:bidi="ar-EG"/>
+        </w:rPr>
+        <w:t xml:space="preserve"> والمحدد لها جلسة ( </w:t>
+      </w:r>
+      <w:r>
+        <w:rPr>
+          <w:b/>
+          <w:bCs/>
+          <w:sz w:val="32"/>
+          <w:szCs w:val="32"/>
+          <w:highlight w:val="red"/>
+          <w:rtl/>
+          <w:lang w:bidi="ar-EG"/>
+        </w:rPr>
+        <w:t>14/ 1 /2024</w:t>
+      </w:r>
+      <w:r>
+        <w:rPr>
+          <w:b/>
+          <w:bCs/>
+          <w:sz w:val="32"/>
+          <w:szCs w:val="32"/>
+          <w:rtl/>
+          <w:lang w:bidi="ar-EG"/>
+        </w:rPr>
+        <w:t xml:space="preserve"> ) لفتح المظروف الفنى . وفيما يلى الأصناف </w:t>
+      </w:r>
+      <w:r>
+        <w:rPr>
+          <w:b/>
+          <w:bCs/>
+          <w:sz w:val="32"/>
+          <w:szCs w:val="32"/>
+          <w:highlight w:val="red"/>
+          <w:rtl/>
+          <w:lang w:bidi="ar-EG"/>
+        </w:rPr>
+        <w:t>الموردة</w:t>
+      </w:r>
+      <w:r>
+        <w:rPr>
+          <w:b/>
+          <w:bCs/>
+          <w:sz w:val="32"/>
+          <w:szCs w:val="32"/>
+          <w:rtl/>
+          <w:lang w:bidi="ar-EG"/>
+        </w:rPr>
+        <w:t xml:space="preserve"> :</w:t>
+      </w:r>
     </w:p>
     <w:p>
       <w:pPr>
@@ -475,8 +2222,9 @@
         <w:rPr>
           <w:b/>
           <w:bCs/>
-          <w:sz w:val="32"/>
-          <w:szCs w:val="32"/>
+          <w:sz w:val="44"/>
+          <w:szCs w:val="44"/>
+          <w:u w:val="single"/>
           <w:rtl/>
           <w:lang w:bidi="ar-EG"/>
         </w:rPr>
@@ -495,15 +2243,27 @@
       </w:r>
       <w:r>
         <w:rPr>
-          <w:b/>
-          <w:bCs/>
-          <w:sz w:val="36"/>
-          <w:szCs w:val="36"/>
-          <w:u w:val="none"/>
-          <w:rtl/>
-          <w:lang w:bidi="ar-EG"/>
-        </w:rPr>
-        <w:t>: </w:t>
+          <w:rFonts w:hint="cs"/>
+          <w:b/>
+          <w:bCs/>
+          <w:sz w:val="40"/>
+          <w:szCs w:val="40"/>
+          <w:rtl/>
+          <w:lang w:bidi="ar-EG"/>
+        </w:rPr>
+        <w:t>:</w:t>
+      </w:r>
+      <w:r>
+        <w:rPr>
+          <w:rFonts w:hint="cs"/>
+          <w:b/>
+          <w:bCs/>
+          <w:sz w:val="40"/>
+          <w:szCs w:val="40"/>
+          <w:rtl/>
+          <w:lang w:bidi="ar-EG"/>
+        </w:rPr>
+        <w:t xml:space="preserve"> </w:t>
       </w:r>
       <w:r>
         <w:rPr>
@@ -511,11 +2271,34 @@
           <w:bCs/>
           <w:sz w:val="32"/>
           <w:szCs w:val="32"/>
-          <w:u w:val="none"/>
-          <w:rtl/>
-          <w:lang w:bidi="ar-EG"/>
-        </w:rPr>
-        <w:t xml:space="preserve">سنة ضد عيوب الصناعه في مداس الكاوتش  فقط</w:t>
+          <w:highlight w:val="red"/>
+          <w:rtl/>
+          <w:lang w:bidi="ar-EG"/>
+        </w:rPr>
+        <w:t>سنة</w:t>
+      </w:r>
+      <w:r>
+        <w:rPr>
+          <w:b/>
+          <w:bCs/>
+          <w:sz w:val="32"/>
+          <w:szCs w:val="32"/>
+          <w:rtl/>
+          <w:lang w:bidi="ar-EG"/>
+        </w:rPr>
+        <w:t xml:space="preserve"> ضد عيوب الصناعه في </w:t>
+      </w:r>
+      <w:r>
+        <w:rPr>
+          <w:b/>
+          <w:bCs/>
+          <w:sz w:val="32"/>
+          <w:szCs w:val="32"/>
+          <w:highlight w:val="red"/>
+          <w:rtl/>
+          <w:lang w:bidi="ar-EG"/>
+        </w:rPr>
+        <w:t>مداس الكاوتش  فقط</w:t>
       </w:r>
     </w:p>
     <w:p>
@@ -779,21 +2562,10 @@
           <w:bCs/>
           <w:sz w:val="28"/>
           <w:szCs w:val="28"/>
+          <w:highlight w:val="red"/>
           <w:lang w:bidi="ar-EG"/>
         </w:rPr>
       </w:pPr>
-      <w:r>
-        <w:rPr>
-          <w:rFonts w:hint="cs"/>
-          <w:b/>
-          <w:bCs/>
-          <w:sz w:val="28"/>
-          <w:szCs w:val="28"/>
-          <w:rtl/>
-          <w:lang w:bidi="ar-EG"/>
-        </w:rPr>
-        <w:t xml:space="preserve">مدة سريان الشهادة </w:t>
-      </w:r>
       <w:r>
         <w:rPr>
           <w:rFonts w:hint="cs"/>
@@ -805,19 +2577,7 @@
           <w:rtl/>
           <w:lang w:bidi="ar-EG"/>
         </w:rPr>
-        <w:t>ستة أشهر</w:t>
-      </w:r>
-      <w:r>
-        <w:rPr>
-          <w:rFonts w:hint="cs"/>
-          <w:b/>
-          <w:bCs/>
-          <w:sz w:val="28"/>
-          <w:szCs w:val="28"/>
-          <w:rtl/>
-          <w:lang w:bidi="ar-EG"/>
-        </w:rPr>
-        <w:t xml:space="preserve">      </w:t>
+        <w:t xml:space="preserve">مدة سريان الشهادة ستة أشهر      </w:t>
       </w:r>
     </w:p>
     <w:p>
@@ -1309,7 +3069,17 @@
         <w:rtl/>
         <w:lang w:bidi="ar-EG"/>
       </w:rPr>
-      <w:t>التاريخ الصادر:</w:t>
+      <w:t xml:space="preserve">التاريخ </w:t>
+    </w:r>
+    <w:r>
+      <w:rPr>
+        <w:rFonts w:hint="cs"/>
+        <w:b/>
+        <w:bCs/>
+        <w:rtl/>
+        <w:lang w:bidi="ar-EG"/>
+      </w:rPr>
+      <w:t>الصادر:</w:t>
     </w:r>
     <w:r>
       <w:rPr>

</xml_diff>